<commit_message>
plano de testes atualizado
</commit_message>
<xml_diff>
--- a/PlanoDeTestes/Plano_De_Testes.docx
+++ b/PlanoDeTestes/Plano_De_Testes.docx
@@ -225,17 +225,23 @@
           </w:tcPr>
           <w:p>
             <w:pPr>
-              <w:spacing w:after="40"/>
-              <w:rPr>
-                <w:lang w:val="pt-BR"/>
-              </w:rPr>
-            </w:pPr>
-            <w:r>
-              <w:rPr>
-                <w:sz w:val="22"/>
-                <w:lang w:val="pt-BR"/>
-              </w:rPr>
-              <w:t>API: usuários, autenticação, sessão e transações</w:t>
+              <w:rPr>
+                <w:lang w:val="pt-BR"/>
+              </w:rPr>
+            </w:pPr>
+            <w:proofErr w:type="spellStart"/>
+            <w:r>
+              <w:rPr>
+                <w:lang w:val="pt-BR"/>
+              </w:rPr>
+              <w:t>Frontend</w:t>
+            </w:r>
+            <w:proofErr w:type="spellEnd"/>
+            <w:r>
+              <w:rPr>
+                <w:lang w:val="pt-BR"/>
+              </w:rPr>
+              <w:t xml:space="preserve"> e API: autenticação, usuários, sessão e transações</w:t>
             </w:r>
           </w:p>
         </w:tc>
@@ -349,12 +355,114 @@
           <w:p>
             <w:pPr>
               <w:spacing w:after="40"/>
-            </w:pPr>
-            <w:r>
-              <w:rPr>
+              <w:rPr>
+                <w:color w:val="17365D" w:themeColor="text2" w:themeShade="BF"/>
+                <w:lang w:val="pt-BR"/>
+              </w:rPr>
+            </w:pPr>
+            <w:r>
+              <w:rPr>
+                <w:color w:val="17365D" w:themeColor="text2" w:themeShade="BF"/>
                 <w:sz w:val="22"/>
-              </w:rPr>
-              <w:t>Grupo 1</w:t>
+                <w:lang w:val="pt-BR"/>
+              </w:rPr>
+              <w:t>Isaque</w:t>
+            </w:r>
+            <w:r>
+              <w:rPr>
+                <w:color w:val="17365D" w:themeColor="text2" w:themeShade="BF"/>
+                <w:sz w:val="22"/>
+                <w:lang w:val="pt-BR"/>
+              </w:rPr>
+              <w:t xml:space="preserve"> Sousa</w:t>
+            </w:r>
+            <w:r>
+              <w:rPr>
+                <w:color w:val="17365D" w:themeColor="text2" w:themeShade="BF"/>
+                <w:sz w:val="22"/>
+                <w:lang w:val="pt-BR"/>
+              </w:rPr>
+              <w:t>, Guilherme</w:t>
+            </w:r>
+            <w:r>
+              <w:rPr>
+                <w:color w:val="17365D" w:themeColor="text2" w:themeShade="BF"/>
+                <w:sz w:val="22"/>
+                <w:lang w:val="pt-BR"/>
+              </w:rPr>
+              <w:t xml:space="preserve"> Ribeiro</w:t>
+            </w:r>
+            <w:r>
+              <w:rPr>
+                <w:color w:val="17365D" w:themeColor="text2" w:themeShade="BF"/>
+                <w:sz w:val="22"/>
+                <w:lang w:val="pt-BR"/>
+              </w:rPr>
+              <w:t>, Caique</w:t>
+            </w:r>
+            <w:r>
+              <w:rPr>
+                <w:color w:val="17365D" w:themeColor="text2" w:themeShade="BF"/>
+                <w:sz w:val="22"/>
+                <w:lang w:val="pt-BR"/>
+              </w:rPr>
+              <w:t xml:space="preserve"> Lima</w:t>
+            </w:r>
+            <w:r>
+              <w:rPr>
+                <w:color w:val="17365D" w:themeColor="text2" w:themeShade="BF"/>
+                <w:sz w:val="22"/>
+                <w:lang w:val="pt-BR"/>
+              </w:rPr>
+              <w:t>, Allan</w:t>
+            </w:r>
+            <w:r>
+              <w:rPr>
+                <w:color w:val="17365D" w:themeColor="text2" w:themeShade="BF"/>
+                <w:sz w:val="22"/>
+                <w:lang w:val="pt-BR"/>
+              </w:rPr>
+              <w:t xml:space="preserve"> Barbosa</w:t>
+            </w:r>
+            <w:r>
+              <w:rPr>
+                <w:color w:val="17365D" w:themeColor="text2" w:themeShade="BF"/>
+                <w:sz w:val="22"/>
+                <w:lang w:val="pt-BR"/>
+              </w:rPr>
+              <w:t>, Pedro</w:t>
+            </w:r>
+            <w:r>
+              <w:rPr>
+                <w:color w:val="17365D" w:themeColor="text2" w:themeShade="BF"/>
+                <w:sz w:val="22"/>
+                <w:lang w:val="pt-BR"/>
+              </w:rPr>
+              <w:t xml:space="preserve"> </w:t>
+            </w:r>
+            <w:r>
+              <w:rPr>
+                <w:color w:val="17365D" w:themeColor="text2" w:themeShade="BF"/>
+                <w:sz w:val="22"/>
+                <w:lang w:val="pt-BR"/>
+              </w:rPr>
+              <w:t>Castro</w:t>
+            </w:r>
+            <w:r>
+              <w:rPr>
+                <w:color w:val="17365D" w:themeColor="text2" w:themeShade="BF"/>
+                <w:sz w:val="22"/>
+                <w:lang w:val="pt-BR"/>
+              </w:rPr>
+              <w:t>, Henrique</w:t>
+            </w:r>
+            <w:r>
+              <w:rPr>
+                <w:color w:val="17365D" w:themeColor="text2" w:themeShade="BF"/>
+                <w:sz w:val="22"/>
+                <w:lang w:val="pt-BR"/>
+              </w:rPr>
+              <w:t xml:space="preserve"> Botelho</w:t>
             </w:r>
           </w:p>
         </w:tc>
@@ -363,6 +471,9 @@
     <w:p>
       <w:pPr>
         <w:spacing w:after="160" w:line="269" w:lineRule="auto"/>
+        <w:rPr>
+          <w:lang w:val="pt-BR"/>
+        </w:rPr>
       </w:pPr>
     </w:p>
     <w:p>
@@ -376,25 +487,33 @@
         <w:rPr>
           <w:lang w:val="pt-BR"/>
         </w:rPr>
-        <w:t xml:space="preserve">Este documento descreve os testes funcionais previstos para a API. </w:t>
+        <w:t xml:space="preserve">Este documento descreve os testes funcionais previstos para o </w:t>
+      </w:r>
+      <w:proofErr w:type="spellStart"/>
+      <w:r>
+        <w:rPr>
+          <w:lang w:val="pt-BR"/>
+        </w:rPr>
+        <w:t>frontend</w:t>
+      </w:r>
+      <w:proofErr w:type="spellEnd"/>
+      <w:r>
+        <w:rPr>
+          <w:lang w:val="pt-BR"/>
+        </w:rPr>
+        <w:t xml:space="preserve"> e para a API. Seu objetivo é registrar o comportamento esperado e o </w:t>
       </w:r>
       <w:r>
         <w:rPr>
           <w:lang w:val="pt-BR"/>
         </w:rPr>
-        <w:t>Seu objetivo</w:t>
+        <w:t>o</w:t>
       </w:r>
       <w:r>
         <w:rPr>
           <w:lang w:val="pt-BR"/>
         </w:rPr>
-        <w:t xml:space="preserve"> é registrar o comportamento esperado e o comportamento observado durante a validação</w:t>
-      </w:r>
-      <w:r>
-        <w:rPr>
-          <w:lang w:val="pt-BR"/>
-        </w:rPr>
-        <w:t>.</w:t>
+        <w:t>bservado durante a validação.</w:t>
       </w:r>
     </w:p>
     <w:p>
@@ -411,20 +530,41 @@
       <w:pPr>
         <w:pStyle w:val="Numerada"/>
         <w:spacing w:before="360"/>
+        <w:rPr>
+          <w:color w:val="17365D" w:themeColor="text2" w:themeShade="BF"/>
+        </w:rPr>
       </w:pPr>
       <w:r>
-        <w:t xml:space="preserve">1. </w:t>
+        <w:rPr>
+          <w:color w:val="17365D" w:themeColor="text2" w:themeShade="BF"/>
+        </w:rPr>
+        <w:t xml:space="preserve"> </w:t>
+      </w:r>
+      <w:r>
+        <w:rPr>
+          <w:color w:val="17365D" w:themeColor="text2" w:themeShade="BF"/>
+        </w:rPr>
+        <w:t xml:space="preserve"> </w:t>
       </w:r>
       <w:proofErr w:type="spellStart"/>
       <w:r>
+        <w:rPr>
+          <w:color w:val="17365D" w:themeColor="text2" w:themeShade="BF"/>
+        </w:rPr>
         <w:t>Objetivo</w:t>
       </w:r>
       <w:proofErr w:type="spellEnd"/>
       <w:r>
+        <w:rPr>
+          <w:color w:val="17365D" w:themeColor="text2" w:themeShade="BF"/>
+        </w:rPr>
         <w:t xml:space="preserve"> e </w:t>
       </w:r>
       <w:proofErr w:type="spellStart"/>
       <w:r>
+        <w:rPr>
+          <w:color w:val="17365D" w:themeColor="text2" w:themeShade="BF"/>
+        </w:rPr>
         <w:t>escopo</w:t>
       </w:r>
       <w:proofErr w:type="spellEnd"/>
@@ -432,55 +572,124 @@
     <w:p>
       <w:pPr>
         <w:pStyle w:val="Numerada"/>
+        <w:numPr>
+          <w:ilvl w:val="0"/>
+          <w:numId w:val="0"/>
+        </w:numPr>
         <w:spacing w:before="360"/>
+        <w:rPr>
+          <w:color w:val="17365D" w:themeColor="text2" w:themeShade="BF"/>
+        </w:rPr>
       </w:pPr>
       <w:r>
+        <w:rPr>
+          <w:color w:val="17365D" w:themeColor="text2" w:themeShade="BF"/>
+        </w:rPr>
         <w:t xml:space="preserve">2. </w:t>
+      </w:r>
+      <w:r>
+        <w:rPr>
+          <w:color w:val="17365D" w:themeColor="text2" w:themeShade="BF"/>
+        </w:rPr>
+        <w:t xml:space="preserve">    </w:t>
       </w:r>
       <w:proofErr w:type="spellStart"/>
       <w:r>
+        <w:rPr>
+          <w:color w:val="17365D" w:themeColor="text2" w:themeShade="BF"/>
+        </w:rPr>
         <w:t>Estratégia</w:t>
       </w:r>
       <w:proofErr w:type="spellEnd"/>
       <w:r>
+        <w:rPr>
+          <w:color w:val="17365D" w:themeColor="text2" w:themeShade="BF"/>
+        </w:rPr>
         <w:t xml:space="preserve"> de testes</w:t>
       </w:r>
     </w:p>
     <w:p>
       <w:pPr>
         <w:pStyle w:val="Numerada"/>
+        <w:numPr>
+          <w:ilvl w:val="0"/>
+          <w:numId w:val="10"/>
+        </w:numPr>
         <w:spacing w:before="360"/>
+        <w:rPr>
+          <w:color w:val="17365D" w:themeColor="text2" w:themeShade="BF"/>
+        </w:rPr>
       </w:pPr>
       <w:r>
-        <w:t xml:space="preserve">3. </w:t>
+        <w:rPr>
+          <w:color w:val="17365D" w:themeColor="text2" w:themeShade="BF"/>
+        </w:rPr>
+        <w:t xml:space="preserve">  </w:t>
       </w:r>
       <w:proofErr w:type="spellStart"/>
       <w:r>
+        <w:rPr>
+          <w:color w:val="17365D" w:themeColor="text2" w:themeShade="BF"/>
+        </w:rPr>
         <w:t>Ambiente</w:t>
       </w:r>
       <w:proofErr w:type="spellEnd"/>
       <w:r>
+        <w:rPr>
+          <w:color w:val="17365D" w:themeColor="text2" w:themeShade="BF"/>
+        </w:rPr>
         <w:t xml:space="preserve"> e dados</w:t>
       </w:r>
     </w:p>
     <w:p>
       <w:pPr>
         <w:pStyle w:val="Numerada"/>
+        <w:numPr>
+          <w:ilvl w:val="0"/>
+          <w:numId w:val="0"/>
+        </w:numPr>
         <w:spacing w:before="360"/>
+        <w:rPr>
+          <w:color w:val="17365D" w:themeColor="text2" w:themeShade="BF"/>
+        </w:rPr>
       </w:pPr>
       <w:r>
-        <w:t xml:space="preserve">4. </w:t>
+        <w:rPr>
+          <w:color w:val="17365D" w:themeColor="text2" w:themeShade="BF"/>
+        </w:rPr>
+        <w:t>4.</w:t>
+      </w:r>
+      <w:r>
+        <w:rPr>
+          <w:color w:val="17365D" w:themeColor="text2" w:themeShade="BF"/>
+        </w:rPr>
+        <w:t xml:space="preserve"> </w:t>
+      </w:r>
+      <w:r>
+        <w:rPr>
+          <w:color w:val="17365D" w:themeColor="text2" w:themeShade="BF"/>
+        </w:rPr>
+        <w:t xml:space="preserve">    </w:t>
       </w:r>
       <w:proofErr w:type="spellStart"/>
       <w:r>
+        <w:rPr>
+          <w:color w:val="17365D" w:themeColor="text2" w:themeShade="BF"/>
+        </w:rPr>
         <w:t>Critérios</w:t>
       </w:r>
       <w:proofErr w:type="spellEnd"/>
       <w:r>
+        <w:rPr>
+          <w:color w:val="17365D" w:themeColor="text2" w:themeShade="BF"/>
+        </w:rPr>
         <w:t xml:space="preserve"> de </w:t>
       </w:r>
       <w:proofErr w:type="spellStart"/>
       <w:r>
+        <w:rPr>
+          <w:color w:val="17365D" w:themeColor="text2" w:themeShade="BF"/>
+        </w:rPr>
         <w:t>execução</w:t>
       </w:r>
       <w:proofErr w:type="spellEnd"/>
@@ -488,15 +697,45 @@
     <w:p>
       <w:pPr>
         <w:pStyle w:val="Numerada"/>
+        <w:numPr>
+          <w:ilvl w:val="0"/>
+          <w:numId w:val="0"/>
+        </w:numPr>
         <w:spacing w:before="360"/>
+        <w:ind w:left="360" w:hanging="360"/>
+        <w:rPr>
+          <w:color w:val="17365D" w:themeColor="text2" w:themeShade="BF"/>
+          <w:lang w:val="pt-BR"/>
+        </w:rPr>
       </w:pPr>
       <w:r>
-        <w:t>5. Casos de teste</w:t>
+        <w:rPr>
+          <w:color w:val="17365D" w:themeColor="text2" w:themeShade="BF"/>
+          <w:lang w:val="pt-BR"/>
+        </w:rPr>
+        <w:t xml:space="preserve">5. </w:t>
+      </w:r>
+      <w:r>
+        <w:rPr>
+          <w:color w:val="17365D" w:themeColor="text2" w:themeShade="BF"/>
+          <w:lang w:val="pt-BR"/>
+        </w:rPr>
+        <w:t xml:space="preserve">    </w:t>
+      </w:r>
+      <w:r>
+        <w:rPr>
+          <w:color w:val="17365D" w:themeColor="text2" w:themeShade="BF"/>
+          <w:lang w:val="pt-BR"/>
+        </w:rPr>
+        <w:t>Casos de teste</w:t>
       </w:r>
     </w:p>
     <w:p>
       <w:pPr>
         <w:spacing w:after="160" w:line="269" w:lineRule="auto"/>
+        <w:rPr>
+          <w:lang w:val="pt-BR"/>
+        </w:rPr>
       </w:pPr>
     </w:p>
     <w:p>
@@ -524,19 +763,7 @@
         <w:rPr>
           <w:lang w:val="pt-BR"/>
         </w:rPr>
-        <w:t>O</w:t>
-      </w:r>
-      <w:r>
-        <w:rPr>
-          <w:lang w:val="pt-BR"/>
-        </w:rPr>
-        <w:t xml:space="preserve"> objetivo é verificar se os</w:t>
-      </w:r>
-      <w:r>
-        <w:rPr>
-          <w:lang w:val="pt-BR"/>
-        </w:rPr>
-        <w:t xml:space="preserve"> </w:t>
+        <w:t xml:space="preserve">O objetivo é verificar se os </w:t>
       </w:r>
       <w:proofErr w:type="spellStart"/>
       <w:r>
@@ -550,13 +777,7 @@
         <w:rPr>
           <w:lang w:val="pt-BR"/>
         </w:rPr>
-        <w:t xml:space="preserve"> da API validam entradas, autenticam usuários e retornam somente os dados compatíveis com a sessão do usuário. O plano cobre testes funcionais de usuários, autenticação JWT</w:t>
-      </w:r>
-      <w:r>
-        <w:rPr>
-          <w:lang w:val="pt-BR"/>
-        </w:rPr>
-        <w:t xml:space="preserve"> e consultas de transações.</w:t>
+        <w:t xml:space="preserve"> da API validam entradas, autenticam usuários e retornam somente os dados compatíveis com a sessão do usuário. O plano cobre testes funcionais de usuários, autenticação JWT e consultas de transações.</w:t>
       </w:r>
     </w:p>
     <w:p>
@@ -570,43 +791,21 @@
         <w:rPr>
           <w:lang w:val="pt-BR"/>
         </w:rPr>
-        <w:t>O escopo</w:t>
+        <w:t xml:space="preserve">O escopo da versão atual inclui testes funcionais do </w:t>
       </w:r>
+      <w:proofErr w:type="spellStart"/>
       <w:r>
         <w:rPr>
           <w:lang w:val="pt-BR"/>
         </w:rPr>
-        <w:t xml:space="preserve"> da versão atual do plano de testes</w:t>
+        <w:t>frontend</w:t>
       </w:r>
+      <w:proofErr w:type="spellEnd"/>
       <w:r>
         <w:rPr>
           <w:lang w:val="pt-BR"/>
         </w:rPr>
-        <w:t xml:space="preserve"> não inclui testes de interface, desempenho, segurança ofensiva</w:t>
-      </w:r>
-      <w:r>
-        <w:rPr>
-          <w:lang w:val="pt-BR"/>
-        </w:rPr>
-        <w:t xml:space="preserve"> ou </w:t>
-      </w:r>
-      <w:r>
-        <w:rPr>
-          <w:lang w:val="pt-BR"/>
-        </w:rPr>
-        <w:t xml:space="preserve">compatibilidade entre </w:t>
-      </w:r>
-      <w:r>
-        <w:rPr>
-          <w:lang w:val="pt-BR"/>
-        </w:rPr>
-        <w:t>plataformas</w:t>
-      </w:r>
-      <w:r>
-        <w:rPr>
-          <w:lang w:val="pt-BR"/>
-        </w:rPr>
-        <w:t>.</w:t>
+        <w:t xml:space="preserve"> e da API. Não inclui testes de desempenho, segurança ofensiva ou compatibilidade entre plataformas.</w:t>
       </w:r>
     </w:p>
     <w:p>
@@ -915,7 +1114,21 @@
                 <w:sz w:val="22"/>
                 <w:lang w:val="pt-BR"/>
               </w:rPr>
-              <w:t>Reexecutar os casos após correções, especialmente duplicidade de NIF e criação sem nome.</w:t>
+              <w:t xml:space="preserve">Reexecutar os casos após correções, especialmente duplicidade de </w:t>
+            </w:r>
+            <w:r>
+              <w:rPr>
+                <w:sz w:val="22"/>
+                <w:lang w:val="pt-BR"/>
+              </w:rPr>
+              <w:t>e-mail</w:t>
+            </w:r>
+            <w:r>
+              <w:rPr>
+                <w:sz w:val="22"/>
+                <w:lang w:val="pt-BR"/>
+              </w:rPr>
+              <w:t xml:space="preserve"> e criação sem nome.</w:t>
             </w:r>
           </w:p>
         </w:tc>
@@ -1342,7 +1555,19 @@
         <w:rPr>
           <w:lang w:val="pt-BR"/>
         </w:rPr>
-        <w:t xml:space="preserve">Os valores exatos de URL, portas, nomes de rotas e esquema do banco não foram informados no material recebido. Por isso, os casos usam a identificação funcional do </w:t>
+        <w:t xml:space="preserve">Os valores exatos de URL, portas, nomes de rotas e esquema do banco não </w:t>
+      </w:r>
+      <w:r>
+        <w:rPr>
+          <w:lang w:val="pt-BR"/>
+        </w:rPr>
+        <w:t>estão</w:t>
+      </w:r>
+      <w:r>
+        <w:rPr>
+          <w:lang w:val="pt-BR"/>
+        </w:rPr>
+        <w:t xml:space="preserve"> informados no material. Por isso, os casos usam a identificação funcional do </w:t>
       </w:r>
       <w:proofErr w:type="spellStart"/>
       <w:r>
@@ -1430,26 +1655,11 @@
           <w:lang w:val="pt-BR"/>
         </w:rPr>
       </w:pPr>
-    </w:p>
-    <w:p>
-      <w:pPr>
-        <w:pStyle w:val="Ttulo2"/>
-        <w:rPr>
-          <w:lang w:val="pt-BR"/>
-        </w:rPr>
-      </w:pPr>
-    </w:p>
-    <w:p>
-      <w:pPr>
-        <w:pStyle w:val="Ttulo2"/>
-        <w:rPr>
-          <w:lang w:val="pt-BR"/>
-        </w:rPr>
-      </w:pPr>
       <w:r>
         <w:rPr>
           <w:lang w:val="pt-BR"/>
         </w:rPr>
+        <w:lastRenderedPageBreak/>
         <w:t xml:space="preserve">5.1 Usuários — </w:t>
       </w:r>
       <w:r>
@@ -1548,28 +1758,53 @@
             <w:pPr>
               <w:spacing w:after="40"/>
             </w:pPr>
+            <w:proofErr w:type="spellStart"/>
             <w:r>
               <w:rPr>
                 <w:sz w:val="20"/>
               </w:rPr>
-              <w:t>Resultado observado</w:t>
-            </w:r>
+              <w:t>Resultado</w:t>
+            </w:r>
+            <w:proofErr w:type="spellEnd"/>
+            <w:r>
+              <w:rPr>
+                <w:sz w:val="20"/>
+              </w:rPr>
+              <w:t xml:space="preserve"> </w:t>
+            </w:r>
+            <w:proofErr w:type="spellStart"/>
+            <w:r>
+              <w:rPr>
+                <w:sz w:val="20"/>
+              </w:rPr>
+              <w:t>observado</w:t>
+            </w:r>
+            <w:proofErr w:type="spellEnd"/>
           </w:p>
         </w:tc>
         <w:tc>
           <w:tcPr>
             <w:tcW w:w="1944" w:type="dxa"/>
-            <w:vAlign w:val="center"/>
-          </w:tcPr>
-          <w:p>
-            <w:pPr>
-              <w:spacing w:after="40"/>
-            </w:pPr>
+            <w:shd w:val="clear" w:color="auto" w:fill="17365D" w:themeFill="text2" w:themeFillShade="BF"/>
+            <w:vAlign w:val="center"/>
+          </w:tcPr>
+          <w:p>
+            <w:pPr>
+              <w:spacing w:after="40"/>
+            </w:pPr>
+            <w:proofErr w:type="spellStart"/>
             <w:r>
               <w:rPr>
                 <w:sz w:val="20"/>
               </w:rPr>
-              <w:t>Observação do material</w:t>
+              <w:t>Observação</w:t>
+            </w:r>
+            <w:proofErr w:type="spellEnd"/>
+            <w:r>
+              <w:rPr>
+                <w:sz w:val="20"/>
+              </w:rPr>
+              <w:t xml:space="preserve"> do material</w:t>
             </w:r>
           </w:p>
         </w:tc>
@@ -2252,7 +2487,7 @@
               <w:rPr>
                 <w:sz w:val="20"/>
               </w:rPr>
-              <w:t>Criar usuário sem NIF</w:t>
+              <w:t>Criar usuário sem senha</w:t>
             </w:r>
           </w:p>
         </w:tc>
@@ -2280,14 +2515,14 @@
                 <w:sz w:val="20"/>
                 <w:lang w:val="pt-BR"/>
               </w:rPr>
-              <w:t xml:space="preserve">EX: </w:t>
+              <w:t>EX: A senha é obrigatória</w:t>
             </w:r>
             <w:r>
               <w:rPr>
                 <w:sz w:val="20"/>
                 <w:lang w:val="pt-BR"/>
               </w:rPr>
-              <w:t>O NIF é obrigatório.</w:t>
+              <w:t>.</w:t>
             </w:r>
           </w:p>
         </w:tc>
@@ -2318,10 +2553,6 @@
           <w:p>
             <w:pPr>
               <w:spacing w:after="40"/>
-              <w:rPr>
-                <w:sz w:val="20"/>
-                <w:lang w:val="pt-BR"/>
-              </w:rPr>
             </w:pPr>
             <w:r>
               <w:rPr>
@@ -2350,382 +2581,19 @@
               <w:rPr>
                 <w:sz w:val="20"/>
               </w:rPr>
-              <w:t>USR-0</w:t>
+              <w:t>USR-</w:t>
             </w:r>
             <w:r>
               <w:rPr>
                 <w:sz w:val="20"/>
               </w:rPr>
+              <w:t>0</w:t>
+            </w:r>
+            <w:r>
+              <w:rPr>
+                <w:sz w:val="20"/>
+              </w:rPr>
               <w:t>7</w:t>
-            </w:r>
-          </w:p>
-        </w:tc>
-        <w:tc>
-          <w:tcPr>
-            <w:tcW w:w="2232" w:type="dxa"/>
-            <w:vAlign w:val="center"/>
-          </w:tcPr>
-          <w:p>
-            <w:pPr>
-              <w:spacing w:after="40"/>
-              <w:rPr>
-                <w:lang w:val="pt-BR"/>
-              </w:rPr>
-            </w:pPr>
-            <w:r>
-              <w:rPr>
-                <w:sz w:val="20"/>
-                <w:lang w:val="pt-BR"/>
-              </w:rPr>
-              <w:t>Criar usuário com NIF duplicado</w:t>
-            </w:r>
-          </w:p>
-        </w:tc>
-        <w:tc>
-          <w:tcPr>
-            <w:tcW w:w="4176" w:type="dxa"/>
-            <w:vAlign w:val="center"/>
-          </w:tcPr>
-          <w:p>
-            <w:pPr>
-              <w:spacing w:after="40"/>
-              <w:rPr>
-                <w:lang w:val="pt-BR"/>
-              </w:rPr>
-            </w:pPr>
-            <w:r>
-              <w:rPr>
-                <w:sz w:val="20"/>
-                <w:lang w:val="pt-BR"/>
-              </w:rPr>
-              <w:t xml:space="preserve">HTTP 400; </w:t>
-            </w:r>
-            <w:r>
-              <w:rPr>
-                <w:sz w:val="20"/>
-                <w:lang w:val="pt-BR"/>
-              </w:rPr>
-              <w:t xml:space="preserve">EX: </w:t>
-            </w:r>
-            <w:r>
-              <w:rPr>
-                <w:sz w:val="20"/>
-                <w:lang w:val="pt-BR"/>
-              </w:rPr>
-              <w:t>NIF já existente.</w:t>
-            </w:r>
-          </w:p>
-        </w:tc>
-        <w:tc>
-          <w:tcPr>
-            <w:tcW w:w="1512" w:type="dxa"/>
-            <w:vAlign w:val="center"/>
-          </w:tcPr>
-          <w:p>
-            <w:pPr>
-              <w:spacing w:after="40"/>
-            </w:pPr>
-            <w:proofErr w:type="spellStart"/>
-            <w:r>
-              <w:rPr>
-                <w:sz w:val="20"/>
-              </w:rPr>
-              <w:t>Aprovado</w:t>
-            </w:r>
-            <w:proofErr w:type="spellEnd"/>
-          </w:p>
-        </w:tc>
-        <w:tc>
-          <w:tcPr>
-            <w:tcW w:w="1944" w:type="dxa"/>
-            <w:vAlign w:val="center"/>
-          </w:tcPr>
-          <w:p>
-            <w:pPr>
-              <w:spacing w:after="40"/>
-              <w:rPr>
-                <w:lang w:val="pt-BR"/>
-              </w:rPr>
-            </w:pPr>
-            <w:r>
-              <w:rPr>
-                <w:sz w:val="20"/>
-                <w:lang w:val="pt-BR"/>
-              </w:rPr>
-              <w:t>Em conformidade.</w:t>
-            </w:r>
-          </w:p>
-        </w:tc>
-      </w:tr>
-      <w:tr>
-        <w:trPr>
-          <w:jc w:val="center"/>
-        </w:trPr>
-        <w:tc>
-          <w:tcPr>
-            <w:tcW w:w="936" w:type="dxa"/>
-            <w:vAlign w:val="center"/>
-          </w:tcPr>
-          <w:p>
-            <w:pPr>
-              <w:spacing w:after="40"/>
-            </w:pPr>
-            <w:r>
-              <w:rPr>
-                <w:sz w:val="20"/>
-              </w:rPr>
-              <w:t>USR-0</w:t>
-            </w:r>
-            <w:r>
-              <w:rPr>
-                <w:sz w:val="20"/>
-              </w:rPr>
-              <w:t>8</w:t>
-            </w:r>
-          </w:p>
-        </w:tc>
-        <w:tc>
-          <w:tcPr>
-            <w:tcW w:w="2232" w:type="dxa"/>
-            <w:vAlign w:val="center"/>
-          </w:tcPr>
-          <w:p>
-            <w:pPr>
-              <w:spacing w:after="40"/>
-            </w:pPr>
-            <w:r>
-              <w:rPr>
-                <w:sz w:val="20"/>
-                <w:lang w:val="pt-BR"/>
-              </w:rPr>
-              <w:t>Criar usuário com NIF fora do formato</w:t>
-            </w:r>
-          </w:p>
-        </w:tc>
-        <w:tc>
-          <w:tcPr>
-            <w:tcW w:w="4176" w:type="dxa"/>
-            <w:vAlign w:val="center"/>
-          </w:tcPr>
-          <w:p>
-            <w:pPr>
-              <w:spacing w:after="40"/>
-              <w:rPr>
-                <w:lang w:val="pt-BR"/>
-              </w:rPr>
-            </w:pPr>
-            <w:r>
-              <w:rPr>
-                <w:sz w:val="20"/>
-                <w:lang w:val="pt-BR"/>
-              </w:rPr>
-              <w:t xml:space="preserve">HTTP 400; </w:t>
-            </w:r>
-            <w:r>
-              <w:rPr>
-                <w:sz w:val="20"/>
-                <w:lang w:val="pt-BR"/>
-              </w:rPr>
-              <w:t xml:space="preserve">EX: </w:t>
-            </w:r>
-            <w:r>
-              <w:rPr>
-                <w:sz w:val="20"/>
-                <w:lang w:val="pt-BR"/>
-              </w:rPr>
-              <w:t>Insira um N</w:t>
-            </w:r>
-            <w:r>
-              <w:rPr>
-                <w:sz w:val="20"/>
-                <w:lang w:val="pt-BR"/>
-              </w:rPr>
-              <w:t>IF válido.</w:t>
-            </w:r>
-          </w:p>
-        </w:tc>
-        <w:tc>
-          <w:tcPr>
-            <w:tcW w:w="1512" w:type="dxa"/>
-            <w:vAlign w:val="center"/>
-          </w:tcPr>
-          <w:p>
-            <w:pPr>
-              <w:spacing w:after="40"/>
-            </w:pPr>
-            <w:proofErr w:type="spellStart"/>
-            <w:r>
-              <w:rPr>
-                <w:sz w:val="20"/>
-              </w:rPr>
-              <w:t>Aprovado</w:t>
-            </w:r>
-            <w:proofErr w:type="spellEnd"/>
-          </w:p>
-        </w:tc>
-        <w:tc>
-          <w:tcPr>
-            <w:tcW w:w="1944" w:type="dxa"/>
-            <w:vAlign w:val="center"/>
-          </w:tcPr>
-          <w:p>
-            <w:pPr>
-              <w:spacing w:after="40"/>
-              <w:rPr>
-                <w:lang w:val="pt-BR"/>
-              </w:rPr>
-            </w:pPr>
-            <w:r>
-              <w:rPr>
-                <w:sz w:val="20"/>
-                <w:lang w:val="pt-BR"/>
-              </w:rPr>
-              <w:t>Em conformidade.</w:t>
-            </w:r>
-          </w:p>
-        </w:tc>
-      </w:tr>
-      <w:tr>
-        <w:trPr>
-          <w:jc w:val="center"/>
-        </w:trPr>
-        <w:tc>
-          <w:tcPr>
-            <w:tcW w:w="936" w:type="dxa"/>
-            <w:vAlign w:val="center"/>
-          </w:tcPr>
-          <w:p>
-            <w:pPr>
-              <w:spacing w:after="40"/>
-            </w:pPr>
-            <w:r>
-              <w:rPr>
-                <w:sz w:val="20"/>
-              </w:rPr>
-              <w:t>USR-0</w:t>
-            </w:r>
-            <w:r>
-              <w:rPr>
-                <w:sz w:val="20"/>
-              </w:rPr>
-              <w:t>9</w:t>
-            </w:r>
-          </w:p>
-        </w:tc>
-        <w:tc>
-          <w:tcPr>
-            <w:tcW w:w="2232" w:type="dxa"/>
-            <w:vAlign w:val="center"/>
-          </w:tcPr>
-          <w:p>
-            <w:pPr>
-              <w:spacing w:after="40"/>
-            </w:pPr>
-            <w:r>
-              <w:rPr>
-                <w:sz w:val="20"/>
-              </w:rPr>
-              <w:t>Criar usuário sem senha</w:t>
-            </w:r>
-          </w:p>
-        </w:tc>
-        <w:tc>
-          <w:tcPr>
-            <w:tcW w:w="4176" w:type="dxa"/>
-            <w:vAlign w:val="center"/>
-          </w:tcPr>
-          <w:p>
-            <w:pPr>
-              <w:spacing w:after="40"/>
-              <w:rPr>
-                <w:lang w:val="pt-BR"/>
-              </w:rPr>
-            </w:pPr>
-            <w:r>
-              <w:rPr>
-                <w:sz w:val="20"/>
-                <w:lang w:val="pt-BR"/>
-              </w:rPr>
-              <w:t xml:space="preserve">HTTP 400; </w:t>
-            </w:r>
-            <w:r>
-              <w:rPr>
-                <w:sz w:val="20"/>
-                <w:lang w:val="pt-BR"/>
-              </w:rPr>
-              <w:t>EX: A senha é obrigatória</w:t>
-            </w:r>
-            <w:r>
-              <w:rPr>
-                <w:sz w:val="20"/>
-                <w:lang w:val="pt-BR"/>
-              </w:rPr>
-              <w:t>.</w:t>
-            </w:r>
-          </w:p>
-        </w:tc>
-        <w:tc>
-          <w:tcPr>
-            <w:tcW w:w="1512" w:type="dxa"/>
-            <w:vAlign w:val="center"/>
-          </w:tcPr>
-          <w:p>
-            <w:pPr>
-              <w:spacing w:after="40"/>
-            </w:pPr>
-            <w:proofErr w:type="spellStart"/>
-            <w:r>
-              <w:rPr>
-                <w:sz w:val="20"/>
-              </w:rPr>
-              <w:t>Aprovado</w:t>
-            </w:r>
-            <w:proofErr w:type="spellEnd"/>
-          </w:p>
-        </w:tc>
-        <w:tc>
-          <w:tcPr>
-            <w:tcW w:w="1944" w:type="dxa"/>
-            <w:vAlign w:val="center"/>
-          </w:tcPr>
-          <w:p>
-            <w:pPr>
-              <w:spacing w:after="40"/>
-            </w:pPr>
-            <w:r>
-              <w:rPr>
-                <w:sz w:val="20"/>
-                <w:lang w:val="pt-BR"/>
-              </w:rPr>
-              <w:t>Em conformidade.</w:t>
-            </w:r>
-          </w:p>
-        </w:tc>
-      </w:tr>
-      <w:tr>
-        <w:trPr>
-          <w:jc w:val="center"/>
-        </w:trPr>
-        <w:tc>
-          <w:tcPr>
-            <w:tcW w:w="936" w:type="dxa"/>
-            <w:vAlign w:val="center"/>
-          </w:tcPr>
-          <w:p>
-            <w:pPr>
-              <w:spacing w:after="40"/>
-            </w:pPr>
-            <w:r>
-              <w:rPr>
-                <w:sz w:val="20"/>
-              </w:rPr>
-              <w:t>USR-</w:t>
-            </w:r>
-            <w:r>
-              <w:rPr>
-                <w:sz w:val="20"/>
-              </w:rPr>
-              <w:t>10</w:t>
             </w:r>
           </w:p>
         </w:tc>
@@ -2961,6 +2829,7 @@
         <w:tc>
           <w:tcPr>
             <w:tcW w:w="1944" w:type="dxa"/>
+            <w:shd w:val="clear" w:color="auto" w:fill="17365D" w:themeFill="text2" w:themeFillShade="BF"/>
             <w:vAlign w:val="center"/>
           </w:tcPr>
           <w:p>
@@ -2993,7 +2862,13 @@
               <w:rPr>
                 <w:sz w:val="20"/>
               </w:rPr>
-              <w:t>USR-10</w:t>
+              <w:t>USR-</w:t>
+            </w:r>
+            <w:r>
+              <w:rPr>
+                <w:sz w:val="20"/>
+              </w:rPr>
+              <w:t>8</w:t>
             </w:r>
           </w:p>
         </w:tc>
@@ -3127,7 +3002,13 @@
               <w:rPr>
                 <w:sz w:val="20"/>
               </w:rPr>
-              <w:t>USR-11</w:t>
+              <w:t>USR-</w:t>
+            </w:r>
+            <w:r>
+              <w:rPr>
+                <w:sz w:val="20"/>
+              </w:rPr>
+              <w:t>9</w:t>
             </w:r>
           </w:p>
         </w:tc>
@@ -3355,6 +3236,7 @@
         <w:tc>
           <w:tcPr>
             <w:tcW w:w="1944" w:type="dxa"/>
+            <w:shd w:val="clear" w:color="auto" w:fill="17365D" w:themeFill="text2" w:themeFillShade="BF"/>
             <w:vAlign w:val="center"/>
           </w:tcPr>
           <w:p>
@@ -3604,19 +3486,7 @@
         </w:tc>
       </w:tr>
     </w:tbl>
-    <w:p>
-      <w:pPr>
-        <w:spacing w:after="160" w:line="269" w:lineRule="auto"/>
-        <w:rPr>
-          <w:lang w:val="pt-BR"/>
-        </w:rPr>
-      </w:pPr>
-    </w:p>
-    <w:p>
-      <w:pPr>
-        <w:pStyle w:val="Ttulo2"/>
-      </w:pPr>
-    </w:p>
+    <w:p/>
     <w:p>
       <w:pPr>
         <w:pStyle w:val="Ttulo2"/>
@@ -3755,6 +3625,7 @@
         <w:tc>
           <w:tcPr>
             <w:tcW w:w="1944" w:type="dxa"/>
+            <w:shd w:val="clear" w:color="auto" w:fill="17365D" w:themeFill="text2" w:themeFillShade="BF"/>
             <w:vAlign w:val="center"/>
           </w:tcPr>
           <w:p>
@@ -4166,6 +4037,7 @@
               <w:rPr>
                 <w:sz w:val="20"/>
               </w:rPr>
+              <w:lastRenderedPageBreak/>
               <w:t>TRX-04</w:t>
             </w:r>
           </w:p>
@@ -4647,14 +4519,6 @@
         </w:tc>
       </w:tr>
     </w:tbl>
-    <w:p>
-      <w:pPr>
-        <w:pStyle w:val="Ttulo1"/>
-        <w:rPr>
-          <w:lang w:val="pt-BR"/>
-        </w:rPr>
-      </w:pPr>
-    </w:p>
     <w:p>
       <w:pPr>
         <w:rPr>
@@ -4671,24 +4535,1952 @@
     </w:p>
     <w:p>
       <w:pPr>
+        <w:pStyle w:val="Ttulo2"/>
+        <w:spacing w:before="360" w:after="200"/>
         <w:rPr>
           <w:lang w:val="pt-BR"/>
         </w:rPr>
       </w:pPr>
-    </w:p>
-    <w:p>
-      <w:pPr>
+      <w:r>
         <w:rPr>
           <w:lang w:val="pt-BR"/>
         </w:rPr>
-      </w:pPr>
+        <w:t xml:space="preserve">5.5 </w:t>
+      </w:r>
+      <w:proofErr w:type="spellStart"/>
+      <w:r>
+        <w:rPr>
+          <w:lang w:val="pt-BR"/>
+        </w:rPr>
+        <w:t>Frontend</w:t>
+      </w:r>
+      <w:proofErr w:type="spellEnd"/>
+      <w:r>
+        <w:rPr>
+          <w:lang w:val="pt-BR"/>
+        </w:rPr>
+        <w:t xml:space="preserve"> — </w:t>
+      </w:r>
+      <w:r>
+        <w:rPr>
+          <w:lang w:val="pt-BR"/>
+        </w:rPr>
+        <w:t>TESTES DA APLICAÇÃO FINAL</w:t>
+      </w:r>
     </w:p>
+    <w:tbl>
+      <w:tblPr>
+        <w:tblStyle w:val="Tabelacomgrade"/>
+        <w:tblW w:w="10944" w:type="dxa"/>
+        <w:jc w:val="center"/>
+        <w:tblLayout w:type="fixed"/>
+        <w:tblLook w:val="04A0" w:firstRow="1" w:lastRow="0" w:firstColumn="1" w:lastColumn="0" w:noHBand="0" w:noVBand="1"/>
+      </w:tblPr>
+      <w:tblGrid>
+        <w:gridCol w:w="1080"/>
+        <w:gridCol w:w="3600"/>
+        <w:gridCol w:w="2232"/>
+        <w:gridCol w:w="1944"/>
+        <w:gridCol w:w="2088"/>
+      </w:tblGrid>
+      <w:tr>
+        <w:trPr>
+          <w:jc w:val="center"/>
+        </w:trPr>
+        <w:tc>
+          <w:tcPr>
+            <w:tcW w:w="1080" w:type="dxa"/>
+            <w:shd w:val="clear" w:color="auto" w:fill="17365D"/>
+            <w:vAlign w:val="center"/>
+          </w:tcPr>
+          <w:p>
+            <w:pPr>
+              <w:spacing w:after="40"/>
+            </w:pPr>
+            <w:r>
+              <w:rPr>
+                <w:b/>
+                <w:color w:val="FFFFFF"/>
+                <w:sz w:val="18"/>
+              </w:rPr>
+              <w:t>ID</w:t>
+            </w:r>
+          </w:p>
+        </w:tc>
+        <w:tc>
+          <w:tcPr>
+            <w:tcW w:w="3600" w:type="dxa"/>
+            <w:shd w:val="clear" w:color="auto" w:fill="17365D"/>
+            <w:vAlign w:val="center"/>
+          </w:tcPr>
+          <w:p>
+            <w:pPr>
+              <w:spacing w:after="40"/>
+            </w:pPr>
+            <w:r>
+              <w:rPr>
+                <w:b/>
+                <w:color w:val="FFFFFF"/>
+                <w:sz w:val="18"/>
+              </w:rPr>
+              <w:t>Cenário</w:t>
+            </w:r>
+          </w:p>
+        </w:tc>
+        <w:tc>
+          <w:tcPr>
+            <w:tcW w:w="2232" w:type="dxa"/>
+            <w:shd w:val="clear" w:color="auto" w:fill="17365D"/>
+            <w:vAlign w:val="center"/>
+          </w:tcPr>
+          <w:p>
+            <w:pPr>
+              <w:spacing w:after="40"/>
+            </w:pPr>
+            <w:r>
+              <w:rPr>
+                <w:b/>
+                <w:color w:val="FFFFFF"/>
+                <w:sz w:val="18"/>
+              </w:rPr>
+              <w:t>Resultado esperado</w:t>
+            </w:r>
+          </w:p>
+        </w:tc>
+        <w:tc>
+          <w:tcPr>
+            <w:tcW w:w="1944" w:type="dxa"/>
+            <w:shd w:val="clear" w:color="auto" w:fill="17365D"/>
+            <w:vAlign w:val="center"/>
+          </w:tcPr>
+          <w:p>
+            <w:pPr>
+              <w:spacing w:after="40"/>
+            </w:pPr>
+            <w:r>
+              <w:rPr>
+                <w:b/>
+                <w:color w:val="FFFFFF"/>
+                <w:sz w:val="18"/>
+              </w:rPr>
+              <w:t>Resultado observado</w:t>
+            </w:r>
+          </w:p>
+        </w:tc>
+        <w:tc>
+          <w:tcPr>
+            <w:tcW w:w="2088" w:type="dxa"/>
+            <w:shd w:val="clear" w:color="auto" w:fill="17365D"/>
+            <w:vAlign w:val="center"/>
+          </w:tcPr>
+          <w:p>
+            <w:pPr>
+              <w:spacing w:after="40"/>
+            </w:pPr>
+            <w:r>
+              <w:rPr>
+                <w:b/>
+                <w:color w:val="FFFFFF"/>
+                <w:sz w:val="18"/>
+              </w:rPr>
+              <w:t>Observações</w:t>
+            </w:r>
+          </w:p>
+        </w:tc>
+      </w:tr>
+      <w:tr>
+        <w:trPr>
+          <w:jc w:val="center"/>
+        </w:trPr>
+        <w:tc>
+          <w:tcPr>
+            <w:tcW w:w="1080" w:type="dxa"/>
+            <w:vAlign w:val="center"/>
+          </w:tcPr>
+          <w:p>
+            <w:pPr>
+              <w:spacing w:after="40"/>
+            </w:pPr>
+            <w:r>
+              <w:rPr>
+                <w:sz w:val="18"/>
+              </w:rPr>
+              <w:t>FE-01</w:t>
+            </w:r>
+          </w:p>
+        </w:tc>
+        <w:tc>
+          <w:tcPr>
+            <w:tcW w:w="3600" w:type="dxa"/>
+            <w:vAlign w:val="center"/>
+          </w:tcPr>
+          <w:p>
+            <w:pPr>
+              <w:spacing w:after="40"/>
+              <w:rPr>
+                <w:lang w:val="pt-BR"/>
+              </w:rPr>
+            </w:pPr>
+            <w:r>
+              <w:rPr>
+                <w:sz w:val="18"/>
+                <w:lang w:val="pt-BR"/>
+              </w:rPr>
+              <w:t>Acessar a tela de login</w:t>
+            </w:r>
+          </w:p>
+        </w:tc>
+        <w:tc>
+          <w:tcPr>
+            <w:tcW w:w="2232" w:type="dxa"/>
+            <w:vAlign w:val="center"/>
+          </w:tcPr>
+          <w:p>
+            <w:pPr>
+              <w:spacing w:after="40"/>
+              <w:rPr>
+                <w:lang w:val="pt-BR"/>
+              </w:rPr>
+            </w:pPr>
+          </w:p>
+        </w:tc>
+        <w:tc>
+          <w:tcPr>
+            <w:tcW w:w="1944" w:type="dxa"/>
+            <w:vAlign w:val="center"/>
+          </w:tcPr>
+          <w:p>
+            <w:pPr>
+              <w:spacing w:after="40"/>
+              <w:rPr>
+                <w:lang w:val="pt-BR"/>
+              </w:rPr>
+            </w:pPr>
+          </w:p>
+        </w:tc>
+        <w:tc>
+          <w:tcPr>
+            <w:tcW w:w="2088" w:type="dxa"/>
+            <w:vAlign w:val="center"/>
+          </w:tcPr>
+          <w:p>
+            <w:pPr>
+              <w:spacing w:after="40"/>
+              <w:rPr>
+                <w:lang w:val="pt-BR"/>
+              </w:rPr>
+            </w:pPr>
+          </w:p>
+        </w:tc>
+      </w:tr>
+      <w:tr>
+        <w:trPr>
+          <w:jc w:val="center"/>
+        </w:trPr>
+        <w:tc>
+          <w:tcPr>
+            <w:tcW w:w="1080" w:type="dxa"/>
+            <w:vAlign w:val="center"/>
+          </w:tcPr>
+          <w:p>
+            <w:pPr>
+              <w:spacing w:after="40"/>
+            </w:pPr>
+            <w:r>
+              <w:rPr>
+                <w:sz w:val="18"/>
+              </w:rPr>
+              <w:t>FE-02</w:t>
+            </w:r>
+          </w:p>
+        </w:tc>
+        <w:tc>
+          <w:tcPr>
+            <w:tcW w:w="3600" w:type="dxa"/>
+            <w:vAlign w:val="center"/>
+          </w:tcPr>
+          <w:p>
+            <w:pPr>
+              <w:spacing w:after="40"/>
+              <w:rPr>
+                <w:lang w:val="pt-BR"/>
+              </w:rPr>
+            </w:pPr>
+            <w:r>
+              <w:rPr>
+                <w:sz w:val="18"/>
+                <w:lang w:val="pt-BR"/>
+              </w:rPr>
+              <w:t>Realizar login com e-mail e senha válidos</w:t>
+            </w:r>
+          </w:p>
+        </w:tc>
+        <w:tc>
+          <w:tcPr>
+            <w:tcW w:w="2232" w:type="dxa"/>
+            <w:vAlign w:val="center"/>
+          </w:tcPr>
+          <w:p>
+            <w:pPr>
+              <w:spacing w:after="40"/>
+              <w:rPr>
+                <w:lang w:val="pt-BR"/>
+              </w:rPr>
+            </w:pPr>
+          </w:p>
+        </w:tc>
+        <w:tc>
+          <w:tcPr>
+            <w:tcW w:w="1944" w:type="dxa"/>
+            <w:vAlign w:val="center"/>
+          </w:tcPr>
+          <w:p>
+            <w:pPr>
+              <w:spacing w:after="40"/>
+              <w:rPr>
+                <w:lang w:val="pt-BR"/>
+              </w:rPr>
+            </w:pPr>
+          </w:p>
+        </w:tc>
+        <w:tc>
+          <w:tcPr>
+            <w:tcW w:w="2088" w:type="dxa"/>
+            <w:vAlign w:val="center"/>
+          </w:tcPr>
+          <w:p>
+            <w:pPr>
+              <w:spacing w:after="40"/>
+              <w:rPr>
+                <w:lang w:val="pt-BR"/>
+              </w:rPr>
+            </w:pPr>
+          </w:p>
+        </w:tc>
+      </w:tr>
+      <w:tr>
+        <w:trPr>
+          <w:jc w:val="center"/>
+        </w:trPr>
+        <w:tc>
+          <w:tcPr>
+            <w:tcW w:w="1080" w:type="dxa"/>
+            <w:vAlign w:val="center"/>
+          </w:tcPr>
+          <w:p>
+            <w:pPr>
+              <w:spacing w:after="40"/>
+            </w:pPr>
+            <w:r>
+              <w:rPr>
+                <w:sz w:val="18"/>
+              </w:rPr>
+              <w:t>FE-03</w:t>
+            </w:r>
+          </w:p>
+        </w:tc>
+        <w:tc>
+          <w:tcPr>
+            <w:tcW w:w="3600" w:type="dxa"/>
+            <w:vAlign w:val="center"/>
+          </w:tcPr>
+          <w:p>
+            <w:pPr>
+              <w:spacing w:after="40"/>
+              <w:rPr>
+                <w:lang w:val="pt-BR"/>
+              </w:rPr>
+            </w:pPr>
+            <w:r>
+              <w:rPr>
+                <w:sz w:val="18"/>
+                <w:lang w:val="pt-BR"/>
+              </w:rPr>
+              <w:t>Tentar login com e-mail ou senha inválidos</w:t>
+            </w:r>
+          </w:p>
+        </w:tc>
+        <w:tc>
+          <w:tcPr>
+            <w:tcW w:w="2232" w:type="dxa"/>
+            <w:vAlign w:val="center"/>
+          </w:tcPr>
+          <w:p>
+            <w:pPr>
+              <w:spacing w:after="40"/>
+              <w:rPr>
+                <w:lang w:val="pt-BR"/>
+              </w:rPr>
+            </w:pPr>
+          </w:p>
+        </w:tc>
+        <w:tc>
+          <w:tcPr>
+            <w:tcW w:w="1944" w:type="dxa"/>
+            <w:vAlign w:val="center"/>
+          </w:tcPr>
+          <w:p>
+            <w:pPr>
+              <w:spacing w:after="40"/>
+              <w:rPr>
+                <w:lang w:val="pt-BR"/>
+              </w:rPr>
+            </w:pPr>
+          </w:p>
+        </w:tc>
+        <w:tc>
+          <w:tcPr>
+            <w:tcW w:w="2088" w:type="dxa"/>
+            <w:vAlign w:val="center"/>
+          </w:tcPr>
+          <w:p>
+            <w:pPr>
+              <w:spacing w:after="40"/>
+              <w:rPr>
+                <w:lang w:val="pt-BR"/>
+              </w:rPr>
+            </w:pPr>
+          </w:p>
+        </w:tc>
+      </w:tr>
+      <w:tr>
+        <w:trPr>
+          <w:jc w:val="center"/>
+        </w:trPr>
+        <w:tc>
+          <w:tcPr>
+            <w:tcW w:w="1080" w:type="dxa"/>
+            <w:vAlign w:val="center"/>
+          </w:tcPr>
+          <w:p>
+            <w:pPr>
+              <w:spacing w:after="40"/>
+            </w:pPr>
+            <w:r>
+              <w:rPr>
+                <w:sz w:val="18"/>
+              </w:rPr>
+              <w:t>FE-04</w:t>
+            </w:r>
+          </w:p>
+        </w:tc>
+        <w:tc>
+          <w:tcPr>
+            <w:tcW w:w="3600" w:type="dxa"/>
+            <w:vAlign w:val="center"/>
+          </w:tcPr>
+          <w:p>
+            <w:pPr>
+              <w:spacing w:after="40"/>
+              <w:rPr>
+                <w:lang w:val="pt-BR"/>
+              </w:rPr>
+            </w:pPr>
+            <w:r>
+              <w:rPr>
+                <w:sz w:val="18"/>
+                <w:lang w:val="pt-BR"/>
+              </w:rPr>
+              <w:t>Tentar login com campos obrigatórios vazios</w:t>
+            </w:r>
+          </w:p>
+        </w:tc>
+        <w:tc>
+          <w:tcPr>
+            <w:tcW w:w="2232" w:type="dxa"/>
+            <w:vAlign w:val="center"/>
+          </w:tcPr>
+          <w:p>
+            <w:pPr>
+              <w:spacing w:after="40"/>
+              <w:rPr>
+                <w:lang w:val="pt-BR"/>
+              </w:rPr>
+            </w:pPr>
+          </w:p>
+        </w:tc>
+        <w:tc>
+          <w:tcPr>
+            <w:tcW w:w="1944" w:type="dxa"/>
+            <w:vAlign w:val="center"/>
+          </w:tcPr>
+          <w:p>
+            <w:pPr>
+              <w:spacing w:after="40"/>
+              <w:rPr>
+                <w:lang w:val="pt-BR"/>
+              </w:rPr>
+            </w:pPr>
+          </w:p>
+        </w:tc>
+        <w:tc>
+          <w:tcPr>
+            <w:tcW w:w="2088" w:type="dxa"/>
+            <w:vAlign w:val="center"/>
+          </w:tcPr>
+          <w:p>
+            <w:pPr>
+              <w:spacing w:after="40"/>
+              <w:rPr>
+                <w:lang w:val="pt-BR"/>
+              </w:rPr>
+            </w:pPr>
+          </w:p>
+        </w:tc>
+      </w:tr>
+      <w:tr>
+        <w:trPr>
+          <w:jc w:val="center"/>
+        </w:trPr>
+        <w:tc>
+          <w:tcPr>
+            <w:tcW w:w="1080" w:type="dxa"/>
+            <w:vAlign w:val="center"/>
+          </w:tcPr>
+          <w:p>
+            <w:pPr>
+              <w:spacing w:after="40"/>
+            </w:pPr>
+            <w:r>
+              <w:rPr>
+                <w:sz w:val="18"/>
+              </w:rPr>
+              <w:t>FE-05</w:t>
+            </w:r>
+          </w:p>
+        </w:tc>
+        <w:tc>
+          <w:tcPr>
+            <w:tcW w:w="3600" w:type="dxa"/>
+            <w:vAlign w:val="center"/>
+          </w:tcPr>
+          <w:p>
+            <w:pPr>
+              <w:spacing w:after="40"/>
+              <w:rPr>
+                <w:lang w:val="pt-BR"/>
+              </w:rPr>
+            </w:pPr>
+            <w:r>
+              <w:rPr>
+                <w:sz w:val="18"/>
+                <w:lang w:val="pt-BR"/>
+              </w:rPr>
+              <w:t>Verificar bloqueio de acesso sem login válido</w:t>
+            </w:r>
+          </w:p>
+        </w:tc>
+        <w:tc>
+          <w:tcPr>
+            <w:tcW w:w="2232" w:type="dxa"/>
+            <w:vAlign w:val="center"/>
+          </w:tcPr>
+          <w:p>
+            <w:pPr>
+              <w:spacing w:after="40"/>
+              <w:rPr>
+                <w:lang w:val="pt-BR"/>
+              </w:rPr>
+            </w:pPr>
+          </w:p>
+        </w:tc>
+        <w:tc>
+          <w:tcPr>
+            <w:tcW w:w="1944" w:type="dxa"/>
+            <w:vAlign w:val="center"/>
+          </w:tcPr>
+          <w:p>
+            <w:pPr>
+              <w:spacing w:after="40"/>
+              <w:rPr>
+                <w:lang w:val="pt-BR"/>
+              </w:rPr>
+            </w:pPr>
+          </w:p>
+        </w:tc>
+        <w:tc>
+          <w:tcPr>
+            <w:tcW w:w="2088" w:type="dxa"/>
+            <w:vAlign w:val="center"/>
+          </w:tcPr>
+          <w:p>
+            <w:pPr>
+              <w:spacing w:after="40"/>
+              <w:rPr>
+                <w:lang w:val="pt-BR"/>
+              </w:rPr>
+            </w:pPr>
+          </w:p>
+        </w:tc>
+      </w:tr>
+      <w:tr>
+        <w:trPr>
+          <w:jc w:val="center"/>
+        </w:trPr>
+        <w:tc>
+          <w:tcPr>
+            <w:tcW w:w="1080" w:type="dxa"/>
+            <w:vAlign w:val="center"/>
+          </w:tcPr>
+          <w:p>
+            <w:pPr>
+              <w:spacing w:after="40"/>
+            </w:pPr>
+            <w:r>
+              <w:rPr>
+                <w:sz w:val="18"/>
+              </w:rPr>
+              <w:t>FE-06</w:t>
+            </w:r>
+          </w:p>
+        </w:tc>
+        <w:tc>
+          <w:tcPr>
+            <w:tcW w:w="3600" w:type="dxa"/>
+            <w:vAlign w:val="center"/>
+          </w:tcPr>
+          <w:p>
+            <w:pPr>
+              <w:spacing w:after="40"/>
+              <w:rPr>
+                <w:lang w:val="pt-BR"/>
+              </w:rPr>
+            </w:pPr>
+            <w:r>
+              <w:rPr>
+                <w:sz w:val="18"/>
+                <w:lang w:val="pt-BR"/>
+              </w:rPr>
+              <w:t>Cadastrar usuário com dados válidos</w:t>
+            </w:r>
+          </w:p>
+        </w:tc>
+        <w:tc>
+          <w:tcPr>
+            <w:tcW w:w="2232" w:type="dxa"/>
+            <w:vAlign w:val="center"/>
+          </w:tcPr>
+          <w:p>
+            <w:pPr>
+              <w:spacing w:after="40"/>
+              <w:rPr>
+                <w:lang w:val="pt-BR"/>
+              </w:rPr>
+            </w:pPr>
+          </w:p>
+        </w:tc>
+        <w:tc>
+          <w:tcPr>
+            <w:tcW w:w="1944" w:type="dxa"/>
+            <w:vAlign w:val="center"/>
+          </w:tcPr>
+          <w:p>
+            <w:pPr>
+              <w:spacing w:after="40"/>
+              <w:rPr>
+                <w:lang w:val="pt-BR"/>
+              </w:rPr>
+            </w:pPr>
+          </w:p>
+        </w:tc>
+        <w:tc>
+          <w:tcPr>
+            <w:tcW w:w="2088" w:type="dxa"/>
+            <w:vAlign w:val="center"/>
+          </w:tcPr>
+          <w:p>
+            <w:pPr>
+              <w:spacing w:after="40"/>
+              <w:rPr>
+                <w:lang w:val="pt-BR"/>
+              </w:rPr>
+            </w:pPr>
+          </w:p>
+        </w:tc>
+      </w:tr>
+      <w:tr>
+        <w:trPr>
+          <w:jc w:val="center"/>
+        </w:trPr>
+        <w:tc>
+          <w:tcPr>
+            <w:tcW w:w="1080" w:type="dxa"/>
+            <w:vAlign w:val="center"/>
+          </w:tcPr>
+          <w:p>
+            <w:pPr>
+              <w:spacing w:after="40"/>
+            </w:pPr>
+            <w:r>
+              <w:rPr>
+                <w:sz w:val="18"/>
+              </w:rPr>
+              <w:t>FE-07</w:t>
+            </w:r>
+          </w:p>
+        </w:tc>
+        <w:tc>
+          <w:tcPr>
+            <w:tcW w:w="3600" w:type="dxa"/>
+            <w:vAlign w:val="center"/>
+          </w:tcPr>
+          <w:p>
+            <w:pPr>
+              <w:spacing w:after="40"/>
+              <w:rPr>
+                <w:lang w:val="pt-BR"/>
+              </w:rPr>
+            </w:pPr>
+            <w:r>
+              <w:rPr>
+                <w:sz w:val="18"/>
+                <w:lang w:val="pt-BR"/>
+              </w:rPr>
+              <w:t>Cadastrar usuário com nome vazio</w:t>
+            </w:r>
+          </w:p>
+        </w:tc>
+        <w:tc>
+          <w:tcPr>
+            <w:tcW w:w="2232" w:type="dxa"/>
+            <w:vAlign w:val="center"/>
+          </w:tcPr>
+          <w:p>
+            <w:pPr>
+              <w:spacing w:after="40"/>
+              <w:rPr>
+                <w:lang w:val="pt-BR"/>
+              </w:rPr>
+            </w:pPr>
+          </w:p>
+        </w:tc>
+        <w:tc>
+          <w:tcPr>
+            <w:tcW w:w="1944" w:type="dxa"/>
+            <w:vAlign w:val="center"/>
+          </w:tcPr>
+          <w:p>
+            <w:pPr>
+              <w:spacing w:after="40"/>
+              <w:rPr>
+                <w:lang w:val="pt-BR"/>
+              </w:rPr>
+            </w:pPr>
+          </w:p>
+        </w:tc>
+        <w:tc>
+          <w:tcPr>
+            <w:tcW w:w="2088" w:type="dxa"/>
+            <w:vAlign w:val="center"/>
+          </w:tcPr>
+          <w:p>
+            <w:pPr>
+              <w:spacing w:after="40"/>
+              <w:rPr>
+                <w:lang w:val="pt-BR"/>
+              </w:rPr>
+            </w:pPr>
+          </w:p>
+        </w:tc>
+      </w:tr>
+      <w:tr>
+        <w:trPr>
+          <w:jc w:val="center"/>
+        </w:trPr>
+        <w:tc>
+          <w:tcPr>
+            <w:tcW w:w="1080" w:type="dxa"/>
+            <w:vAlign w:val="center"/>
+          </w:tcPr>
+          <w:p>
+            <w:pPr>
+              <w:spacing w:after="40"/>
+            </w:pPr>
+            <w:r>
+              <w:rPr>
+                <w:sz w:val="18"/>
+              </w:rPr>
+              <w:t>FE-08</w:t>
+            </w:r>
+          </w:p>
+        </w:tc>
+        <w:tc>
+          <w:tcPr>
+            <w:tcW w:w="3600" w:type="dxa"/>
+            <w:vAlign w:val="center"/>
+          </w:tcPr>
+          <w:p>
+            <w:pPr>
+              <w:spacing w:after="40"/>
+              <w:rPr>
+                <w:lang w:val="pt-BR"/>
+              </w:rPr>
+            </w:pPr>
+            <w:r>
+              <w:rPr>
+                <w:sz w:val="18"/>
+                <w:lang w:val="pt-BR"/>
+              </w:rPr>
+              <w:t>Cadastrar usuário com e-mail vazio ou inválido</w:t>
+            </w:r>
+          </w:p>
+        </w:tc>
+        <w:tc>
+          <w:tcPr>
+            <w:tcW w:w="2232" w:type="dxa"/>
+            <w:vAlign w:val="center"/>
+          </w:tcPr>
+          <w:p>
+            <w:pPr>
+              <w:spacing w:after="40"/>
+              <w:rPr>
+                <w:lang w:val="pt-BR"/>
+              </w:rPr>
+            </w:pPr>
+          </w:p>
+        </w:tc>
+        <w:tc>
+          <w:tcPr>
+            <w:tcW w:w="1944" w:type="dxa"/>
+            <w:vAlign w:val="center"/>
+          </w:tcPr>
+          <w:p>
+            <w:pPr>
+              <w:spacing w:after="40"/>
+              <w:rPr>
+                <w:lang w:val="pt-BR"/>
+              </w:rPr>
+            </w:pPr>
+          </w:p>
+        </w:tc>
+        <w:tc>
+          <w:tcPr>
+            <w:tcW w:w="2088" w:type="dxa"/>
+            <w:vAlign w:val="center"/>
+          </w:tcPr>
+          <w:p>
+            <w:pPr>
+              <w:spacing w:after="40"/>
+              <w:rPr>
+                <w:lang w:val="pt-BR"/>
+              </w:rPr>
+            </w:pPr>
+          </w:p>
+        </w:tc>
+      </w:tr>
+      <w:tr>
+        <w:trPr>
+          <w:jc w:val="center"/>
+        </w:trPr>
+        <w:tc>
+          <w:tcPr>
+            <w:tcW w:w="1080" w:type="dxa"/>
+            <w:vAlign w:val="center"/>
+          </w:tcPr>
+          <w:p>
+            <w:pPr>
+              <w:spacing w:after="40"/>
+            </w:pPr>
+            <w:r>
+              <w:rPr>
+                <w:sz w:val="18"/>
+              </w:rPr>
+              <w:t>FE-09</w:t>
+            </w:r>
+          </w:p>
+        </w:tc>
+        <w:tc>
+          <w:tcPr>
+            <w:tcW w:w="3600" w:type="dxa"/>
+            <w:vAlign w:val="center"/>
+          </w:tcPr>
+          <w:p>
+            <w:pPr>
+              <w:spacing w:after="40"/>
+              <w:rPr>
+                <w:lang w:val="pt-BR"/>
+              </w:rPr>
+            </w:pPr>
+            <w:r>
+              <w:rPr>
+                <w:sz w:val="18"/>
+                <w:lang w:val="pt-BR"/>
+              </w:rPr>
+              <w:t>Cadastrar usuário com e-mail duplicado</w:t>
+            </w:r>
+          </w:p>
+        </w:tc>
+        <w:tc>
+          <w:tcPr>
+            <w:tcW w:w="2232" w:type="dxa"/>
+            <w:vAlign w:val="center"/>
+          </w:tcPr>
+          <w:p>
+            <w:pPr>
+              <w:spacing w:after="40"/>
+              <w:rPr>
+                <w:lang w:val="pt-BR"/>
+              </w:rPr>
+            </w:pPr>
+          </w:p>
+        </w:tc>
+        <w:tc>
+          <w:tcPr>
+            <w:tcW w:w="1944" w:type="dxa"/>
+            <w:vAlign w:val="center"/>
+          </w:tcPr>
+          <w:p>
+            <w:pPr>
+              <w:spacing w:after="40"/>
+              <w:rPr>
+                <w:lang w:val="pt-BR"/>
+              </w:rPr>
+            </w:pPr>
+          </w:p>
+        </w:tc>
+        <w:tc>
+          <w:tcPr>
+            <w:tcW w:w="2088" w:type="dxa"/>
+            <w:vAlign w:val="center"/>
+          </w:tcPr>
+          <w:p>
+            <w:pPr>
+              <w:spacing w:after="40"/>
+              <w:rPr>
+                <w:lang w:val="pt-BR"/>
+              </w:rPr>
+            </w:pPr>
+          </w:p>
+        </w:tc>
+      </w:tr>
+      <w:tr>
+        <w:trPr>
+          <w:jc w:val="center"/>
+        </w:trPr>
+        <w:tc>
+          <w:tcPr>
+            <w:tcW w:w="1080" w:type="dxa"/>
+            <w:vAlign w:val="center"/>
+          </w:tcPr>
+          <w:p>
+            <w:pPr>
+              <w:spacing w:after="40"/>
+            </w:pPr>
+            <w:r>
+              <w:rPr>
+                <w:sz w:val="18"/>
+              </w:rPr>
+              <w:t>FE-11</w:t>
+            </w:r>
+          </w:p>
+        </w:tc>
+        <w:tc>
+          <w:tcPr>
+            <w:tcW w:w="3600" w:type="dxa"/>
+            <w:vAlign w:val="center"/>
+          </w:tcPr>
+          <w:p>
+            <w:pPr>
+              <w:spacing w:after="40"/>
+              <w:rPr>
+                <w:lang w:val="pt-BR"/>
+              </w:rPr>
+            </w:pPr>
+            <w:r>
+              <w:rPr>
+                <w:sz w:val="18"/>
+                <w:lang w:val="pt-BR"/>
+              </w:rPr>
+              <w:t>Cadastrar usuário com senha vazia ou fraca</w:t>
+            </w:r>
+          </w:p>
+        </w:tc>
+        <w:tc>
+          <w:tcPr>
+            <w:tcW w:w="2232" w:type="dxa"/>
+            <w:vAlign w:val="center"/>
+          </w:tcPr>
+          <w:p>
+            <w:pPr>
+              <w:spacing w:after="40"/>
+              <w:rPr>
+                <w:lang w:val="pt-BR"/>
+              </w:rPr>
+            </w:pPr>
+          </w:p>
+        </w:tc>
+        <w:tc>
+          <w:tcPr>
+            <w:tcW w:w="1944" w:type="dxa"/>
+            <w:vAlign w:val="center"/>
+          </w:tcPr>
+          <w:p>
+            <w:pPr>
+              <w:spacing w:after="40"/>
+              <w:rPr>
+                <w:lang w:val="pt-BR"/>
+              </w:rPr>
+            </w:pPr>
+          </w:p>
+        </w:tc>
+        <w:tc>
+          <w:tcPr>
+            <w:tcW w:w="2088" w:type="dxa"/>
+            <w:vAlign w:val="center"/>
+          </w:tcPr>
+          <w:p>
+            <w:pPr>
+              <w:spacing w:after="40"/>
+              <w:rPr>
+                <w:lang w:val="pt-BR"/>
+              </w:rPr>
+            </w:pPr>
+          </w:p>
+        </w:tc>
+      </w:tr>
+      <w:tr>
+        <w:trPr>
+          <w:jc w:val="center"/>
+        </w:trPr>
+        <w:tc>
+          <w:tcPr>
+            <w:tcW w:w="1080" w:type="dxa"/>
+            <w:vAlign w:val="center"/>
+          </w:tcPr>
+          <w:p>
+            <w:pPr>
+              <w:spacing w:after="40"/>
+            </w:pPr>
+            <w:r>
+              <w:rPr>
+                <w:sz w:val="18"/>
+              </w:rPr>
+              <w:t>FE-12</w:t>
+            </w:r>
+          </w:p>
+        </w:tc>
+        <w:tc>
+          <w:tcPr>
+            <w:tcW w:w="3600" w:type="dxa"/>
+            <w:vAlign w:val="center"/>
+          </w:tcPr>
+          <w:p>
+            <w:pPr>
+              <w:spacing w:after="40"/>
+              <w:rPr>
+                <w:lang w:val="pt-BR"/>
+              </w:rPr>
+            </w:pPr>
+            <w:r>
+              <w:rPr>
+                <w:sz w:val="18"/>
+                <w:lang w:val="pt-BR"/>
+              </w:rPr>
+              <w:t>Visualizar identificação do usuário logado</w:t>
+            </w:r>
+          </w:p>
+        </w:tc>
+        <w:tc>
+          <w:tcPr>
+            <w:tcW w:w="2232" w:type="dxa"/>
+            <w:vAlign w:val="center"/>
+          </w:tcPr>
+          <w:p>
+            <w:pPr>
+              <w:spacing w:after="40"/>
+              <w:rPr>
+                <w:lang w:val="pt-BR"/>
+              </w:rPr>
+            </w:pPr>
+          </w:p>
+        </w:tc>
+        <w:tc>
+          <w:tcPr>
+            <w:tcW w:w="1944" w:type="dxa"/>
+            <w:vAlign w:val="center"/>
+          </w:tcPr>
+          <w:p>
+            <w:pPr>
+              <w:spacing w:after="40"/>
+              <w:rPr>
+                <w:lang w:val="pt-BR"/>
+              </w:rPr>
+            </w:pPr>
+          </w:p>
+        </w:tc>
+        <w:tc>
+          <w:tcPr>
+            <w:tcW w:w="2088" w:type="dxa"/>
+            <w:vAlign w:val="center"/>
+          </w:tcPr>
+          <w:p>
+            <w:pPr>
+              <w:spacing w:after="40"/>
+              <w:rPr>
+                <w:lang w:val="pt-BR"/>
+              </w:rPr>
+            </w:pPr>
+          </w:p>
+        </w:tc>
+      </w:tr>
+      <w:tr>
+        <w:trPr>
+          <w:jc w:val="center"/>
+        </w:trPr>
+        <w:tc>
+          <w:tcPr>
+            <w:tcW w:w="1080" w:type="dxa"/>
+            <w:vAlign w:val="center"/>
+          </w:tcPr>
+          <w:p>
+            <w:pPr>
+              <w:spacing w:after="40"/>
+            </w:pPr>
+            <w:r>
+              <w:rPr>
+                <w:sz w:val="18"/>
+              </w:rPr>
+              <w:t>FE-13</w:t>
+            </w:r>
+          </w:p>
+        </w:tc>
+        <w:tc>
+          <w:tcPr>
+            <w:tcW w:w="3600" w:type="dxa"/>
+            <w:vAlign w:val="center"/>
+          </w:tcPr>
+          <w:p>
+            <w:pPr>
+              <w:spacing w:after="40"/>
+              <w:rPr>
+                <w:lang w:val="pt-BR"/>
+              </w:rPr>
+            </w:pPr>
+            <w:r>
+              <w:rPr>
+                <w:sz w:val="18"/>
+                <w:lang w:val="pt-BR"/>
+              </w:rPr>
+              <w:t>Visualizar todas as transações enviadas e recebidas</w:t>
+            </w:r>
+          </w:p>
+        </w:tc>
+        <w:tc>
+          <w:tcPr>
+            <w:tcW w:w="2232" w:type="dxa"/>
+            <w:vAlign w:val="center"/>
+          </w:tcPr>
+          <w:p>
+            <w:pPr>
+              <w:spacing w:after="40"/>
+              <w:rPr>
+                <w:lang w:val="pt-BR"/>
+              </w:rPr>
+            </w:pPr>
+          </w:p>
+        </w:tc>
+        <w:tc>
+          <w:tcPr>
+            <w:tcW w:w="1944" w:type="dxa"/>
+            <w:vAlign w:val="center"/>
+          </w:tcPr>
+          <w:p>
+            <w:pPr>
+              <w:spacing w:after="40"/>
+              <w:rPr>
+                <w:lang w:val="pt-BR"/>
+              </w:rPr>
+            </w:pPr>
+          </w:p>
+        </w:tc>
+        <w:tc>
+          <w:tcPr>
+            <w:tcW w:w="2088" w:type="dxa"/>
+            <w:vAlign w:val="center"/>
+          </w:tcPr>
+          <w:p>
+            <w:pPr>
+              <w:spacing w:after="40"/>
+              <w:rPr>
+                <w:lang w:val="pt-BR"/>
+              </w:rPr>
+            </w:pPr>
+          </w:p>
+        </w:tc>
+      </w:tr>
+      <w:tr>
+        <w:trPr>
+          <w:jc w:val="center"/>
+        </w:trPr>
+        <w:tc>
+          <w:tcPr>
+            <w:tcW w:w="1080" w:type="dxa"/>
+            <w:vAlign w:val="center"/>
+          </w:tcPr>
+          <w:p>
+            <w:pPr>
+              <w:spacing w:after="40"/>
+            </w:pPr>
+            <w:r>
+              <w:rPr>
+                <w:sz w:val="18"/>
+              </w:rPr>
+              <w:t>FE-14</w:t>
+            </w:r>
+          </w:p>
+        </w:tc>
+        <w:tc>
+          <w:tcPr>
+            <w:tcW w:w="3600" w:type="dxa"/>
+            <w:vAlign w:val="center"/>
+          </w:tcPr>
+          <w:p>
+            <w:pPr>
+              <w:spacing w:after="40"/>
+              <w:rPr>
+                <w:lang w:val="pt-BR"/>
+              </w:rPr>
+            </w:pPr>
+            <w:r>
+              <w:rPr>
+                <w:sz w:val="18"/>
+                <w:lang w:val="pt-BR"/>
+              </w:rPr>
+              <w:t>Filtrar transações do dia atual</w:t>
+            </w:r>
+          </w:p>
+        </w:tc>
+        <w:tc>
+          <w:tcPr>
+            <w:tcW w:w="2232" w:type="dxa"/>
+            <w:vAlign w:val="center"/>
+          </w:tcPr>
+          <w:p>
+            <w:pPr>
+              <w:spacing w:after="40"/>
+              <w:rPr>
+                <w:lang w:val="pt-BR"/>
+              </w:rPr>
+            </w:pPr>
+          </w:p>
+        </w:tc>
+        <w:tc>
+          <w:tcPr>
+            <w:tcW w:w="1944" w:type="dxa"/>
+            <w:vAlign w:val="center"/>
+          </w:tcPr>
+          <w:p>
+            <w:pPr>
+              <w:spacing w:after="40"/>
+              <w:rPr>
+                <w:lang w:val="pt-BR"/>
+              </w:rPr>
+            </w:pPr>
+          </w:p>
+        </w:tc>
+        <w:tc>
+          <w:tcPr>
+            <w:tcW w:w="2088" w:type="dxa"/>
+            <w:vAlign w:val="center"/>
+          </w:tcPr>
+          <w:p>
+            <w:pPr>
+              <w:spacing w:after="40"/>
+              <w:rPr>
+                <w:lang w:val="pt-BR"/>
+              </w:rPr>
+            </w:pPr>
+          </w:p>
+        </w:tc>
+      </w:tr>
+      <w:tr>
+        <w:trPr>
+          <w:jc w:val="center"/>
+        </w:trPr>
+        <w:tc>
+          <w:tcPr>
+            <w:tcW w:w="1080" w:type="dxa"/>
+            <w:vAlign w:val="center"/>
+          </w:tcPr>
+          <w:p>
+            <w:pPr>
+              <w:spacing w:after="40"/>
+            </w:pPr>
+            <w:r>
+              <w:rPr>
+                <w:sz w:val="18"/>
+              </w:rPr>
+              <w:t>FE-15</w:t>
+            </w:r>
+          </w:p>
+        </w:tc>
+        <w:tc>
+          <w:tcPr>
+            <w:tcW w:w="3600" w:type="dxa"/>
+            <w:vAlign w:val="center"/>
+          </w:tcPr>
+          <w:p>
+            <w:pPr>
+              <w:spacing w:after="40"/>
+              <w:rPr>
+                <w:lang w:val="pt-BR"/>
+              </w:rPr>
+            </w:pPr>
+            <w:r>
+              <w:rPr>
+                <w:sz w:val="18"/>
+                <w:lang w:val="pt-BR"/>
+              </w:rPr>
+              <w:t>Filtrar transações do dia anterior</w:t>
+            </w:r>
+          </w:p>
+        </w:tc>
+        <w:tc>
+          <w:tcPr>
+            <w:tcW w:w="2232" w:type="dxa"/>
+            <w:vAlign w:val="center"/>
+          </w:tcPr>
+          <w:p>
+            <w:pPr>
+              <w:spacing w:after="40"/>
+              <w:rPr>
+                <w:lang w:val="pt-BR"/>
+              </w:rPr>
+            </w:pPr>
+          </w:p>
+        </w:tc>
+        <w:tc>
+          <w:tcPr>
+            <w:tcW w:w="1944" w:type="dxa"/>
+            <w:vAlign w:val="center"/>
+          </w:tcPr>
+          <w:p>
+            <w:pPr>
+              <w:spacing w:after="40"/>
+              <w:rPr>
+                <w:lang w:val="pt-BR"/>
+              </w:rPr>
+            </w:pPr>
+          </w:p>
+        </w:tc>
+        <w:tc>
+          <w:tcPr>
+            <w:tcW w:w="2088" w:type="dxa"/>
+            <w:vAlign w:val="center"/>
+          </w:tcPr>
+          <w:p>
+            <w:pPr>
+              <w:spacing w:after="40"/>
+              <w:rPr>
+                <w:lang w:val="pt-BR"/>
+              </w:rPr>
+            </w:pPr>
+          </w:p>
+        </w:tc>
+      </w:tr>
+      <w:tr>
+        <w:trPr>
+          <w:jc w:val="center"/>
+        </w:trPr>
+        <w:tc>
+          <w:tcPr>
+            <w:tcW w:w="1080" w:type="dxa"/>
+            <w:vAlign w:val="center"/>
+          </w:tcPr>
+          <w:p>
+            <w:pPr>
+              <w:spacing w:after="40"/>
+            </w:pPr>
+            <w:r>
+              <w:rPr>
+                <w:sz w:val="18"/>
+              </w:rPr>
+              <w:t>FE-16</w:t>
+            </w:r>
+          </w:p>
+        </w:tc>
+        <w:tc>
+          <w:tcPr>
+            <w:tcW w:w="3600" w:type="dxa"/>
+            <w:vAlign w:val="center"/>
+          </w:tcPr>
+          <w:p>
+            <w:pPr>
+              <w:spacing w:after="40"/>
+              <w:rPr>
+                <w:lang w:val="pt-BR"/>
+              </w:rPr>
+            </w:pPr>
+            <w:r>
+              <w:rPr>
+                <w:sz w:val="18"/>
+                <w:lang w:val="pt-BR"/>
+              </w:rPr>
+              <w:t>Filtrar transações dos últimos 14 dias</w:t>
+            </w:r>
+          </w:p>
+        </w:tc>
+        <w:tc>
+          <w:tcPr>
+            <w:tcW w:w="2232" w:type="dxa"/>
+            <w:vAlign w:val="center"/>
+          </w:tcPr>
+          <w:p>
+            <w:pPr>
+              <w:spacing w:after="40"/>
+              <w:rPr>
+                <w:lang w:val="pt-BR"/>
+              </w:rPr>
+            </w:pPr>
+          </w:p>
+        </w:tc>
+        <w:tc>
+          <w:tcPr>
+            <w:tcW w:w="1944" w:type="dxa"/>
+            <w:vAlign w:val="center"/>
+          </w:tcPr>
+          <w:p>
+            <w:pPr>
+              <w:spacing w:after="40"/>
+              <w:rPr>
+                <w:lang w:val="pt-BR"/>
+              </w:rPr>
+            </w:pPr>
+          </w:p>
+        </w:tc>
+        <w:tc>
+          <w:tcPr>
+            <w:tcW w:w="2088" w:type="dxa"/>
+            <w:vAlign w:val="center"/>
+          </w:tcPr>
+          <w:p>
+            <w:pPr>
+              <w:spacing w:after="40"/>
+              <w:rPr>
+                <w:lang w:val="pt-BR"/>
+              </w:rPr>
+            </w:pPr>
+          </w:p>
+        </w:tc>
+      </w:tr>
+      <w:tr>
+        <w:trPr>
+          <w:jc w:val="center"/>
+        </w:trPr>
+        <w:tc>
+          <w:tcPr>
+            <w:tcW w:w="1080" w:type="dxa"/>
+            <w:vAlign w:val="center"/>
+          </w:tcPr>
+          <w:p>
+            <w:pPr>
+              <w:spacing w:after="40"/>
+            </w:pPr>
+            <w:r>
+              <w:rPr>
+                <w:sz w:val="18"/>
+              </w:rPr>
+              <w:t>FE-17</w:t>
+            </w:r>
+          </w:p>
+        </w:tc>
+        <w:tc>
+          <w:tcPr>
+            <w:tcW w:w="3600" w:type="dxa"/>
+            <w:vAlign w:val="center"/>
+          </w:tcPr>
+          <w:p>
+            <w:pPr>
+              <w:spacing w:after="40"/>
+              <w:rPr>
+                <w:lang w:val="pt-BR"/>
+              </w:rPr>
+            </w:pPr>
+            <w:r>
+              <w:rPr>
+                <w:sz w:val="18"/>
+                <w:lang w:val="pt-BR"/>
+              </w:rPr>
+              <w:t>Filtrar transações por forma de pagamento</w:t>
+            </w:r>
+          </w:p>
+        </w:tc>
+        <w:tc>
+          <w:tcPr>
+            <w:tcW w:w="2232" w:type="dxa"/>
+            <w:vAlign w:val="center"/>
+          </w:tcPr>
+          <w:p>
+            <w:pPr>
+              <w:spacing w:after="40"/>
+              <w:rPr>
+                <w:lang w:val="pt-BR"/>
+              </w:rPr>
+            </w:pPr>
+          </w:p>
+        </w:tc>
+        <w:tc>
+          <w:tcPr>
+            <w:tcW w:w="1944" w:type="dxa"/>
+            <w:vAlign w:val="center"/>
+          </w:tcPr>
+          <w:p>
+            <w:pPr>
+              <w:spacing w:after="40"/>
+              <w:rPr>
+                <w:lang w:val="pt-BR"/>
+              </w:rPr>
+            </w:pPr>
+          </w:p>
+        </w:tc>
+        <w:tc>
+          <w:tcPr>
+            <w:tcW w:w="2088" w:type="dxa"/>
+            <w:vAlign w:val="center"/>
+          </w:tcPr>
+          <w:p>
+            <w:pPr>
+              <w:spacing w:after="40"/>
+              <w:rPr>
+                <w:lang w:val="pt-BR"/>
+              </w:rPr>
+            </w:pPr>
+          </w:p>
+        </w:tc>
+      </w:tr>
+      <w:tr>
+        <w:trPr>
+          <w:jc w:val="center"/>
+        </w:trPr>
+        <w:tc>
+          <w:tcPr>
+            <w:tcW w:w="1080" w:type="dxa"/>
+            <w:vAlign w:val="center"/>
+          </w:tcPr>
+          <w:p>
+            <w:pPr>
+              <w:spacing w:after="40"/>
+            </w:pPr>
+            <w:r>
+              <w:rPr>
+                <w:sz w:val="18"/>
+              </w:rPr>
+              <w:t>FE-18</w:t>
+            </w:r>
+          </w:p>
+        </w:tc>
+        <w:tc>
+          <w:tcPr>
+            <w:tcW w:w="3600" w:type="dxa"/>
+            <w:vAlign w:val="center"/>
+          </w:tcPr>
+          <w:p>
+            <w:pPr>
+              <w:spacing w:after="40"/>
+              <w:rPr>
+                <w:lang w:val="pt-BR"/>
+              </w:rPr>
+            </w:pPr>
+            <w:r>
+              <w:rPr>
+                <w:sz w:val="18"/>
+                <w:lang w:val="pt-BR"/>
+              </w:rPr>
+              <w:t>Consultar uma transação por ID</w:t>
+            </w:r>
+          </w:p>
+        </w:tc>
+        <w:tc>
+          <w:tcPr>
+            <w:tcW w:w="2232" w:type="dxa"/>
+            <w:vAlign w:val="center"/>
+          </w:tcPr>
+          <w:p>
+            <w:pPr>
+              <w:spacing w:after="40"/>
+              <w:rPr>
+                <w:lang w:val="pt-BR"/>
+              </w:rPr>
+            </w:pPr>
+          </w:p>
+        </w:tc>
+        <w:tc>
+          <w:tcPr>
+            <w:tcW w:w="1944" w:type="dxa"/>
+            <w:vAlign w:val="center"/>
+          </w:tcPr>
+          <w:p>
+            <w:pPr>
+              <w:spacing w:after="40"/>
+              <w:rPr>
+                <w:lang w:val="pt-BR"/>
+              </w:rPr>
+            </w:pPr>
+          </w:p>
+        </w:tc>
+        <w:tc>
+          <w:tcPr>
+            <w:tcW w:w="2088" w:type="dxa"/>
+            <w:vAlign w:val="center"/>
+          </w:tcPr>
+          <w:p>
+            <w:pPr>
+              <w:spacing w:after="40"/>
+              <w:rPr>
+                <w:lang w:val="pt-BR"/>
+              </w:rPr>
+            </w:pPr>
+          </w:p>
+        </w:tc>
+      </w:tr>
+      <w:tr>
+        <w:trPr>
+          <w:jc w:val="center"/>
+        </w:trPr>
+        <w:tc>
+          <w:tcPr>
+            <w:tcW w:w="1080" w:type="dxa"/>
+            <w:vAlign w:val="center"/>
+          </w:tcPr>
+          <w:p>
+            <w:pPr>
+              <w:spacing w:after="40"/>
+            </w:pPr>
+            <w:r>
+              <w:rPr>
+                <w:sz w:val="18"/>
+              </w:rPr>
+              <w:t>FE-19</w:t>
+            </w:r>
+          </w:p>
+        </w:tc>
+        <w:tc>
+          <w:tcPr>
+            <w:tcW w:w="3600" w:type="dxa"/>
+            <w:vAlign w:val="center"/>
+          </w:tcPr>
+          <w:p>
+            <w:pPr>
+              <w:spacing w:after="40"/>
+              <w:rPr>
+                <w:lang w:val="pt-BR"/>
+              </w:rPr>
+            </w:pPr>
+            <w:r>
+              <w:rPr>
+                <w:sz w:val="18"/>
+                <w:lang w:val="pt-BR"/>
+              </w:rPr>
+              <w:t>Verificar estado da tela sem transações para o filtro selecionado</w:t>
+            </w:r>
+          </w:p>
+        </w:tc>
+        <w:tc>
+          <w:tcPr>
+            <w:tcW w:w="2232" w:type="dxa"/>
+            <w:vAlign w:val="center"/>
+          </w:tcPr>
+          <w:p>
+            <w:pPr>
+              <w:spacing w:after="40"/>
+              <w:rPr>
+                <w:lang w:val="pt-BR"/>
+              </w:rPr>
+            </w:pPr>
+          </w:p>
+        </w:tc>
+        <w:tc>
+          <w:tcPr>
+            <w:tcW w:w="1944" w:type="dxa"/>
+            <w:vAlign w:val="center"/>
+          </w:tcPr>
+          <w:p>
+            <w:pPr>
+              <w:spacing w:after="40"/>
+              <w:rPr>
+                <w:lang w:val="pt-BR"/>
+              </w:rPr>
+            </w:pPr>
+          </w:p>
+        </w:tc>
+        <w:tc>
+          <w:tcPr>
+            <w:tcW w:w="2088" w:type="dxa"/>
+            <w:vAlign w:val="center"/>
+          </w:tcPr>
+          <w:p>
+            <w:pPr>
+              <w:spacing w:after="40"/>
+              <w:rPr>
+                <w:lang w:val="pt-BR"/>
+              </w:rPr>
+            </w:pPr>
+          </w:p>
+        </w:tc>
+      </w:tr>
+      <w:tr>
+        <w:trPr>
+          <w:jc w:val="center"/>
+        </w:trPr>
+        <w:tc>
+          <w:tcPr>
+            <w:tcW w:w="1080" w:type="dxa"/>
+            <w:vAlign w:val="center"/>
+          </w:tcPr>
+          <w:p>
+            <w:pPr>
+              <w:spacing w:after="40"/>
+            </w:pPr>
+            <w:r>
+              <w:rPr>
+                <w:sz w:val="18"/>
+              </w:rPr>
+              <w:t>FE-20</w:t>
+            </w:r>
+          </w:p>
+        </w:tc>
+        <w:tc>
+          <w:tcPr>
+            <w:tcW w:w="3600" w:type="dxa"/>
+            <w:vAlign w:val="center"/>
+          </w:tcPr>
+          <w:p>
+            <w:pPr>
+              <w:spacing w:after="40"/>
+              <w:rPr>
+                <w:lang w:val="pt-BR"/>
+              </w:rPr>
+            </w:pPr>
+            <w:r>
+              <w:rPr>
+                <w:sz w:val="18"/>
+                <w:lang w:val="pt-BR"/>
+              </w:rPr>
+              <w:t>Verificar carregamento e exibição dos dados após atualização da consulta</w:t>
+            </w:r>
+          </w:p>
+        </w:tc>
+        <w:tc>
+          <w:tcPr>
+            <w:tcW w:w="2232" w:type="dxa"/>
+            <w:vAlign w:val="center"/>
+          </w:tcPr>
+          <w:p>
+            <w:pPr>
+              <w:spacing w:after="40"/>
+              <w:rPr>
+                <w:lang w:val="pt-BR"/>
+              </w:rPr>
+            </w:pPr>
+          </w:p>
+        </w:tc>
+        <w:tc>
+          <w:tcPr>
+            <w:tcW w:w="1944" w:type="dxa"/>
+            <w:vAlign w:val="center"/>
+          </w:tcPr>
+          <w:p>
+            <w:pPr>
+              <w:spacing w:after="40"/>
+              <w:rPr>
+                <w:lang w:val="pt-BR"/>
+              </w:rPr>
+            </w:pPr>
+          </w:p>
+        </w:tc>
+        <w:tc>
+          <w:tcPr>
+            <w:tcW w:w="2088" w:type="dxa"/>
+            <w:vAlign w:val="center"/>
+          </w:tcPr>
+          <w:p>
+            <w:pPr>
+              <w:spacing w:after="40"/>
+              <w:rPr>
+                <w:lang w:val="pt-BR"/>
+              </w:rPr>
+            </w:pPr>
+          </w:p>
+        </w:tc>
+      </w:tr>
+      <w:tr>
+        <w:trPr>
+          <w:jc w:val="center"/>
+        </w:trPr>
+        <w:tc>
+          <w:tcPr>
+            <w:tcW w:w="1080" w:type="dxa"/>
+            <w:vAlign w:val="center"/>
+          </w:tcPr>
+          <w:p>
+            <w:pPr>
+              <w:spacing w:after="40"/>
+            </w:pPr>
+            <w:r>
+              <w:rPr>
+                <w:sz w:val="18"/>
+              </w:rPr>
+              <w:t>FE-21</w:t>
+            </w:r>
+          </w:p>
+        </w:tc>
+        <w:tc>
+          <w:tcPr>
+            <w:tcW w:w="3600" w:type="dxa"/>
+            <w:vAlign w:val="center"/>
+          </w:tcPr>
+          <w:p>
+            <w:pPr>
+              <w:spacing w:after="40"/>
+              <w:rPr>
+                <w:lang w:val="pt-BR"/>
+              </w:rPr>
+            </w:pPr>
+            <w:r>
+              <w:rPr>
+                <w:sz w:val="18"/>
+                <w:lang w:val="pt-BR"/>
+              </w:rPr>
+              <w:t>Verificar encerramento ou expiração da sessão</w:t>
+            </w:r>
+          </w:p>
+        </w:tc>
+        <w:tc>
+          <w:tcPr>
+            <w:tcW w:w="2232" w:type="dxa"/>
+            <w:vAlign w:val="center"/>
+          </w:tcPr>
+          <w:p>
+            <w:pPr>
+              <w:spacing w:after="40"/>
+              <w:rPr>
+                <w:lang w:val="pt-BR"/>
+              </w:rPr>
+            </w:pPr>
+          </w:p>
+        </w:tc>
+        <w:tc>
+          <w:tcPr>
+            <w:tcW w:w="1944" w:type="dxa"/>
+            <w:vAlign w:val="center"/>
+          </w:tcPr>
+          <w:p>
+            <w:pPr>
+              <w:spacing w:after="40"/>
+              <w:rPr>
+                <w:lang w:val="pt-BR"/>
+              </w:rPr>
+            </w:pPr>
+          </w:p>
+        </w:tc>
+        <w:tc>
+          <w:tcPr>
+            <w:tcW w:w="2088" w:type="dxa"/>
+            <w:vAlign w:val="center"/>
+          </w:tcPr>
+          <w:p>
+            <w:pPr>
+              <w:spacing w:after="40"/>
+              <w:rPr>
+                <w:lang w:val="pt-BR"/>
+              </w:rPr>
+            </w:pPr>
+          </w:p>
+        </w:tc>
+      </w:tr>
+      <w:tr>
+        <w:trPr>
+          <w:jc w:val="center"/>
+        </w:trPr>
+        <w:tc>
+          <w:tcPr>
+            <w:tcW w:w="1080" w:type="dxa"/>
+            <w:vAlign w:val="center"/>
+          </w:tcPr>
+          <w:p>
+            <w:pPr>
+              <w:spacing w:after="40"/>
+            </w:pPr>
+            <w:r>
+              <w:rPr>
+                <w:sz w:val="18"/>
+              </w:rPr>
+              <w:t>FE-22</w:t>
+            </w:r>
+          </w:p>
+        </w:tc>
+        <w:tc>
+          <w:tcPr>
+            <w:tcW w:w="3600" w:type="dxa"/>
+            <w:vAlign w:val="center"/>
+          </w:tcPr>
+          <w:p>
+            <w:pPr>
+              <w:spacing w:after="40"/>
+              <w:rPr>
+                <w:lang w:val="pt-BR"/>
+              </w:rPr>
+            </w:pPr>
+            <w:r>
+              <w:rPr>
+                <w:sz w:val="18"/>
+                <w:lang w:val="pt-BR"/>
+              </w:rPr>
+              <w:t>Verificar mensagens de erro e validação exibidas ao usuário</w:t>
+            </w:r>
+          </w:p>
+        </w:tc>
+        <w:tc>
+          <w:tcPr>
+            <w:tcW w:w="2232" w:type="dxa"/>
+            <w:vAlign w:val="center"/>
+          </w:tcPr>
+          <w:p>
+            <w:pPr>
+              <w:spacing w:after="40"/>
+              <w:rPr>
+                <w:lang w:val="pt-BR"/>
+              </w:rPr>
+            </w:pPr>
+          </w:p>
+        </w:tc>
+        <w:tc>
+          <w:tcPr>
+            <w:tcW w:w="1944" w:type="dxa"/>
+            <w:vAlign w:val="center"/>
+          </w:tcPr>
+          <w:p>
+            <w:pPr>
+              <w:spacing w:after="40"/>
+              <w:rPr>
+                <w:lang w:val="pt-BR"/>
+              </w:rPr>
+            </w:pPr>
+          </w:p>
+        </w:tc>
+        <w:tc>
+          <w:tcPr>
+            <w:tcW w:w="2088" w:type="dxa"/>
+            <w:vAlign w:val="center"/>
+          </w:tcPr>
+          <w:p>
+            <w:pPr>
+              <w:spacing w:after="40"/>
+              <w:rPr>
+                <w:lang w:val="pt-BR"/>
+              </w:rPr>
+            </w:pPr>
+          </w:p>
+        </w:tc>
+      </w:tr>
+    </w:tbl>
     <w:p>
       <w:pPr>
         <w:pStyle w:val="Ttulo1"/>
       </w:pPr>
       <w:proofErr w:type="spellStart"/>
       <w:r>
+        <w:lastRenderedPageBreak/>
         <w:t>Referências</w:t>
       </w:r>
       <w:proofErr w:type="spellEnd"/>
@@ -4998,6 +6790,12 @@
   </w:num>
   <w:num w:numId="9" w16cid:durableId="643317952">
     <w:abstractNumId w:val="0"/>
+  </w:num>
+  <w:num w:numId="10" w16cid:durableId="842940751">
+    <w:abstractNumId w:val="7"/>
+    <w:lvlOverride w:ilvl="0">
+      <w:startOverride w:val="3"/>
+    </w:lvlOverride>
   </w:num>
 </w:numbering>
 </file>
@@ -16710,7 +18508,12 @@
 </file>
 
 <file path=customXml/item1.xml><?xml version="1.0" encoding="utf-8"?>
-<b:Sources xmlns:b="http://schemas.openxmlformats.org/officeDocument/2006/bibliography" xmlns="http://schemas.openxmlformats.org/officeDocument/2006/bibliography" SelectedStyle="/APA.XSL" StyleName="APA"/>
+<?mso-contentType ?>
+<FormTemplates xmlns="http://schemas.microsoft.com/sharepoint/v3/contenttype/forms">
+  <Display>DocumentLibraryForm</Display>
+  <Edit>DocumentLibraryForm</Edit>
+  <New>DocumentLibraryForm</New>
+</FormTemplates>
 </file>
 
 <file path=customXml/item2.xml><?xml version="1.0" encoding="utf-8"?>
@@ -16896,12 +18699,7 @@
 </file>
 
 <file path=customXml/item3.xml><?xml version="1.0" encoding="utf-8"?>
-<?mso-contentType ?>
-<FormTemplates xmlns="http://schemas.microsoft.com/sharepoint/v3/contenttype/forms">
-  <Display>DocumentLibraryForm</Display>
-  <Edit>DocumentLibraryForm</Edit>
-  <New>DocumentLibraryForm</New>
-</FormTemplates>
+<b:Sources xmlns:b="http://schemas.openxmlformats.org/officeDocument/2006/bibliography" xmlns="http://schemas.openxmlformats.org/officeDocument/2006/bibliography" SelectedStyle="/APA.XSL" StyleName="APA"/>
 </file>
 
 <file path=customXml/item4.xml><?xml version="1.0" encoding="utf-8"?>
@@ -16913,9 +18711,9 @@
 </file>
 
 <file path=customXml/itemProps1.xml><?xml version="1.0" encoding="utf-8"?>
-<ds:datastoreItem xmlns:ds="http://schemas.openxmlformats.org/officeDocument/2006/customXml" ds:itemID="{EF278816-EC6F-A645-907D-7F25AECB1D4A}">
+<ds:datastoreItem xmlns:ds="http://schemas.openxmlformats.org/officeDocument/2006/customXml" ds:itemID="{3B3A98C9-8988-414E-91CD-0436DF0D92FA}">
   <ds:schemaRefs>
-    <ds:schemaRef ds:uri="http://schemas.openxmlformats.org/officeDocument/2006/bibliography"/>
+    <ds:schemaRef ds:uri="http://schemas.microsoft.com/sharepoint/v3/contenttype/forms"/>
   </ds:schemaRefs>
 </ds:datastoreItem>
 </file>
@@ -16939,9 +18737,9 @@
 </file>
 
 <file path=customXml/itemProps3.xml><?xml version="1.0" encoding="utf-8"?>
-<ds:datastoreItem xmlns:ds="http://schemas.openxmlformats.org/officeDocument/2006/customXml" ds:itemID="{3B3A98C9-8988-414E-91CD-0436DF0D92FA}">
+<ds:datastoreItem xmlns:ds="http://schemas.openxmlformats.org/officeDocument/2006/customXml" ds:itemID="{EF278816-EC6F-A645-907D-7F25AECB1D4A}">
   <ds:schemaRefs>
-    <ds:schemaRef ds:uri="http://schemas.microsoft.com/sharepoint/v3/contenttype/forms"/>
+    <ds:schemaRef ds:uri="http://schemas.openxmlformats.org/officeDocument/2006/bibliography"/>
   </ds:schemaRefs>
 </ds:datastoreItem>
 </file>

</xml_diff>

<commit_message>
🔧 chore: Atualizacao dos scripts e plano de teste
</commit_message>
<xml_diff>
--- a/PlanoDeTestes/Plano_De_Testes.docx
+++ b/PlanoDeTestes/Plano_De_Testes.docx
@@ -225,17 +225,23 @@
           </w:tcPr>
           <w:p>
             <w:pPr>
-              <w:spacing w:after="40"/>
-              <w:rPr>
-                <w:lang w:val="pt-BR"/>
-              </w:rPr>
-            </w:pPr>
-            <w:r>
-              <w:rPr>
-                <w:sz w:val="22"/>
-                <w:lang w:val="pt-BR"/>
-              </w:rPr>
-              <w:t>API: usuários, autenticação, sessão e transações</w:t>
+              <w:rPr>
+                <w:lang w:val="pt-BR"/>
+              </w:rPr>
+            </w:pPr>
+            <w:proofErr w:type="spellStart"/>
+            <w:r>
+              <w:rPr>
+                <w:lang w:val="pt-BR"/>
+              </w:rPr>
+              <w:t>Frontend</w:t>
+            </w:r>
+            <w:proofErr w:type="spellEnd"/>
+            <w:r>
+              <w:rPr>
+                <w:lang w:val="pt-BR"/>
+              </w:rPr>
+              <w:t xml:space="preserve"> e API: autenticação, usuários, sessão e transações</w:t>
             </w:r>
           </w:p>
         </w:tc>
@@ -349,12 +355,114 @@
           <w:p>
             <w:pPr>
               <w:spacing w:after="40"/>
-            </w:pPr>
-            <w:r>
-              <w:rPr>
+              <w:rPr>
+                <w:color w:val="17365D" w:themeColor="text2" w:themeShade="BF"/>
+                <w:lang w:val="pt-BR"/>
+              </w:rPr>
+            </w:pPr>
+            <w:r>
+              <w:rPr>
+                <w:color w:val="17365D" w:themeColor="text2" w:themeShade="BF"/>
                 <w:sz w:val="22"/>
-              </w:rPr>
-              <w:t>Grupo 1</w:t>
+                <w:lang w:val="pt-BR"/>
+              </w:rPr>
+              <w:t>Isaque</w:t>
+            </w:r>
+            <w:r>
+              <w:rPr>
+                <w:color w:val="17365D" w:themeColor="text2" w:themeShade="BF"/>
+                <w:sz w:val="22"/>
+                <w:lang w:val="pt-BR"/>
+              </w:rPr>
+              <w:t xml:space="preserve"> Sousa</w:t>
+            </w:r>
+            <w:r>
+              <w:rPr>
+                <w:color w:val="17365D" w:themeColor="text2" w:themeShade="BF"/>
+                <w:sz w:val="22"/>
+                <w:lang w:val="pt-BR"/>
+              </w:rPr>
+              <w:t>, Guilherme</w:t>
+            </w:r>
+            <w:r>
+              <w:rPr>
+                <w:color w:val="17365D" w:themeColor="text2" w:themeShade="BF"/>
+                <w:sz w:val="22"/>
+                <w:lang w:val="pt-BR"/>
+              </w:rPr>
+              <w:t xml:space="preserve"> Ribeiro</w:t>
+            </w:r>
+            <w:r>
+              <w:rPr>
+                <w:color w:val="17365D" w:themeColor="text2" w:themeShade="BF"/>
+                <w:sz w:val="22"/>
+                <w:lang w:val="pt-BR"/>
+              </w:rPr>
+              <w:t>, Caique</w:t>
+            </w:r>
+            <w:r>
+              <w:rPr>
+                <w:color w:val="17365D" w:themeColor="text2" w:themeShade="BF"/>
+                <w:sz w:val="22"/>
+                <w:lang w:val="pt-BR"/>
+              </w:rPr>
+              <w:t xml:space="preserve"> Lima</w:t>
+            </w:r>
+            <w:r>
+              <w:rPr>
+                <w:color w:val="17365D" w:themeColor="text2" w:themeShade="BF"/>
+                <w:sz w:val="22"/>
+                <w:lang w:val="pt-BR"/>
+              </w:rPr>
+              <w:t>, Allan</w:t>
+            </w:r>
+            <w:r>
+              <w:rPr>
+                <w:color w:val="17365D" w:themeColor="text2" w:themeShade="BF"/>
+                <w:sz w:val="22"/>
+                <w:lang w:val="pt-BR"/>
+              </w:rPr>
+              <w:t xml:space="preserve"> Barbosa</w:t>
+            </w:r>
+            <w:r>
+              <w:rPr>
+                <w:color w:val="17365D" w:themeColor="text2" w:themeShade="BF"/>
+                <w:sz w:val="22"/>
+                <w:lang w:val="pt-BR"/>
+              </w:rPr>
+              <w:t>, Pedro</w:t>
+            </w:r>
+            <w:r>
+              <w:rPr>
+                <w:color w:val="17365D" w:themeColor="text2" w:themeShade="BF"/>
+                <w:sz w:val="22"/>
+                <w:lang w:val="pt-BR"/>
+              </w:rPr>
+              <w:t xml:space="preserve"> </w:t>
+            </w:r>
+            <w:r>
+              <w:rPr>
+                <w:color w:val="17365D" w:themeColor="text2" w:themeShade="BF"/>
+                <w:sz w:val="22"/>
+                <w:lang w:val="pt-BR"/>
+              </w:rPr>
+              <w:t>Castro</w:t>
+            </w:r>
+            <w:r>
+              <w:rPr>
+                <w:color w:val="17365D" w:themeColor="text2" w:themeShade="BF"/>
+                <w:sz w:val="22"/>
+                <w:lang w:val="pt-BR"/>
+              </w:rPr>
+              <w:t>, Henrique</w:t>
+            </w:r>
+            <w:r>
+              <w:rPr>
+                <w:color w:val="17365D" w:themeColor="text2" w:themeShade="BF"/>
+                <w:sz w:val="22"/>
+                <w:lang w:val="pt-BR"/>
+              </w:rPr>
+              <w:t xml:space="preserve"> Botelho</w:t>
             </w:r>
           </w:p>
         </w:tc>
@@ -363,6 +471,9 @@
     <w:p>
       <w:pPr>
         <w:spacing w:after="160" w:line="269" w:lineRule="auto"/>
+        <w:rPr>
+          <w:lang w:val="pt-BR"/>
+        </w:rPr>
       </w:pPr>
     </w:p>
     <w:p>
@@ -376,25 +487,33 @@
         <w:rPr>
           <w:lang w:val="pt-BR"/>
         </w:rPr>
-        <w:t xml:space="preserve">Este documento descreve os testes funcionais previstos para a API. </w:t>
+        <w:t xml:space="preserve">Este documento descreve os testes funcionais previstos para o </w:t>
+      </w:r>
+      <w:proofErr w:type="spellStart"/>
+      <w:r>
+        <w:rPr>
+          <w:lang w:val="pt-BR"/>
+        </w:rPr>
+        <w:t>frontend</w:t>
+      </w:r>
+      <w:proofErr w:type="spellEnd"/>
+      <w:r>
+        <w:rPr>
+          <w:lang w:val="pt-BR"/>
+        </w:rPr>
+        <w:t xml:space="preserve"> e para a API. Seu objetivo é registrar o comportamento esperado e o </w:t>
       </w:r>
       <w:r>
         <w:rPr>
           <w:lang w:val="pt-BR"/>
         </w:rPr>
-        <w:t>Seu objetivo</w:t>
+        <w:t>o</w:t>
       </w:r>
       <w:r>
         <w:rPr>
           <w:lang w:val="pt-BR"/>
         </w:rPr>
-        <w:t xml:space="preserve"> é registrar o comportamento esperado e o comportamento observado durante a validação</w:t>
-      </w:r>
-      <w:r>
-        <w:rPr>
-          <w:lang w:val="pt-BR"/>
-        </w:rPr>
-        <w:t>.</w:t>
+        <w:t>bservado durante a validação.</w:t>
       </w:r>
     </w:p>
     <w:p>
@@ -411,20 +530,41 @@
       <w:pPr>
         <w:pStyle w:val="Numerada"/>
         <w:spacing w:before="360"/>
+        <w:rPr>
+          <w:color w:val="17365D" w:themeColor="text2" w:themeShade="BF"/>
+        </w:rPr>
       </w:pPr>
       <w:r>
-        <w:t xml:space="preserve">1. </w:t>
+        <w:rPr>
+          <w:color w:val="17365D" w:themeColor="text2" w:themeShade="BF"/>
+        </w:rPr>
+        <w:t xml:space="preserve"> </w:t>
+      </w:r>
+      <w:r>
+        <w:rPr>
+          <w:color w:val="17365D" w:themeColor="text2" w:themeShade="BF"/>
+        </w:rPr>
+        <w:t xml:space="preserve"> </w:t>
       </w:r>
       <w:proofErr w:type="spellStart"/>
       <w:r>
+        <w:rPr>
+          <w:color w:val="17365D" w:themeColor="text2" w:themeShade="BF"/>
+        </w:rPr>
         <w:t>Objetivo</w:t>
       </w:r>
       <w:proofErr w:type="spellEnd"/>
       <w:r>
+        <w:rPr>
+          <w:color w:val="17365D" w:themeColor="text2" w:themeShade="BF"/>
+        </w:rPr>
         <w:t xml:space="preserve"> e </w:t>
       </w:r>
       <w:proofErr w:type="spellStart"/>
       <w:r>
+        <w:rPr>
+          <w:color w:val="17365D" w:themeColor="text2" w:themeShade="BF"/>
+        </w:rPr>
         <w:t>escopo</w:t>
       </w:r>
       <w:proofErr w:type="spellEnd"/>
@@ -432,55 +572,124 @@
     <w:p>
       <w:pPr>
         <w:pStyle w:val="Numerada"/>
+        <w:numPr>
+          <w:ilvl w:val="0"/>
+          <w:numId w:val="0"/>
+        </w:numPr>
         <w:spacing w:before="360"/>
+        <w:rPr>
+          <w:color w:val="17365D" w:themeColor="text2" w:themeShade="BF"/>
+        </w:rPr>
       </w:pPr>
       <w:r>
+        <w:rPr>
+          <w:color w:val="17365D" w:themeColor="text2" w:themeShade="BF"/>
+        </w:rPr>
         <w:t xml:space="preserve">2. </w:t>
+      </w:r>
+      <w:r>
+        <w:rPr>
+          <w:color w:val="17365D" w:themeColor="text2" w:themeShade="BF"/>
+        </w:rPr>
+        <w:t xml:space="preserve">    </w:t>
       </w:r>
       <w:proofErr w:type="spellStart"/>
       <w:r>
+        <w:rPr>
+          <w:color w:val="17365D" w:themeColor="text2" w:themeShade="BF"/>
+        </w:rPr>
         <w:t>Estratégia</w:t>
       </w:r>
       <w:proofErr w:type="spellEnd"/>
       <w:r>
+        <w:rPr>
+          <w:color w:val="17365D" w:themeColor="text2" w:themeShade="BF"/>
+        </w:rPr>
         <w:t xml:space="preserve"> de testes</w:t>
       </w:r>
     </w:p>
     <w:p>
       <w:pPr>
         <w:pStyle w:val="Numerada"/>
+        <w:numPr>
+          <w:ilvl w:val="0"/>
+          <w:numId w:val="10"/>
+        </w:numPr>
         <w:spacing w:before="360"/>
+        <w:rPr>
+          <w:color w:val="17365D" w:themeColor="text2" w:themeShade="BF"/>
+        </w:rPr>
       </w:pPr>
       <w:r>
-        <w:t xml:space="preserve">3. </w:t>
+        <w:rPr>
+          <w:color w:val="17365D" w:themeColor="text2" w:themeShade="BF"/>
+        </w:rPr>
+        <w:t xml:space="preserve">  </w:t>
       </w:r>
       <w:proofErr w:type="spellStart"/>
       <w:r>
+        <w:rPr>
+          <w:color w:val="17365D" w:themeColor="text2" w:themeShade="BF"/>
+        </w:rPr>
         <w:t>Ambiente</w:t>
       </w:r>
       <w:proofErr w:type="spellEnd"/>
       <w:r>
+        <w:rPr>
+          <w:color w:val="17365D" w:themeColor="text2" w:themeShade="BF"/>
+        </w:rPr>
         <w:t xml:space="preserve"> e dados</w:t>
       </w:r>
     </w:p>
     <w:p>
       <w:pPr>
         <w:pStyle w:val="Numerada"/>
+        <w:numPr>
+          <w:ilvl w:val="0"/>
+          <w:numId w:val="0"/>
+        </w:numPr>
         <w:spacing w:before="360"/>
+        <w:rPr>
+          <w:color w:val="17365D" w:themeColor="text2" w:themeShade="BF"/>
+        </w:rPr>
       </w:pPr>
       <w:r>
-        <w:t xml:space="preserve">4. </w:t>
+        <w:rPr>
+          <w:color w:val="17365D" w:themeColor="text2" w:themeShade="BF"/>
+        </w:rPr>
+        <w:t>4.</w:t>
+      </w:r>
+      <w:r>
+        <w:rPr>
+          <w:color w:val="17365D" w:themeColor="text2" w:themeShade="BF"/>
+        </w:rPr>
+        <w:t xml:space="preserve"> </w:t>
+      </w:r>
+      <w:r>
+        <w:rPr>
+          <w:color w:val="17365D" w:themeColor="text2" w:themeShade="BF"/>
+        </w:rPr>
+        <w:t xml:space="preserve">    </w:t>
       </w:r>
       <w:proofErr w:type="spellStart"/>
       <w:r>
+        <w:rPr>
+          <w:color w:val="17365D" w:themeColor="text2" w:themeShade="BF"/>
+        </w:rPr>
         <w:t>Critérios</w:t>
       </w:r>
       <w:proofErr w:type="spellEnd"/>
       <w:r>
+        <w:rPr>
+          <w:color w:val="17365D" w:themeColor="text2" w:themeShade="BF"/>
+        </w:rPr>
         <w:t xml:space="preserve"> de </w:t>
       </w:r>
       <w:proofErr w:type="spellStart"/>
       <w:r>
+        <w:rPr>
+          <w:color w:val="17365D" w:themeColor="text2" w:themeShade="BF"/>
+        </w:rPr>
         <w:t>execução</w:t>
       </w:r>
       <w:proofErr w:type="spellEnd"/>
@@ -488,15 +697,45 @@
     <w:p>
       <w:pPr>
         <w:pStyle w:val="Numerada"/>
+        <w:numPr>
+          <w:ilvl w:val="0"/>
+          <w:numId w:val="0"/>
+        </w:numPr>
         <w:spacing w:before="360"/>
+        <w:ind w:left="360" w:hanging="360"/>
+        <w:rPr>
+          <w:color w:val="17365D" w:themeColor="text2" w:themeShade="BF"/>
+          <w:lang w:val="pt-BR"/>
+        </w:rPr>
       </w:pPr>
       <w:r>
-        <w:t>5. Casos de teste</w:t>
+        <w:rPr>
+          <w:color w:val="17365D" w:themeColor="text2" w:themeShade="BF"/>
+          <w:lang w:val="pt-BR"/>
+        </w:rPr>
+        <w:t xml:space="preserve">5. </w:t>
+      </w:r>
+      <w:r>
+        <w:rPr>
+          <w:color w:val="17365D" w:themeColor="text2" w:themeShade="BF"/>
+          <w:lang w:val="pt-BR"/>
+        </w:rPr>
+        <w:t xml:space="preserve">    </w:t>
+      </w:r>
+      <w:r>
+        <w:rPr>
+          <w:color w:val="17365D" w:themeColor="text2" w:themeShade="BF"/>
+          <w:lang w:val="pt-BR"/>
+        </w:rPr>
+        <w:t>Casos de teste</w:t>
       </w:r>
     </w:p>
     <w:p>
       <w:pPr>
         <w:spacing w:after="160" w:line="269" w:lineRule="auto"/>
+        <w:rPr>
+          <w:lang w:val="pt-BR"/>
+        </w:rPr>
       </w:pPr>
     </w:p>
     <w:p>
@@ -524,19 +763,7 @@
         <w:rPr>
           <w:lang w:val="pt-BR"/>
         </w:rPr>
-        <w:t>O</w:t>
-      </w:r>
-      <w:r>
-        <w:rPr>
-          <w:lang w:val="pt-BR"/>
-        </w:rPr>
-        <w:t xml:space="preserve"> objetivo é verificar se os</w:t>
-      </w:r>
-      <w:r>
-        <w:rPr>
-          <w:lang w:val="pt-BR"/>
-        </w:rPr>
-        <w:t xml:space="preserve"> </w:t>
+        <w:t xml:space="preserve">O objetivo é verificar se os </w:t>
       </w:r>
       <w:proofErr w:type="spellStart"/>
       <w:r>
@@ -550,13 +777,7 @@
         <w:rPr>
           <w:lang w:val="pt-BR"/>
         </w:rPr>
-        <w:t xml:space="preserve"> da API validam entradas, autenticam usuários e retornam somente os dados compatíveis com a sessão do usuário. O plano cobre testes funcionais de usuários, autenticação JWT</w:t>
-      </w:r>
-      <w:r>
-        <w:rPr>
-          <w:lang w:val="pt-BR"/>
-        </w:rPr>
-        <w:t xml:space="preserve"> e consultas de transações.</w:t>
+        <w:t xml:space="preserve"> da API validam entradas, autenticam usuários e retornam somente os dados compatíveis com a sessão do usuário. O plano cobre testes funcionais de usuários, autenticação JWT e consultas de transações.</w:t>
       </w:r>
     </w:p>
     <w:p>
@@ -570,43 +791,21 @@
         <w:rPr>
           <w:lang w:val="pt-BR"/>
         </w:rPr>
-        <w:t>O escopo</w:t>
+        <w:t xml:space="preserve">O escopo da versão atual inclui testes funcionais do </w:t>
       </w:r>
+      <w:proofErr w:type="spellStart"/>
       <w:r>
         <w:rPr>
           <w:lang w:val="pt-BR"/>
         </w:rPr>
-        <w:t xml:space="preserve"> da versão atual do plano de testes</w:t>
+        <w:t>frontend</w:t>
       </w:r>
+      <w:proofErr w:type="spellEnd"/>
       <w:r>
         <w:rPr>
           <w:lang w:val="pt-BR"/>
         </w:rPr>
-        <w:t xml:space="preserve"> não inclui testes de interface, desempenho, segurança ofensiva</w:t>
-      </w:r>
-      <w:r>
-        <w:rPr>
-          <w:lang w:val="pt-BR"/>
-        </w:rPr>
-        <w:t xml:space="preserve"> ou </w:t>
-      </w:r>
-      <w:r>
-        <w:rPr>
-          <w:lang w:val="pt-BR"/>
-        </w:rPr>
-        <w:t xml:space="preserve">compatibilidade entre </w:t>
-      </w:r>
-      <w:r>
-        <w:rPr>
-          <w:lang w:val="pt-BR"/>
-        </w:rPr>
-        <w:t>plataformas</w:t>
-      </w:r>
-      <w:r>
-        <w:rPr>
-          <w:lang w:val="pt-BR"/>
-        </w:rPr>
-        <w:t>.</w:t>
+        <w:t xml:space="preserve"> e da API. Não inclui testes de desempenho, segurança ofensiva ou compatibilidade entre plataformas.</w:t>
       </w:r>
     </w:p>
     <w:p>
@@ -915,7 +1114,21 @@
                 <w:sz w:val="22"/>
                 <w:lang w:val="pt-BR"/>
               </w:rPr>
-              <w:t>Reexecutar os casos após correções, especialmente duplicidade de NIF e criação sem nome.</w:t>
+              <w:t xml:space="preserve">Reexecutar os casos após correções, especialmente duplicidade de </w:t>
+            </w:r>
+            <w:r>
+              <w:rPr>
+                <w:sz w:val="22"/>
+                <w:lang w:val="pt-BR"/>
+              </w:rPr>
+              <w:t>e-mail</w:t>
+            </w:r>
+            <w:r>
+              <w:rPr>
+                <w:sz w:val="22"/>
+                <w:lang w:val="pt-BR"/>
+              </w:rPr>
+              <w:t xml:space="preserve"> e criação sem nome.</w:t>
             </w:r>
           </w:p>
         </w:tc>
@@ -1342,7 +1555,19 @@
         <w:rPr>
           <w:lang w:val="pt-BR"/>
         </w:rPr>
-        <w:t xml:space="preserve">Os valores exatos de URL, portas, nomes de rotas e esquema do banco não foram informados no material recebido. Por isso, os casos usam a identificação funcional do </w:t>
+        <w:t xml:space="preserve">Os valores exatos de URL, portas, nomes de rotas e esquema do banco não </w:t>
+      </w:r>
+      <w:r>
+        <w:rPr>
+          <w:lang w:val="pt-BR"/>
+        </w:rPr>
+        <w:t>estão</w:t>
+      </w:r>
+      <w:r>
+        <w:rPr>
+          <w:lang w:val="pt-BR"/>
+        </w:rPr>
+        <w:t xml:space="preserve"> informados no material. Por isso, os casos usam a identificação funcional do </w:t>
       </w:r>
       <w:proofErr w:type="spellStart"/>
       <w:r>
@@ -1430,26 +1655,11 @@
           <w:lang w:val="pt-BR"/>
         </w:rPr>
       </w:pPr>
-    </w:p>
-    <w:p>
-      <w:pPr>
-        <w:pStyle w:val="Ttulo2"/>
-        <w:rPr>
-          <w:lang w:val="pt-BR"/>
-        </w:rPr>
-      </w:pPr>
-    </w:p>
-    <w:p>
-      <w:pPr>
-        <w:pStyle w:val="Ttulo2"/>
-        <w:rPr>
-          <w:lang w:val="pt-BR"/>
-        </w:rPr>
-      </w:pPr>
       <w:r>
         <w:rPr>
           <w:lang w:val="pt-BR"/>
         </w:rPr>
+        <w:lastRenderedPageBreak/>
         <w:t xml:space="preserve">5.1 Usuários — </w:t>
       </w:r>
       <w:r>
@@ -1548,28 +1758,53 @@
             <w:pPr>
               <w:spacing w:after="40"/>
             </w:pPr>
+            <w:proofErr w:type="spellStart"/>
             <w:r>
               <w:rPr>
                 <w:sz w:val="20"/>
               </w:rPr>
-              <w:t>Resultado observado</w:t>
-            </w:r>
+              <w:t>Resultado</w:t>
+            </w:r>
+            <w:proofErr w:type="spellEnd"/>
+            <w:r>
+              <w:rPr>
+                <w:sz w:val="20"/>
+              </w:rPr>
+              <w:t xml:space="preserve"> </w:t>
+            </w:r>
+            <w:proofErr w:type="spellStart"/>
+            <w:r>
+              <w:rPr>
+                <w:sz w:val="20"/>
+              </w:rPr>
+              <w:t>observado</w:t>
+            </w:r>
+            <w:proofErr w:type="spellEnd"/>
           </w:p>
         </w:tc>
         <w:tc>
           <w:tcPr>
             <w:tcW w:w="1944" w:type="dxa"/>
-            <w:vAlign w:val="center"/>
-          </w:tcPr>
-          <w:p>
-            <w:pPr>
-              <w:spacing w:after="40"/>
-            </w:pPr>
+            <w:shd w:val="clear" w:color="auto" w:fill="17365D" w:themeFill="text2" w:themeFillShade="BF"/>
+            <w:vAlign w:val="center"/>
+          </w:tcPr>
+          <w:p>
+            <w:pPr>
+              <w:spacing w:after="40"/>
+            </w:pPr>
+            <w:proofErr w:type="spellStart"/>
             <w:r>
               <w:rPr>
                 <w:sz w:val="20"/>
               </w:rPr>
-              <w:t>Observação do material</w:t>
+              <w:t>Observação</w:t>
+            </w:r>
+            <w:proofErr w:type="spellEnd"/>
+            <w:r>
+              <w:rPr>
+                <w:sz w:val="20"/>
+              </w:rPr>
+              <w:t xml:space="preserve"> do material</w:t>
             </w:r>
           </w:p>
         </w:tc>
@@ -2252,7 +2487,7 @@
               <w:rPr>
                 <w:sz w:val="20"/>
               </w:rPr>
-              <w:t>Criar usuário sem NIF</w:t>
+              <w:t>Criar usuário sem senha</w:t>
             </w:r>
           </w:p>
         </w:tc>
@@ -2280,14 +2515,14 @@
                 <w:sz w:val="20"/>
                 <w:lang w:val="pt-BR"/>
               </w:rPr>
-              <w:t xml:space="preserve">EX: </w:t>
+              <w:t>EX: A senha é obrigatória</w:t>
             </w:r>
             <w:r>
               <w:rPr>
                 <w:sz w:val="20"/>
                 <w:lang w:val="pt-BR"/>
               </w:rPr>
-              <w:t>O NIF é obrigatório.</w:t>
+              <w:t>.</w:t>
             </w:r>
           </w:p>
         </w:tc>
@@ -2318,10 +2553,6 @@
           <w:p>
             <w:pPr>
               <w:spacing w:after="40"/>
-              <w:rPr>
-                <w:sz w:val="20"/>
-                <w:lang w:val="pt-BR"/>
-              </w:rPr>
             </w:pPr>
             <w:r>
               <w:rPr>
@@ -2350,382 +2581,19 @@
               <w:rPr>
                 <w:sz w:val="20"/>
               </w:rPr>
-              <w:t>USR-0</w:t>
+              <w:t>USR-</w:t>
             </w:r>
             <w:r>
               <w:rPr>
                 <w:sz w:val="20"/>
               </w:rPr>
+              <w:t>0</w:t>
+            </w:r>
+            <w:r>
+              <w:rPr>
+                <w:sz w:val="20"/>
+              </w:rPr>
               <w:t>7</w:t>
-            </w:r>
-          </w:p>
-        </w:tc>
-        <w:tc>
-          <w:tcPr>
-            <w:tcW w:w="2232" w:type="dxa"/>
-            <w:vAlign w:val="center"/>
-          </w:tcPr>
-          <w:p>
-            <w:pPr>
-              <w:spacing w:after="40"/>
-              <w:rPr>
-                <w:lang w:val="pt-BR"/>
-              </w:rPr>
-            </w:pPr>
-            <w:r>
-              <w:rPr>
-                <w:sz w:val="20"/>
-                <w:lang w:val="pt-BR"/>
-              </w:rPr>
-              <w:t>Criar usuário com NIF duplicado</w:t>
-            </w:r>
-          </w:p>
-        </w:tc>
-        <w:tc>
-          <w:tcPr>
-            <w:tcW w:w="4176" w:type="dxa"/>
-            <w:vAlign w:val="center"/>
-          </w:tcPr>
-          <w:p>
-            <w:pPr>
-              <w:spacing w:after="40"/>
-              <w:rPr>
-                <w:lang w:val="pt-BR"/>
-              </w:rPr>
-            </w:pPr>
-            <w:r>
-              <w:rPr>
-                <w:sz w:val="20"/>
-                <w:lang w:val="pt-BR"/>
-              </w:rPr>
-              <w:t xml:space="preserve">HTTP 400; </w:t>
-            </w:r>
-            <w:r>
-              <w:rPr>
-                <w:sz w:val="20"/>
-                <w:lang w:val="pt-BR"/>
-              </w:rPr>
-              <w:t xml:space="preserve">EX: </w:t>
-            </w:r>
-            <w:r>
-              <w:rPr>
-                <w:sz w:val="20"/>
-                <w:lang w:val="pt-BR"/>
-              </w:rPr>
-              <w:t>NIF já existente.</w:t>
-            </w:r>
-          </w:p>
-        </w:tc>
-        <w:tc>
-          <w:tcPr>
-            <w:tcW w:w="1512" w:type="dxa"/>
-            <w:vAlign w:val="center"/>
-          </w:tcPr>
-          <w:p>
-            <w:pPr>
-              <w:spacing w:after="40"/>
-            </w:pPr>
-            <w:proofErr w:type="spellStart"/>
-            <w:r>
-              <w:rPr>
-                <w:sz w:val="20"/>
-              </w:rPr>
-              <w:t>Aprovado</w:t>
-            </w:r>
-            <w:proofErr w:type="spellEnd"/>
-          </w:p>
-        </w:tc>
-        <w:tc>
-          <w:tcPr>
-            <w:tcW w:w="1944" w:type="dxa"/>
-            <w:vAlign w:val="center"/>
-          </w:tcPr>
-          <w:p>
-            <w:pPr>
-              <w:spacing w:after="40"/>
-              <w:rPr>
-                <w:lang w:val="pt-BR"/>
-              </w:rPr>
-            </w:pPr>
-            <w:r>
-              <w:rPr>
-                <w:sz w:val="20"/>
-                <w:lang w:val="pt-BR"/>
-              </w:rPr>
-              <w:t>Em conformidade.</w:t>
-            </w:r>
-          </w:p>
-        </w:tc>
-      </w:tr>
-      <w:tr>
-        <w:trPr>
-          <w:jc w:val="center"/>
-        </w:trPr>
-        <w:tc>
-          <w:tcPr>
-            <w:tcW w:w="936" w:type="dxa"/>
-            <w:vAlign w:val="center"/>
-          </w:tcPr>
-          <w:p>
-            <w:pPr>
-              <w:spacing w:after="40"/>
-            </w:pPr>
-            <w:r>
-              <w:rPr>
-                <w:sz w:val="20"/>
-              </w:rPr>
-              <w:t>USR-0</w:t>
-            </w:r>
-            <w:r>
-              <w:rPr>
-                <w:sz w:val="20"/>
-              </w:rPr>
-              <w:t>8</w:t>
-            </w:r>
-          </w:p>
-        </w:tc>
-        <w:tc>
-          <w:tcPr>
-            <w:tcW w:w="2232" w:type="dxa"/>
-            <w:vAlign w:val="center"/>
-          </w:tcPr>
-          <w:p>
-            <w:pPr>
-              <w:spacing w:after="40"/>
-            </w:pPr>
-            <w:r>
-              <w:rPr>
-                <w:sz w:val="20"/>
-                <w:lang w:val="pt-BR"/>
-              </w:rPr>
-              <w:t>Criar usuário com NIF fora do formato</w:t>
-            </w:r>
-          </w:p>
-        </w:tc>
-        <w:tc>
-          <w:tcPr>
-            <w:tcW w:w="4176" w:type="dxa"/>
-            <w:vAlign w:val="center"/>
-          </w:tcPr>
-          <w:p>
-            <w:pPr>
-              <w:spacing w:after="40"/>
-              <w:rPr>
-                <w:lang w:val="pt-BR"/>
-              </w:rPr>
-            </w:pPr>
-            <w:r>
-              <w:rPr>
-                <w:sz w:val="20"/>
-                <w:lang w:val="pt-BR"/>
-              </w:rPr>
-              <w:t xml:space="preserve">HTTP 400; </w:t>
-            </w:r>
-            <w:r>
-              <w:rPr>
-                <w:sz w:val="20"/>
-                <w:lang w:val="pt-BR"/>
-              </w:rPr>
-              <w:t xml:space="preserve">EX: </w:t>
-            </w:r>
-            <w:r>
-              <w:rPr>
-                <w:sz w:val="20"/>
-                <w:lang w:val="pt-BR"/>
-              </w:rPr>
-              <w:t>Insira um N</w:t>
-            </w:r>
-            <w:r>
-              <w:rPr>
-                <w:sz w:val="20"/>
-                <w:lang w:val="pt-BR"/>
-              </w:rPr>
-              <w:t>IF válido.</w:t>
-            </w:r>
-          </w:p>
-        </w:tc>
-        <w:tc>
-          <w:tcPr>
-            <w:tcW w:w="1512" w:type="dxa"/>
-            <w:vAlign w:val="center"/>
-          </w:tcPr>
-          <w:p>
-            <w:pPr>
-              <w:spacing w:after="40"/>
-            </w:pPr>
-            <w:proofErr w:type="spellStart"/>
-            <w:r>
-              <w:rPr>
-                <w:sz w:val="20"/>
-              </w:rPr>
-              <w:t>Aprovado</w:t>
-            </w:r>
-            <w:proofErr w:type="spellEnd"/>
-          </w:p>
-        </w:tc>
-        <w:tc>
-          <w:tcPr>
-            <w:tcW w:w="1944" w:type="dxa"/>
-            <w:vAlign w:val="center"/>
-          </w:tcPr>
-          <w:p>
-            <w:pPr>
-              <w:spacing w:after="40"/>
-              <w:rPr>
-                <w:lang w:val="pt-BR"/>
-              </w:rPr>
-            </w:pPr>
-            <w:r>
-              <w:rPr>
-                <w:sz w:val="20"/>
-                <w:lang w:val="pt-BR"/>
-              </w:rPr>
-              <w:t>Em conformidade.</w:t>
-            </w:r>
-          </w:p>
-        </w:tc>
-      </w:tr>
-      <w:tr>
-        <w:trPr>
-          <w:jc w:val="center"/>
-        </w:trPr>
-        <w:tc>
-          <w:tcPr>
-            <w:tcW w:w="936" w:type="dxa"/>
-            <w:vAlign w:val="center"/>
-          </w:tcPr>
-          <w:p>
-            <w:pPr>
-              <w:spacing w:after="40"/>
-            </w:pPr>
-            <w:r>
-              <w:rPr>
-                <w:sz w:val="20"/>
-              </w:rPr>
-              <w:t>USR-0</w:t>
-            </w:r>
-            <w:r>
-              <w:rPr>
-                <w:sz w:val="20"/>
-              </w:rPr>
-              <w:t>9</w:t>
-            </w:r>
-          </w:p>
-        </w:tc>
-        <w:tc>
-          <w:tcPr>
-            <w:tcW w:w="2232" w:type="dxa"/>
-            <w:vAlign w:val="center"/>
-          </w:tcPr>
-          <w:p>
-            <w:pPr>
-              <w:spacing w:after="40"/>
-            </w:pPr>
-            <w:r>
-              <w:rPr>
-                <w:sz w:val="20"/>
-              </w:rPr>
-              <w:t>Criar usuário sem senha</w:t>
-            </w:r>
-          </w:p>
-        </w:tc>
-        <w:tc>
-          <w:tcPr>
-            <w:tcW w:w="4176" w:type="dxa"/>
-            <w:vAlign w:val="center"/>
-          </w:tcPr>
-          <w:p>
-            <w:pPr>
-              <w:spacing w:after="40"/>
-              <w:rPr>
-                <w:lang w:val="pt-BR"/>
-              </w:rPr>
-            </w:pPr>
-            <w:r>
-              <w:rPr>
-                <w:sz w:val="20"/>
-                <w:lang w:val="pt-BR"/>
-              </w:rPr>
-              <w:t xml:space="preserve">HTTP 400; </w:t>
-            </w:r>
-            <w:r>
-              <w:rPr>
-                <w:sz w:val="20"/>
-                <w:lang w:val="pt-BR"/>
-              </w:rPr>
-              <w:t>EX: A senha é obrigatória</w:t>
-            </w:r>
-            <w:r>
-              <w:rPr>
-                <w:sz w:val="20"/>
-                <w:lang w:val="pt-BR"/>
-              </w:rPr>
-              <w:t>.</w:t>
-            </w:r>
-          </w:p>
-        </w:tc>
-        <w:tc>
-          <w:tcPr>
-            <w:tcW w:w="1512" w:type="dxa"/>
-            <w:vAlign w:val="center"/>
-          </w:tcPr>
-          <w:p>
-            <w:pPr>
-              <w:spacing w:after="40"/>
-            </w:pPr>
-            <w:proofErr w:type="spellStart"/>
-            <w:r>
-              <w:rPr>
-                <w:sz w:val="20"/>
-              </w:rPr>
-              <w:t>Aprovado</w:t>
-            </w:r>
-            <w:proofErr w:type="spellEnd"/>
-          </w:p>
-        </w:tc>
-        <w:tc>
-          <w:tcPr>
-            <w:tcW w:w="1944" w:type="dxa"/>
-            <w:vAlign w:val="center"/>
-          </w:tcPr>
-          <w:p>
-            <w:pPr>
-              <w:spacing w:after="40"/>
-            </w:pPr>
-            <w:r>
-              <w:rPr>
-                <w:sz w:val="20"/>
-                <w:lang w:val="pt-BR"/>
-              </w:rPr>
-              <w:t>Em conformidade.</w:t>
-            </w:r>
-          </w:p>
-        </w:tc>
-      </w:tr>
-      <w:tr>
-        <w:trPr>
-          <w:jc w:val="center"/>
-        </w:trPr>
-        <w:tc>
-          <w:tcPr>
-            <w:tcW w:w="936" w:type="dxa"/>
-            <w:vAlign w:val="center"/>
-          </w:tcPr>
-          <w:p>
-            <w:pPr>
-              <w:spacing w:after="40"/>
-            </w:pPr>
-            <w:r>
-              <w:rPr>
-                <w:sz w:val="20"/>
-              </w:rPr>
-              <w:t>USR-</w:t>
-            </w:r>
-            <w:r>
-              <w:rPr>
-                <w:sz w:val="20"/>
-              </w:rPr>
-              <w:t>10</w:t>
             </w:r>
           </w:p>
         </w:tc>
@@ -2961,6 +2829,7 @@
         <w:tc>
           <w:tcPr>
             <w:tcW w:w="1944" w:type="dxa"/>
+            <w:shd w:val="clear" w:color="auto" w:fill="17365D" w:themeFill="text2" w:themeFillShade="BF"/>
             <w:vAlign w:val="center"/>
           </w:tcPr>
           <w:p>
@@ -2993,7 +2862,13 @@
               <w:rPr>
                 <w:sz w:val="20"/>
               </w:rPr>
-              <w:t>USR-10</w:t>
+              <w:t>USR-</w:t>
+            </w:r>
+            <w:r>
+              <w:rPr>
+                <w:sz w:val="20"/>
+              </w:rPr>
+              <w:t>8</w:t>
             </w:r>
           </w:p>
         </w:tc>
@@ -3127,7 +3002,13 @@
               <w:rPr>
                 <w:sz w:val="20"/>
               </w:rPr>
-              <w:t>USR-11</w:t>
+              <w:t>USR-</w:t>
+            </w:r>
+            <w:r>
+              <w:rPr>
+                <w:sz w:val="20"/>
+              </w:rPr>
+              <w:t>9</w:t>
             </w:r>
           </w:p>
         </w:tc>
@@ -3355,6 +3236,7 @@
         <w:tc>
           <w:tcPr>
             <w:tcW w:w="1944" w:type="dxa"/>
+            <w:shd w:val="clear" w:color="auto" w:fill="17365D" w:themeFill="text2" w:themeFillShade="BF"/>
             <w:vAlign w:val="center"/>
           </w:tcPr>
           <w:p>
@@ -3604,19 +3486,7 @@
         </w:tc>
       </w:tr>
     </w:tbl>
-    <w:p>
-      <w:pPr>
-        <w:spacing w:after="160" w:line="269" w:lineRule="auto"/>
-        <w:rPr>
-          <w:lang w:val="pt-BR"/>
-        </w:rPr>
-      </w:pPr>
-    </w:p>
-    <w:p>
-      <w:pPr>
-        <w:pStyle w:val="Ttulo2"/>
-      </w:pPr>
-    </w:p>
+    <w:p/>
     <w:p>
       <w:pPr>
         <w:pStyle w:val="Ttulo2"/>
@@ -3755,6 +3625,7 @@
         <w:tc>
           <w:tcPr>
             <w:tcW w:w="1944" w:type="dxa"/>
+            <w:shd w:val="clear" w:color="auto" w:fill="17365D" w:themeFill="text2" w:themeFillShade="BF"/>
             <w:vAlign w:val="center"/>
           </w:tcPr>
           <w:p>
@@ -4166,6 +4037,7 @@
               <w:rPr>
                 <w:sz w:val="20"/>
               </w:rPr>
+              <w:lastRenderedPageBreak/>
               <w:t>TRX-04</w:t>
             </w:r>
           </w:p>
@@ -4647,14 +4519,6 @@
         </w:tc>
       </w:tr>
     </w:tbl>
-    <w:p>
-      <w:pPr>
-        <w:pStyle w:val="Ttulo1"/>
-        <w:rPr>
-          <w:lang w:val="pt-BR"/>
-        </w:rPr>
-      </w:pPr>
-    </w:p>
     <w:p>
       <w:pPr>
         <w:rPr>
@@ -4671,24 +4535,1952 @@
     </w:p>
     <w:p>
       <w:pPr>
+        <w:pStyle w:val="Ttulo2"/>
+        <w:spacing w:before="360" w:after="200"/>
         <w:rPr>
           <w:lang w:val="pt-BR"/>
         </w:rPr>
       </w:pPr>
-    </w:p>
-    <w:p>
-      <w:pPr>
+      <w:r>
         <w:rPr>
           <w:lang w:val="pt-BR"/>
         </w:rPr>
-      </w:pPr>
+        <w:t xml:space="preserve">5.5 </w:t>
+      </w:r>
+      <w:proofErr w:type="spellStart"/>
+      <w:r>
+        <w:rPr>
+          <w:lang w:val="pt-BR"/>
+        </w:rPr>
+        <w:t>Frontend</w:t>
+      </w:r>
+      <w:proofErr w:type="spellEnd"/>
+      <w:r>
+        <w:rPr>
+          <w:lang w:val="pt-BR"/>
+        </w:rPr>
+        <w:t xml:space="preserve"> — </w:t>
+      </w:r>
+      <w:r>
+        <w:rPr>
+          <w:lang w:val="pt-BR"/>
+        </w:rPr>
+        <w:t>TESTES DA APLICAÇÃO FINAL</w:t>
+      </w:r>
     </w:p>
+    <w:tbl>
+      <w:tblPr>
+        <w:tblStyle w:val="Tabelacomgrade"/>
+        <w:tblW w:w="10944" w:type="dxa"/>
+        <w:jc w:val="center"/>
+        <w:tblLayout w:type="fixed"/>
+        <w:tblLook w:val="04A0" w:firstRow="1" w:lastRow="0" w:firstColumn="1" w:lastColumn="0" w:noHBand="0" w:noVBand="1"/>
+      </w:tblPr>
+      <w:tblGrid>
+        <w:gridCol w:w="1080"/>
+        <w:gridCol w:w="3600"/>
+        <w:gridCol w:w="2232"/>
+        <w:gridCol w:w="1944"/>
+        <w:gridCol w:w="2088"/>
+      </w:tblGrid>
+      <w:tr>
+        <w:trPr>
+          <w:jc w:val="center"/>
+        </w:trPr>
+        <w:tc>
+          <w:tcPr>
+            <w:tcW w:w="1080" w:type="dxa"/>
+            <w:shd w:val="clear" w:color="auto" w:fill="17365D"/>
+            <w:vAlign w:val="center"/>
+          </w:tcPr>
+          <w:p>
+            <w:pPr>
+              <w:spacing w:after="40"/>
+            </w:pPr>
+            <w:r>
+              <w:rPr>
+                <w:b/>
+                <w:color w:val="FFFFFF"/>
+                <w:sz w:val="18"/>
+              </w:rPr>
+              <w:t>ID</w:t>
+            </w:r>
+          </w:p>
+        </w:tc>
+        <w:tc>
+          <w:tcPr>
+            <w:tcW w:w="3600" w:type="dxa"/>
+            <w:shd w:val="clear" w:color="auto" w:fill="17365D"/>
+            <w:vAlign w:val="center"/>
+          </w:tcPr>
+          <w:p>
+            <w:pPr>
+              <w:spacing w:after="40"/>
+            </w:pPr>
+            <w:r>
+              <w:rPr>
+                <w:b/>
+                <w:color w:val="FFFFFF"/>
+                <w:sz w:val="18"/>
+              </w:rPr>
+              <w:t>Cenário</w:t>
+            </w:r>
+          </w:p>
+        </w:tc>
+        <w:tc>
+          <w:tcPr>
+            <w:tcW w:w="2232" w:type="dxa"/>
+            <w:shd w:val="clear" w:color="auto" w:fill="17365D"/>
+            <w:vAlign w:val="center"/>
+          </w:tcPr>
+          <w:p>
+            <w:pPr>
+              <w:spacing w:after="40"/>
+            </w:pPr>
+            <w:r>
+              <w:rPr>
+                <w:b/>
+                <w:color w:val="FFFFFF"/>
+                <w:sz w:val="18"/>
+              </w:rPr>
+              <w:t>Resultado esperado</w:t>
+            </w:r>
+          </w:p>
+        </w:tc>
+        <w:tc>
+          <w:tcPr>
+            <w:tcW w:w="1944" w:type="dxa"/>
+            <w:shd w:val="clear" w:color="auto" w:fill="17365D"/>
+            <w:vAlign w:val="center"/>
+          </w:tcPr>
+          <w:p>
+            <w:pPr>
+              <w:spacing w:after="40"/>
+            </w:pPr>
+            <w:r>
+              <w:rPr>
+                <w:b/>
+                <w:color w:val="FFFFFF"/>
+                <w:sz w:val="18"/>
+              </w:rPr>
+              <w:t>Resultado observado</w:t>
+            </w:r>
+          </w:p>
+        </w:tc>
+        <w:tc>
+          <w:tcPr>
+            <w:tcW w:w="2088" w:type="dxa"/>
+            <w:shd w:val="clear" w:color="auto" w:fill="17365D"/>
+            <w:vAlign w:val="center"/>
+          </w:tcPr>
+          <w:p>
+            <w:pPr>
+              <w:spacing w:after="40"/>
+            </w:pPr>
+            <w:r>
+              <w:rPr>
+                <w:b/>
+                <w:color w:val="FFFFFF"/>
+                <w:sz w:val="18"/>
+              </w:rPr>
+              <w:t>Observações</w:t>
+            </w:r>
+          </w:p>
+        </w:tc>
+      </w:tr>
+      <w:tr>
+        <w:trPr>
+          <w:jc w:val="center"/>
+        </w:trPr>
+        <w:tc>
+          <w:tcPr>
+            <w:tcW w:w="1080" w:type="dxa"/>
+            <w:vAlign w:val="center"/>
+          </w:tcPr>
+          <w:p>
+            <w:pPr>
+              <w:spacing w:after="40"/>
+            </w:pPr>
+            <w:r>
+              <w:rPr>
+                <w:sz w:val="18"/>
+              </w:rPr>
+              <w:t>FE-01</w:t>
+            </w:r>
+          </w:p>
+        </w:tc>
+        <w:tc>
+          <w:tcPr>
+            <w:tcW w:w="3600" w:type="dxa"/>
+            <w:vAlign w:val="center"/>
+          </w:tcPr>
+          <w:p>
+            <w:pPr>
+              <w:spacing w:after="40"/>
+              <w:rPr>
+                <w:lang w:val="pt-BR"/>
+              </w:rPr>
+            </w:pPr>
+            <w:r>
+              <w:rPr>
+                <w:sz w:val="18"/>
+                <w:lang w:val="pt-BR"/>
+              </w:rPr>
+              <w:t>Acessar a tela de login</w:t>
+            </w:r>
+          </w:p>
+        </w:tc>
+        <w:tc>
+          <w:tcPr>
+            <w:tcW w:w="2232" w:type="dxa"/>
+            <w:vAlign w:val="center"/>
+          </w:tcPr>
+          <w:p>
+            <w:pPr>
+              <w:spacing w:after="40"/>
+              <w:rPr>
+                <w:lang w:val="pt-BR"/>
+              </w:rPr>
+            </w:pPr>
+          </w:p>
+        </w:tc>
+        <w:tc>
+          <w:tcPr>
+            <w:tcW w:w="1944" w:type="dxa"/>
+            <w:vAlign w:val="center"/>
+          </w:tcPr>
+          <w:p>
+            <w:pPr>
+              <w:spacing w:after="40"/>
+              <w:rPr>
+                <w:lang w:val="pt-BR"/>
+              </w:rPr>
+            </w:pPr>
+          </w:p>
+        </w:tc>
+        <w:tc>
+          <w:tcPr>
+            <w:tcW w:w="2088" w:type="dxa"/>
+            <w:vAlign w:val="center"/>
+          </w:tcPr>
+          <w:p>
+            <w:pPr>
+              <w:spacing w:after="40"/>
+              <w:rPr>
+                <w:lang w:val="pt-BR"/>
+              </w:rPr>
+            </w:pPr>
+          </w:p>
+        </w:tc>
+      </w:tr>
+      <w:tr>
+        <w:trPr>
+          <w:jc w:val="center"/>
+        </w:trPr>
+        <w:tc>
+          <w:tcPr>
+            <w:tcW w:w="1080" w:type="dxa"/>
+            <w:vAlign w:val="center"/>
+          </w:tcPr>
+          <w:p>
+            <w:pPr>
+              <w:spacing w:after="40"/>
+            </w:pPr>
+            <w:r>
+              <w:rPr>
+                <w:sz w:val="18"/>
+              </w:rPr>
+              <w:t>FE-02</w:t>
+            </w:r>
+          </w:p>
+        </w:tc>
+        <w:tc>
+          <w:tcPr>
+            <w:tcW w:w="3600" w:type="dxa"/>
+            <w:vAlign w:val="center"/>
+          </w:tcPr>
+          <w:p>
+            <w:pPr>
+              <w:spacing w:after="40"/>
+              <w:rPr>
+                <w:lang w:val="pt-BR"/>
+              </w:rPr>
+            </w:pPr>
+            <w:r>
+              <w:rPr>
+                <w:sz w:val="18"/>
+                <w:lang w:val="pt-BR"/>
+              </w:rPr>
+              <w:t>Realizar login com e-mail e senha válidos</w:t>
+            </w:r>
+          </w:p>
+        </w:tc>
+        <w:tc>
+          <w:tcPr>
+            <w:tcW w:w="2232" w:type="dxa"/>
+            <w:vAlign w:val="center"/>
+          </w:tcPr>
+          <w:p>
+            <w:pPr>
+              <w:spacing w:after="40"/>
+              <w:rPr>
+                <w:lang w:val="pt-BR"/>
+              </w:rPr>
+            </w:pPr>
+          </w:p>
+        </w:tc>
+        <w:tc>
+          <w:tcPr>
+            <w:tcW w:w="1944" w:type="dxa"/>
+            <w:vAlign w:val="center"/>
+          </w:tcPr>
+          <w:p>
+            <w:pPr>
+              <w:spacing w:after="40"/>
+              <w:rPr>
+                <w:lang w:val="pt-BR"/>
+              </w:rPr>
+            </w:pPr>
+          </w:p>
+        </w:tc>
+        <w:tc>
+          <w:tcPr>
+            <w:tcW w:w="2088" w:type="dxa"/>
+            <w:vAlign w:val="center"/>
+          </w:tcPr>
+          <w:p>
+            <w:pPr>
+              <w:spacing w:after="40"/>
+              <w:rPr>
+                <w:lang w:val="pt-BR"/>
+              </w:rPr>
+            </w:pPr>
+          </w:p>
+        </w:tc>
+      </w:tr>
+      <w:tr>
+        <w:trPr>
+          <w:jc w:val="center"/>
+        </w:trPr>
+        <w:tc>
+          <w:tcPr>
+            <w:tcW w:w="1080" w:type="dxa"/>
+            <w:vAlign w:val="center"/>
+          </w:tcPr>
+          <w:p>
+            <w:pPr>
+              <w:spacing w:after="40"/>
+            </w:pPr>
+            <w:r>
+              <w:rPr>
+                <w:sz w:val="18"/>
+              </w:rPr>
+              <w:t>FE-03</w:t>
+            </w:r>
+          </w:p>
+        </w:tc>
+        <w:tc>
+          <w:tcPr>
+            <w:tcW w:w="3600" w:type="dxa"/>
+            <w:vAlign w:val="center"/>
+          </w:tcPr>
+          <w:p>
+            <w:pPr>
+              <w:spacing w:after="40"/>
+              <w:rPr>
+                <w:lang w:val="pt-BR"/>
+              </w:rPr>
+            </w:pPr>
+            <w:r>
+              <w:rPr>
+                <w:sz w:val="18"/>
+                <w:lang w:val="pt-BR"/>
+              </w:rPr>
+              <w:t>Tentar login com e-mail ou senha inválidos</w:t>
+            </w:r>
+          </w:p>
+        </w:tc>
+        <w:tc>
+          <w:tcPr>
+            <w:tcW w:w="2232" w:type="dxa"/>
+            <w:vAlign w:val="center"/>
+          </w:tcPr>
+          <w:p>
+            <w:pPr>
+              <w:spacing w:after="40"/>
+              <w:rPr>
+                <w:lang w:val="pt-BR"/>
+              </w:rPr>
+            </w:pPr>
+          </w:p>
+        </w:tc>
+        <w:tc>
+          <w:tcPr>
+            <w:tcW w:w="1944" w:type="dxa"/>
+            <w:vAlign w:val="center"/>
+          </w:tcPr>
+          <w:p>
+            <w:pPr>
+              <w:spacing w:after="40"/>
+              <w:rPr>
+                <w:lang w:val="pt-BR"/>
+              </w:rPr>
+            </w:pPr>
+          </w:p>
+        </w:tc>
+        <w:tc>
+          <w:tcPr>
+            <w:tcW w:w="2088" w:type="dxa"/>
+            <w:vAlign w:val="center"/>
+          </w:tcPr>
+          <w:p>
+            <w:pPr>
+              <w:spacing w:after="40"/>
+              <w:rPr>
+                <w:lang w:val="pt-BR"/>
+              </w:rPr>
+            </w:pPr>
+          </w:p>
+        </w:tc>
+      </w:tr>
+      <w:tr>
+        <w:trPr>
+          <w:jc w:val="center"/>
+        </w:trPr>
+        <w:tc>
+          <w:tcPr>
+            <w:tcW w:w="1080" w:type="dxa"/>
+            <w:vAlign w:val="center"/>
+          </w:tcPr>
+          <w:p>
+            <w:pPr>
+              <w:spacing w:after="40"/>
+            </w:pPr>
+            <w:r>
+              <w:rPr>
+                <w:sz w:val="18"/>
+              </w:rPr>
+              <w:t>FE-04</w:t>
+            </w:r>
+          </w:p>
+        </w:tc>
+        <w:tc>
+          <w:tcPr>
+            <w:tcW w:w="3600" w:type="dxa"/>
+            <w:vAlign w:val="center"/>
+          </w:tcPr>
+          <w:p>
+            <w:pPr>
+              <w:spacing w:after="40"/>
+              <w:rPr>
+                <w:lang w:val="pt-BR"/>
+              </w:rPr>
+            </w:pPr>
+            <w:r>
+              <w:rPr>
+                <w:sz w:val="18"/>
+                <w:lang w:val="pt-BR"/>
+              </w:rPr>
+              <w:t>Tentar login com campos obrigatórios vazios</w:t>
+            </w:r>
+          </w:p>
+        </w:tc>
+        <w:tc>
+          <w:tcPr>
+            <w:tcW w:w="2232" w:type="dxa"/>
+            <w:vAlign w:val="center"/>
+          </w:tcPr>
+          <w:p>
+            <w:pPr>
+              <w:spacing w:after="40"/>
+              <w:rPr>
+                <w:lang w:val="pt-BR"/>
+              </w:rPr>
+            </w:pPr>
+          </w:p>
+        </w:tc>
+        <w:tc>
+          <w:tcPr>
+            <w:tcW w:w="1944" w:type="dxa"/>
+            <w:vAlign w:val="center"/>
+          </w:tcPr>
+          <w:p>
+            <w:pPr>
+              <w:spacing w:after="40"/>
+              <w:rPr>
+                <w:lang w:val="pt-BR"/>
+              </w:rPr>
+            </w:pPr>
+          </w:p>
+        </w:tc>
+        <w:tc>
+          <w:tcPr>
+            <w:tcW w:w="2088" w:type="dxa"/>
+            <w:vAlign w:val="center"/>
+          </w:tcPr>
+          <w:p>
+            <w:pPr>
+              <w:spacing w:after="40"/>
+              <w:rPr>
+                <w:lang w:val="pt-BR"/>
+              </w:rPr>
+            </w:pPr>
+          </w:p>
+        </w:tc>
+      </w:tr>
+      <w:tr>
+        <w:trPr>
+          <w:jc w:val="center"/>
+        </w:trPr>
+        <w:tc>
+          <w:tcPr>
+            <w:tcW w:w="1080" w:type="dxa"/>
+            <w:vAlign w:val="center"/>
+          </w:tcPr>
+          <w:p>
+            <w:pPr>
+              <w:spacing w:after="40"/>
+            </w:pPr>
+            <w:r>
+              <w:rPr>
+                <w:sz w:val="18"/>
+              </w:rPr>
+              <w:t>FE-05</w:t>
+            </w:r>
+          </w:p>
+        </w:tc>
+        <w:tc>
+          <w:tcPr>
+            <w:tcW w:w="3600" w:type="dxa"/>
+            <w:vAlign w:val="center"/>
+          </w:tcPr>
+          <w:p>
+            <w:pPr>
+              <w:spacing w:after="40"/>
+              <w:rPr>
+                <w:lang w:val="pt-BR"/>
+              </w:rPr>
+            </w:pPr>
+            <w:r>
+              <w:rPr>
+                <w:sz w:val="18"/>
+                <w:lang w:val="pt-BR"/>
+              </w:rPr>
+              <w:t>Verificar bloqueio de acesso sem login válido</w:t>
+            </w:r>
+          </w:p>
+        </w:tc>
+        <w:tc>
+          <w:tcPr>
+            <w:tcW w:w="2232" w:type="dxa"/>
+            <w:vAlign w:val="center"/>
+          </w:tcPr>
+          <w:p>
+            <w:pPr>
+              <w:spacing w:after="40"/>
+              <w:rPr>
+                <w:lang w:val="pt-BR"/>
+              </w:rPr>
+            </w:pPr>
+          </w:p>
+        </w:tc>
+        <w:tc>
+          <w:tcPr>
+            <w:tcW w:w="1944" w:type="dxa"/>
+            <w:vAlign w:val="center"/>
+          </w:tcPr>
+          <w:p>
+            <w:pPr>
+              <w:spacing w:after="40"/>
+              <w:rPr>
+                <w:lang w:val="pt-BR"/>
+              </w:rPr>
+            </w:pPr>
+          </w:p>
+        </w:tc>
+        <w:tc>
+          <w:tcPr>
+            <w:tcW w:w="2088" w:type="dxa"/>
+            <w:vAlign w:val="center"/>
+          </w:tcPr>
+          <w:p>
+            <w:pPr>
+              <w:spacing w:after="40"/>
+              <w:rPr>
+                <w:lang w:val="pt-BR"/>
+              </w:rPr>
+            </w:pPr>
+          </w:p>
+        </w:tc>
+      </w:tr>
+      <w:tr>
+        <w:trPr>
+          <w:jc w:val="center"/>
+        </w:trPr>
+        <w:tc>
+          <w:tcPr>
+            <w:tcW w:w="1080" w:type="dxa"/>
+            <w:vAlign w:val="center"/>
+          </w:tcPr>
+          <w:p>
+            <w:pPr>
+              <w:spacing w:after="40"/>
+            </w:pPr>
+            <w:r>
+              <w:rPr>
+                <w:sz w:val="18"/>
+              </w:rPr>
+              <w:t>FE-06</w:t>
+            </w:r>
+          </w:p>
+        </w:tc>
+        <w:tc>
+          <w:tcPr>
+            <w:tcW w:w="3600" w:type="dxa"/>
+            <w:vAlign w:val="center"/>
+          </w:tcPr>
+          <w:p>
+            <w:pPr>
+              <w:spacing w:after="40"/>
+              <w:rPr>
+                <w:lang w:val="pt-BR"/>
+              </w:rPr>
+            </w:pPr>
+            <w:r>
+              <w:rPr>
+                <w:sz w:val="18"/>
+                <w:lang w:val="pt-BR"/>
+              </w:rPr>
+              <w:t>Cadastrar usuário com dados válidos</w:t>
+            </w:r>
+          </w:p>
+        </w:tc>
+        <w:tc>
+          <w:tcPr>
+            <w:tcW w:w="2232" w:type="dxa"/>
+            <w:vAlign w:val="center"/>
+          </w:tcPr>
+          <w:p>
+            <w:pPr>
+              <w:spacing w:after="40"/>
+              <w:rPr>
+                <w:lang w:val="pt-BR"/>
+              </w:rPr>
+            </w:pPr>
+          </w:p>
+        </w:tc>
+        <w:tc>
+          <w:tcPr>
+            <w:tcW w:w="1944" w:type="dxa"/>
+            <w:vAlign w:val="center"/>
+          </w:tcPr>
+          <w:p>
+            <w:pPr>
+              <w:spacing w:after="40"/>
+              <w:rPr>
+                <w:lang w:val="pt-BR"/>
+              </w:rPr>
+            </w:pPr>
+          </w:p>
+        </w:tc>
+        <w:tc>
+          <w:tcPr>
+            <w:tcW w:w="2088" w:type="dxa"/>
+            <w:vAlign w:val="center"/>
+          </w:tcPr>
+          <w:p>
+            <w:pPr>
+              <w:spacing w:after="40"/>
+              <w:rPr>
+                <w:lang w:val="pt-BR"/>
+              </w:rPr>
+            </w:pPr>
+          </w:p>
+        </w:tc>
+      </w:tr>
+      <w:tr>
+        <w:trPr>
+          <w:jc w:val="center"/>
+        </w:trPr>
+        <w:tc>
+          <w:tcPr>
+            <w:tcW w:w="1080" w:type="dxa"/>
+            <w:vAlign w:val="center"/>
+          </w:tcPr>
+          <w:p>
+            <w:pPr>
+              <w:spacing w:after="40"/>
+            </w:pPr>
+            <w:r>
+              <w:rPr>
+                <w:sz w:val="18"/>
+              </w:rPr>
+              <w:t>FE-07</w:t>
+            </w:r>
+          </w:p>
+        </w:tc>
+        <w:tc>
+          <w:tcPr>
+            <w:tcW w:w="3600" w:type="dxa"/>
+            <w:vAlign w:val="center"/>
+          </w:tcPr>
+          <w:p>
+            <w:pPr>
+              <w:spacing w:after="40"/>
+              <w:rPr>
+                <w:lang w:val="pt-BR"/>
+              </w:rPr>
+            </w:pPr>
+            <w:r>
+              <w:rPr>
+                <w:sz w:val="18"/>
+                <w:lang w:val="pt-BR"/>
+              </w:rPr>
+              <w:t>Cadastrar usuário com nome vazio</w:t>
+            </w:r>
+          </w:p>
+        </w:tc>
+        <w:tc>
+          <w:tcPr>
+            <w:tcW w:w="2232" w:type="dxa"/>
+            <w:vAlign w:val="center"/>
+          </w:tcPr>
+          <w:p>
+            <w:pPr>
+              <w:spacing w:after="40"/>
+              <w:rPr>
+                <w:lang w:val="pt-BR"/>
+              </w:rPr>
+            </w:pPr>
+          </w:p>
+        </w:tc>
+        <w:tc>
+          <w:tcPr>
+            <w:tcW w:w="1944" w:type="dxa"/>
+            <w:vAlign w:val="center"/>
+          </w:tcPr>
+          <w:p>
+            <w:pPr>
+              <w:spacing w:after="40"/>
+              <w:rPr>
+                <w:lang w:val="pt-BR"/>
+              </w:rPr>
+            </w:pPr>
+          </w:p>
+        </w:tc>
+        <w:tc>
+          <w:tcPr>
+            <w:tcW w:w="2088" w:type="dxa"/>
+            <w:vAlign w:val="center"/>
+          </w:tcPr>
+          <w:p>
+            <w:pPr>
+              <w:spacing w:after="40"/>
+              <w:rPr>
+                <w:lang w:val="pt-BR"/>
+              </w:rPr>
+            </w:pPr>
+          </w:p>
+        </w:tc>
+      </w:tr>
+      <w:tr>
+        <w:trPr>
+          <w:jc w:val="center"/>
+        </w:trPr>
+        <w:tc>
+          <w:tcPr>
+            <w:tcW w:w="1080" w:type="dxa"/>
+            <w:vAlign w:val="center"/>
+          </w:tcPr>
+          <w:p>
+            <w:pPr>
+              <w:spacing w:after="40"/>
+            </w:pPr>
+            <w:r>
+              <w:rPr>
+                <w:sz w:val="18"/>
+              </w:rPr>
+              <w:t>FE-08</w:t>
+            </w:r>
+          </w:p>
+        </w:tc>
+        <w:tc>
+          <w:tcPr>
+            <w:tcW w:w="3600" w:type="dxa"/>
+            <w:vAlign w:val="center"/>
+          </w:tcPr>
+          <w:p>
+            <w:pPr>
+              <w:spacing w:after="40"/>
+              <w:rPr>
+                <w:lang w:val="pt-BR"/>
+              </w:rPr>
+            </w:pPr>
+            <w:r>
+              <w:rPr>
+                <w:sz w:val="18"/>
+                <w:lang w:val="pt-BR"/>
+              </w:rPr>
+              <w:t>Cadastrar usuário com e-mail vazio ou inválido</w:t>
+            </w:r>
+          </w:p>
+        </w:tc>
+        <w:tc>
+          <w:tcPr>
+            <w:tcW w:w="2232" w:type="dxa"/>
+            <w:vAlign w:val="center"/>
+          </w:tcPr>
+          <w:p>
+            <w:pPr>
+              <w:spacing w:after="40"/>
+              <w:rPr>
+                <w:lang w:val="pt-BR"/>
+              </w:rPr>
+            </w:pPr>
+          </w:p>
+        </w:tc>
+        <w:tc>
+          <w:tcPr>
+            <w:tcW w:w="1944" w:type="dxa"/>
+            <w:vAlign w:val="center"/>
+          </w:tcPr>
+          <w:p>
+            <w:pPr>
+              <w:spacing w:after="40"/>
+              <w:rPr>
+                <w:lang w:val="pt-BR"/>
+              </w:rPr>
+            </w:pPr>
+          </w:p>
+        </w:tc>
+        <w:tc>
+          <w:tcPr>
+            <w:tcW w:w="2088" w:type="dxa"/>
+            <w:vAlign w:val="center"/>
+          </w:tcPr>
+          <w:p>
+            <w:pPr>
+              <w:spacing w:after="40"/>
+              <w:rPr>
+                <w:lang w:val="pt-BR"/>
+              </w:rPr>
+            </w:pPr>
+          </w:p>
+        </w:tc>
+      </w:tr>
+      <w:tr>
+        <w:trPr>
+          <w:jc w:val="center"/>
+        </w:trPr>
+        <w:tc>
+          <w:tcPr>
+            <w:tcW w:w="1080" w:type="dxa"/>
+            <w:vAlign w:val="center"/>
+          </w:tcPr>
+          <w:p>
+            <w:pPr>
+              <w:spacing w:after="40"/>
+            </w:pPr>
+            <w:r>
+              <w:rPr>
+                <w:sz w:val="18"/>
+              </w:rPr>
+              <w:t>FE-09</w:t>
+            </w:r>
+          </w:p>
+        </w:tc>
+        <w:tc>
+          <w:tcPr>
+            <w:tcW w:w="3600" w:type="dxa"/>
+            <w:vAlign w:val="center"/>
+          </w:tcPr>
+          <w:p>
+            <w:pPr>
+              <w:spacing w:after="40"/>
+              <w:rPr>
+                <w:lang w:val="pt-BR"/>
+              </w:rPr>
+            </w:pPr>
+            <w:r>
+              <w:rPr>
+                <w:sz w:val="18"/>
+                <w:lang w:val="pt-BR"/>
+              </w:rPr>
+              <w:t>Cadastrar usuário com e-mail duplicado</w:t>
+            </w:r>
+          </w:p>
+        </w:tc>
+        <w:tc>
+          <w:tcPr>
+            <w:tcW w:w="2232" w:type="dxa"/>
+            <w:vAlign w:val="center"/>
+          </w:tcPr>
+          <w:p>
+            <w:pPr>
+              <w:spacing w:after="40"/>
+              <w:rPr>
+                <w:lang w:val="pt-BR"/>
+              </w:rPr>
+            </w:pPr>
+          </w:p>
+        </w:tc>
+        <w:tc>
+          <w:tcPr>
+            <w:tcW w:w="1944" w:type="dxa"/>
+            <w:vAlign w:val="center"/>
+          </w:tcPr>
+          <w:p>
+            <w:pPr>
+              <w:spacing w:after="40"/>
+              <w:rPr>
+                <w:lang w:val="pt-BR"/>
+              </w:rPr>
+            </w:pPr>
+          </w:p>
+        </w:tc>
+        <w:tc>
+          <w:tcPr>
+            <w:tcW w:w="2088" w:type="dxa"/>
+            <w:vAlign w:val="center"/>
+          </w:tcPr>
+          <w:p>
+            <w:pPr>
+              <w:spacing w:after="40"/>
+              <w:rPr>
+                <w:lang w:val="pt-BR"/>
+              </w:rPr>
+            </w:pPr>
+          </w:p>
+        </w:tc>
+      </w:tr>
+      <w:tr>
+        <w:trPr>
+          <w:jc w:val="center"/>
+        </w:trPr>
+        <w:tc>
+          <w:tcPr>
+            <w:tcW w:w="1080" w:type="dxa"/>
+            <w:vAlign w:val="center"/>
+          </w:tcPr>
+          <w:p>
+            <w:pPr>
+              <w:spacing w:after="40"/>
+            </w:pPr>
+            <w:r>
+              <w:rPr>
+                <w:sz w:val="18"/>
+              </w:rPr>
+              <w:t>FE-11</w:t>
+            </w:r>
+          </w:p>
+        </w:tc>
+        <w:tc>
+          <w:tcPr>
+            <w:tcW w:w="3600" w:type="dxa"/>
+            <w:vAlign w:val="center"/>
+          </w:tcPr>
+          <w:p>
+            <w:pPr>
+              <w:spacing w:after="40"/>
+              <w:rPr>
+                <w:lang w:val="pt-BR"/>
+              </w:rPr>
+            </w:pPr>
+            <w:r>
+              <w:rPr>
+                <w:sz w:val="18"/>
+                <w:lang w:val="pt-BR"/>
+              </w:rPr>
+              <w:t>Cadastrar usuário com senha vazia ou fraca</w:t>
+            </w:r>
+          </w:p>
+        </w:tc>
+        <w:tc>
+          <w:tcPr>
+            <w:tcW w:w="2232" w:type="dxa"/>
+            <w:vAlign w:val="center"/>
+          </w:tcPr>
+          <w:p>
+            <w:pPr>
+              <w:spacing w:after="40"/>
+              <w:rPr>
+                <w:lang w:val="pt-BR"/>
+              </w:rPr>
+            </w:pPr>
+          </w:p>
+        </w:tc>
+        <w:tc>
+          <w:tcPr>
+            <w:tcW w:w="1944" w:type="dxa"/>
+            <w:vAlign w:val="center"/>
+          </w:tcPr>
+          <w:p>
+            <w:pPr>
+              <w:spacing w:after="40"/>
+              <w:rPr>
+                <w:lang w:val="pt-BR"/>
+              </w:rPr>
+            </w:pPr>
+          </w:p>
+        </w:tc>
+        <w:tc>
+          <w:tcPr>
+            <w:tcW w:w="2088" w:type="dxa"/>
+            <w:vAlign w:val="center"/>
+          </w:tcPr>
+          <w:p>
+            <w:pPr>
+              <w:spacing w:after="40"/>
+              <w:rPr>
+                <w:lang w:val="pt-BR"/>
+              </w:rPr>
+            </w:pPr>
+          </w:p>
+        </w:tc>
+      </w:tr>
+      <w:tr>
+        <w:trPr>
+          <w:jc w:val="center"/>
+        </w:trPr>
+        <w:tc>
+          <w:tcPr>
+            <w:tcW w:w="1080" w:type="dxa"/>
+            <w:vAlign w:val="center"/>
+          </w:tcPr>
+          <w:p>
+            <w:pPr>
+              <w:spacing w:after="40"/>
+            </w:pPr>
+            <w:r>
+              <w:rPr>
+                <w:sz w:val="18"/>
+              </w:rPr>
+              <w:t>FE-12</w:t>
+            </w:r>
+          </w:p>
+        </w:tc>
+        <w:tc>
+          <w:tcPr>
+            <w:tcW w:w="3600" w:type="dxa"/>
+            <w:vAlign w:val="center"/>
+          </w:tcPr>
+          <w:p>
+            <w:pPr>
+              <w:spacing w:after="40"/>
+              <w:rPr>
+                <w:lang w:val="pt-BR"/>
+              </w:rPr>
+            </w:pPr>
+            <w:r>
+              <w:rPr>
+                <w:sz w:val="18"/>
+                <w:lang w:val="pt-BR"/>
+              </w:rPr>
+              <w:t>Visualizar identificação do usuário logado</w:t>
+            </w:r>
+          </w:p>
+        </w:tc>
+        <w:tc>
+          <w:tcPr>
+            <w:tcW w:w="2232" w:type="dxa"/>
+            <w:vAlign w:val="center"/>
+          </w:tcPr>
+          <w:p>
+            <w:pPr>
+              <w:spacing w:after="40"/>
+              <w:rPr>
+                <w:lang w:val="pt-BR"/>
+              </w:rPr>
+            </w:pPr>
+          </w:p>
+        </w:tc>
+        <w:tc>
+          <w:tcPr>
+            <w:tcW w:w="1944" w:type="dxa"/>
+            <w:vAlign w:val="center"/>
+          </w:tcPr>
+          <w:p>
+            <w:pPr>
+              <w:spacing w:after="40"/>
+              <w:rPr>
+                <w:lang w:val="pt-BR"/>
+              </w:rPr>
+            </w:pPr>
+          </w:p>
+        </w:tc>
+        <w:tc>
+          <w:tcPr>
+            <w:tcW w:w="2088" w:type="dxa"/>
+            <w:vAlign w:val="center"/>
+          </w:tcPr>
+          <w:p>
+            <w:pPr>
+              <w:spacing w:after="40"/>
+              <w:rPr>
+                <w:lang w:val="pt-BR"/>
+              </w:rPr>
+            </w:pPr>
+          </w:p>
+        </w:tc>
+      </w:tr>
+      <w:tr>
+        <w:trPr>
+          <w:jc w:val="center"/>
+        </w:trPr>
+        <w:tc>
+          <w:tcPr>
+            <w:tcW w:w="1080" w:type="dxa"/>
+            <w:vAlign w:val="center"/>
+          </w:tcPr>
+          <w:p>
+            <w:pPr>
+              <w:spacing w:after="40"/>
+            </w:pPr>
+            <w:r>
+              <w:rPr>
+                <w:sz w:val="18"/>
+              </w:rPr>
+              <w:t>FE-13</w:t>
+            </w:r>
+          </w:p>
+        </w:tc>
+        <w:tc>
+          <w:tcPr>
+            <w:tcW w:w="3600" w:type="dxa"/>
+            <w:vAlign w:val="center"/>
+          </w:tcPr>
+          <w:p>
+            <w:pPr>
+              <w:spacing w:after="40"/>
+              <w:rPr>
+                <w:lang w:val="pt-BR"/>
+              </w:rPr>
+            </w:pPr>
+            <w:r>
+              <w:rPr>
+                <w:sz w:val="18"/>
+                <w:lang w:val="pt-BR"/>
+              </w:rPr>
+              <w:t>Visualizar todas as transações enviadas e recebidas</w:t>
+            </w:r>
+          </w:p>
+        </w:tc>
+        <w:tc>
+          <w:tcPr>
+            <w:tcW w:w="2232" w:type="dxa"/>
+            <w:vAlign w:val="center"/>
+          </w:tcPr>
+          <w:p>
+            <w:pPr>
+              <w:spacing w:after="40"/>
+              <w:rPr>
+                <w:lang w:val="pt-BR"/>
+              </w:rPr>
+            </w:pPr>
+          </w:p>
+        </w:tc>
+        <w:tc>
+          <w:tcPr>
+            <w:tcW w:w="1944" w:type="dxa"/>
+            <w:vAlign w:val="center"/>
+          </w:tcPr>
+          <w:p>
+            <w:pPr>
+              <w:spacing w:after="40"/>
+              <w:rPr>
+                <w:lang w:val="pt-BR"/>
+              </w:rPr>
+            </w:pPr>
+          </w:p>
+        </w:tc>
+        <w:tc>
+          <w:tcPr>
+            <w:tcW w:w="2088" w:type="dxa"/>
+            <w:vAlign w:val="center"/>
+          </w:tcPr>
+          <w:p>
+            <w:pPr>
+              <w:spacing w:after="40"/>
+              <w:rPr>
+                <w:lang w:val="pt-BR"/>
+              </w:rPr>
+            </w:pPr>
+          </w:p>
+        </w:tc>
+      </w:tr>
+      <w:tr>
+        <w:trPr>
+          <w:jc w:val="center"/>
+        </w:trPr>
+        <w:tc>
+          <w:tcPr>
+            <w:tcW w:w="1080" w:type="dxa"/>
+            <w:vAlign w:val="center"/>
+          </w:tcPr>
+          <w:p>
+            <w:pPr>
+              <w:spacing w:after="40"/>
+            </w:pPr>
+            <w:r>
+              <w:rPr>
+                <w:sz w:val="18"/>
+              </w:rPr>
+              <w:t>FE-14</w:t>
+            </w:r>
+          </w:p>
+        </w:tc>
+        <w:tc>
+          <w:tcPr>
+            <w:tcW w:w="3600" w:type="dxa"/>
+            <w:vAlign w:val="center"/>
+          </w:tcPr>
+          <w:p>
+            <w:pPr>
+              <w:spacing w:after="40"/>
+              <w:rPr>
+                <w:lang w:val="pt-BR"/>
+              </w:rPr>
+            </w:pPr>
+            <w:r>
+              <w:rPr>
+                <w:sz w:val="18"/>
+                <w:lang w:val="pt-BR"/>
+              </w:rPr>
+              <w:t>Filtrar transações do dia atual</w:t>
+            </w:r>
+          </w:p>
+        </w:tc>
+        <w:tc>
+          <w:tcPr>
+            <w:tcW w:w="2232" w:type="dxa"/>
+            <w:vAlign w:val="center"/>
+          </w:tcPr>
+          <w:p>
+            <w:pPr>
+              <w:spacing w:after="40"/>
+              <w:rPr>
+                <w:lang w:val="pt-BR"/>
+              </w:rPr>
+            </w:pPr>
+          </w:p>
+        </w:tc>
+        <w:tc>
+          <w:tcPr>
+            <w:tcW w:w="1944" w:type="dxa"/>
+            <w:vAlign w:val="center"/>
+          </w:tcPr>
+          <w:p>
+            <w:pPr>
+              <w:spacing w:after="40"/>
+              <w:rPr>
+                <w:lang w:val="pt-BR"/>
+              </w:rPr>
+            </w:pPr>
+          </w:p>
+        </w:tc>
+        <w:tc>
+          <w:tcPr>
+            <w:tcW w:w="2088" w:type="dxa"/>
+            <w:vAlign w:val="center"/>
+          </w:tcPr>
+          <w:p>
+            <w:pPr>
+              <w:spacing w:after="40"/>
+              <w:rPr>
+                <w:lang w:val="pt-BR"/>
+              </w:rPr>
+            </w:pPr>
+          </w:p>
+        </w:tc>
+      </w:tr>
+      <w:tr>
+        <w:trPr>
+          <w:jc w:val="center"/>
+        </w:trPr>
+        <w:tc>
+          <w:tcPr>
+            <w:tcW w:w="1080" w:type="dxa"/>
+            <w:vAlign w:val="center"/>
+          </w:tcPr>
+          <w:p>
+            <w:pPr>
+              <w:spacing w:after="40"/>
+            </w:pPr>
+            <w:r>
+              <w:rPr>
+                <w:sz w:val="18"/>
+              </w:rPr>
+              <w:t>FE-15</w:t>
+            </w:r>
+          </w:p>
+        </w:tc>
+        <w:tc>
+          <w:tcPr>
+            <w:tcW w:w="3600" w:type="dxa"/>
+            <w:vAlign w:val="center"/>
+          </w:tcPr>
+          <w:p>
+            <w:pPr>
+              <w:spacing w:after="40"/>
+              <w:rPr>
+                <w:lang w:val="pt-BR"/>
+              </w:rPr>
+            </w:pPr>
+            <w:r>
+              <w:rPr>
+                <w:sz w:val="18"/>
+                <w:lang w:val="pt-BR"/>
+              </w:rPr>
+              <w:t>Filtrar transações do dia anterior</w:t>
+            </w:r>
+          </w:p>
+        </w:tc>
+        <w:tc>
+          <w:tcPr>
+            <w:tcW w:w="2232" w:type="dxa"/>
+            <w:vAlign w:val="center"/>
+          </w:tcPr>
+          <w:p>
+            <w:pPr>
+              <w:spacing w:after="40"/>
+              <w:rPr>
+                <w:lang w:val="pt-BR"/>
+              </w:rPr>
+            </w:pPr>
+          </w:p>
+        </w:tc>
+        <w:tc>
+          <w:tcPr>
+            <w:tcW w:w="1944" w:type="dxa"/>
+            <w:vAlign w:val="center"/>
+          </w:tcPr>
+          <w:p>
+            <w:pPr>
+              <w:spacing w:after="40"/>
+              <w:rPr>
+                <w:lang w:val="pt-BR"/>
+              </w:rPr>
+            </w:pPr>
+          </w:p>
+        </w:tc>
+        <w:tc>
+          <w:tcPr>
+            <w:tcW w:w="2088" w:type="dxa"/>
+            <w:vAlign w:val="center"/>
+          </w:tcPr>
+          <w:p>
+            <w:pPr>
+              <w:spacing w:after="40"/>
+              <w:rPr>
+                <w:lang w:val="pt-BR"/>
+              </w:rPr>
+            </w:pPr>
+          </w:p>
+        </w:tc>
+      </w:tr>
+      <w:tr>
+        <w:trPr>
+          <w:jc w:val="center"/>
+        </w:trPr>
+        <w:tc>
+          <w:tcPr>
+            <w:tcW w:w="1080" w:type="dxa"/>
+            <w:vAlign w:val="center"/>
+          </w:tcPr>
+          <w:p>
+            <w:pPr>
+              <w:spacing w:after="40"/>
+            </w:pPr>
+            <w:r>
+              <w:rPr>
+                <w:sz w:val="18"/>
+              </w:rPr>
+              <w:t>FE-16</w:t>
+            </w:r>
+          </w:p>
+        </w:tc>
+        <w:tc>
+          <w:tcPr>
+            <w:tcW w:w="3600" w:type="dxa"/>
+            <w:vAlign w:val="center"/>
+          </w:tcPr>
+          <w:p>
+            <w:pPr>
+              <w:spacing w:after="40"/>
+              <w:rPr>
+                <w:lang w:val="pt-BR"/>
+              </w:rPr>
+            </w:pPr>
+            <w:r>
+              <w:rPr>
+                <w:sz w:val="18"/>
+                <w:lang w:val="pt-BR"/>
+              </w:rPr>
+              <w:t>Filtrar transações dos últimos 14 dias</w:t>
+            </w:r>
+          </w:p>
+        </w:tc>
+        <w:tc>
+          <w:tcPr>
+            <w:tcW w:w="2232" w:type="dxa"/>
+            <w:vAlign w:val="center"/>
+          </w:tcPr>
+          <w:p>
+            <w:pPr>
+              <w:spacing w:after="40"/>
+              <w:rPr>
+                <w:lang w:val="pt-BR"/>
+              </w:rPr>
+            </w:pPr>
+          </w:p>
+        </w:tc>
+        <w:tc>
+          <w:tcPr>
+            <w:tcW w:w="1944" w:type="dxa"/>
+            <w:vAlign w:val="center"/>
+          </w:tcPr>
+          <w:p>
+            <w:pPr>
+              <w:spacing w:after="40"/>
+              <w:rPr>
+                <w:lang w:val="pt-BR"/>
+              </w:rPr>
+            </w:pPr>
+          </w:p>
+        </w:tc>
+        <w:tc>
+          <w:tcPr>
+            <w:tcW w:w="2088" w:type="dxa"/>
+            <w:vAlign w:val="center"/>
+          </w:tcPr>
+          <w:p>
+            <w:pPr>
+              <w:spacing w:after="40"/>
+              <w:rPr>
+                <w:lang w:val="pt-BR"/>
+              </w:rPr>
+            </w:pPr>
+          </w:p>
+        </w:tc>
+      </w:tr>
+      <w:tr>
+        <w:trPr>
+          <w:jc w:val="center"/>
+        </w:trPr>
+        <w:tc>
+          <w:tcPr>
+            <w:tcW w:w="1080" w:type="dxa"/>
+            <w:vAlign w:val="center"/>
+          </w:tcPr>
+          <w:p>
+            <w:pPr>
+              <w:spacing w:after="40"/>
+            </w:pPr>
+            <w:r>
+              <w:rPr>
+                <w:sz w:val="18"/>
+              </w:rPr>
+              <w:t>FE-17</w:t>
+            </w:r>
+          </w:p>
+        </w:tc>
+        <w:tc>
+          <w:tcPr>
+            <w:tcW w:w="3600" w:type="dxa"/>
+            <w:vAlign w:val="center"/>
+          </w:tcPr>
+          <w:p>
+            <w:pPr>
+              <w:spacing w:after="40"/>
+              <w:rPr>
+                <w:lang w:val="pt-BR"/>
+              </w:rPr>
+            </w:pPr>
+            <w:r>
+              <w:rPr>
+                <w:sz w:val="18"/>
+                <w:lang w:val="pt-BR"/>
+              </w:rPr>
+              <w:t>Filtrar transações por forma de pagamento</w:t>
+            </w:r>
+          </w:p>
+        </w:tc>
+        <w:tc>
+          <w:tcPr>
+            <w:tcW w:w="2232" w:type="dxa"/>
+            <w:vAlign w:val="center"/>
+          </w:tcPr>
+          <w:p>
+            <w:pPr>
+              <w:spacing w:after="40"/>
+              <w:rPr>
+                <w:lang w:val="pt-BR"/>
+              </w:rPr>
+            </w:pPr>
+          </w:p>
+        </w:tc>
+        <w:tc>
+          <w:tcPr>
+            <w:tcW w:w="1944" w:type="dxa"/>
+            <w:vAlign w:val="center"/>
+          </w:tcPr>
+          <w:p>
+            <w:pPr>
+              <w:spacing w:after="40"/>
+              <w:rPr>
+                <w:lang w:val="pt-BR"/>
+              </w:rPr>
+            </w:pPr>
+          </w:p>
+        </w:tc>
+        <w:tc>
+          <w:tcPr>
+            <w:tcW w:w="2088" w:type="dxa"/>
+            <w:vAlign w:val="center"/>
+          </w:tcPr>
+          <w:p>
+            <w:pPr>
+              <w:spacing w:after="40"/>
+              <w:rPr>
+                <w:lang w:val="pt-BR"/>
+              </w:rPr>
+            </w:pPr>
+          </w:p>
+        </w:tc>
+      </w:tr>
+      <w:tr>
+        <w:trPr>
+          <w:jc w:val="center"/>
+        </w:trPr>
+        <w:tc>
+          <w:tcPr>
+            <w:tcW w:w="1080" w:type="dxa"/>
+            <w:vAlign w:val="center"/>
+          </w:tcPr>
+          <w:p>
+            <w:pPr>
+              <w:spacing w:after="40"/>
+            </w:pPr>
+            <w:r>
+              <w:rPr>
+                <w:sz w:val="18"/>
+              </w:rPr>
+              <w:t>FE-18</w:t>
+            </w:r>
+          </w:p>
+        </w:tc>
+        <w:tc>
+          <w:tcPr>
+            <w:tcW w:w="3600" w:type="dxa"/>
+            <w:vAlign w:val="center"/>
+          </w:tcPr>
+          <w:p>
+            <w:pPr>
+              <w:spacing w:after="40"/>
+              <w:rPr>
+                <w:lang w:val="pt-BR"/>
+              </w:rPr>
+            </w:pPr>
+            <w:r>
+              <w:rPr>
+                <w:sz w:val="18"/>
+                <w:lang w:val="pt-BR"/>
+              </w:rPr>
+              <w:t>Consultar uma transação por ID</w:t>
+            </w:r>
+          </w:p>
+        </w:tc>
+        <w:tc>
+          <w:tcPr>
+            <w:tcW w:w="2232" w:type="dxa"/>
+            <w:vAlign w:val="center"/>
+          </w:tcPr>
+          <w:p>
+            <w:pPr>
+              <w:spacing w:after="40"/>
+              <w:rPr>
+                <w:lang w:val="pt-BR"/>
+              </w:rPr>
+            </w:pPr>
+          </w:p>
+        </w:tc>
+        <w:tc>
+          <w:tcPr>
+            <w:tcW w:w="1944" w:type="dxa"/>
+            <w:vAlign w:val="center"/>
+          </w:tcPr>
+          <w:p>
+            <w:pPr>
+              <w:spacing w:after="40"/>
+              <w:rPr>
+                <w:lang w:val="pt-BR"/>
+              </w:rPr>
+            </w:pPr>
+          </w:p>
+        </w:tc>
+        <w:tc>
+          <w:tcPr>
+            <w:tcW w:w="2088" w:type="dxa"/>
+            <w:vAlign w:val="center"/>
+          </w:tcPr>
+          <w:p>
+            <w:pPr>
+              <w:spacing w:after="40"/>
+              <w:rPr>
+                <w:lang w:val="pt-BR"/>
+              </w:rPr>
+            </w:pPr>
+          </w:p>
+        </w:tc>
+      </w:tr>
+      <w:tr>
+        <w:trPr>
+          <w:jc w:val="center"/>
+        </w:trPr>
+        <w:tc>
+          <w:tcPr>
+            <w:tcW w:w="1080" w:type="dxa"/>
+            <w:vAlign w:val="center"/>
+          </w:tcPr>
+          <w:p>
+            <w:pPr>
+              <w:spacing w:after="40"/>
+            </w:pPr>
+            <w:r>
+              <w:rPr>
+                <w:sz w:val="18"/>
+              </w:rPr>
+              <w:t>FE-19</w:t>
+            </w:r>
+          </w:p>
+        </w:tc>
+        <w:tc>
+          <w:tcPr>
+            <w:tcW w:w="3600" w:type="dxa"/>
+            <w:vAlign w:val="center"/>
+          </w:tcPr>
+          <w:p>
+            <w:pPr>
+              <w:spacing w:after="40"/>
+              <w:rPr>
+                <w:lang w:val="pt-BR"/>
+              </w:rPr>
+            </w:pPr>
+            <w:r>
+              <w:rPr>
+                <w:sz w:val="18"/>
+                <w:lang w:val="pt-BR"/>
+              </w:rPr>
+              <w:t>Verificar estado da tela sem transações para o filtro selecionado</w:t>
+            </w:r>
+          </w:p>
+        </w:tc>
+        <w:tc>
+          <w:tcPr>
+            <w:tcW w:w="2232" w:type="dxa"/>
+            <w:vAlign w:val="center"/>
+          </w:tcPr>
+          <w:p>
+            <w:pPr>
+              <w:spacing w:after="40"/>
+              <w:rPr>
+                <w:lang w:val="pt-BR"/>
+              </w:rPr>
+            </w:pPr>
+          </w:p>
+        </w:tc>
+        <w:tc>
+          <w:tcPr>
+            <w:tcW w:w="1944" w:type="dxa"/>
+            <w:vAlign w:val="center"/>
+          </w:tcPr>
+          <w:p>
+            <w:pPr>
+              <w:spacing w:after="40"/>
+              <w:rPr>
+                <w:lang w:val="pt-BR"/>
+              </w:rPr>
+            </w:pPr>
+          </w:p>
+        </w:tc>
+        <w:tc>
+          <w:tcPr>
+            <w:tcW w:w="2088" w:type="dxa"/>
+            <w:vAlign w:val="center"/>
+          </w:tcPr>
+          <w:p>
+            <w:pPr>
+              <w:spacing w:after="40"/>
+              <w:rPr>
+                <w:lang w:val="pt-BR"/>
+              </w:rPr>
+            </w:pPr>
+          </w:p>
+        </w:tc>
+      </w:tr>
+      <w:tr>
+        <w:trPr>
+          <w:jc w:val="center"/>
+        </w:trPr>
+        <w:tc>
+          <w:tcPr>
+            <w:tcW w:w="1080" w:type="dxa"/>
+            <w:vAlign w:val="center"/>
+          </w:tcPr>
+          <w:p>
+            <w:pPr>
+              <w:spacing w:after="40"/>
+            </w:pPr>
+            <w:r>
+              <w:rPr>
+                <w:sz w:val="18"/>
+              </w:rPr>
+              <w:t>FE-20</w:t>
+            </w:r>
+          </w:p>
+        </w:tc>
+        <w:tc>
+          <w:tcPr>
+            <w:tcW w:w="3600" w:type="dxa"/>
+            <w:vAlign w:val="center"/>
+          </w:tcPr>
+          <w:p>
+            <w:pPr>
+              <w:spacing w:after="40"/>
+              <w:rPr>
+                <w:lang w:val="pt-BR"/>
+              </w:rPr>
+            </w:pPr>
+            <w:r>
+              <w:rPr>
+                <w:sz w:val="18"/>
+                <w:lang w:val="pt-BR"/>
+              </w:rPr>
+              <w:t>Verificar carregamento e exibição dos dados após atualização da consulta</w:t>
+            </w:r>
+          </w:p>
+        </w:tc>
+        <w:tc>
+          <w:tcPr>
+            <w:tcW w:w="2232" w:type="dxa"/>
+            <w:vAlign w:val="center"/>
+          </w:tcPr>
+          <w:p>
+            <w:pPr>
+              <w:spacing w:after="40"/>
+              <w:rPr>
+                <w:lang w:val="pt-BR"/>
+              </w:rPr>
+            </w:pPr>
+          </w:p>
+        </w:tc>
+        <w:tc>
+          <w:tcPr>
+            <w:tcW w:w="1944" w:type="dxa"/>
+            <w:vAlign w:val="center"/>
+          </w:tcPr>
+          <w:p>
+            <w:pPr>
+              <w:spacing w:after="40"/>
+              <w:rPr>
+                <w:lang w:val="pt-BR"/>
+              </w:rPr>
+            </w:pPr>
+          </w:p>
+        </w:tc>
+        <w:tc>
+          <w:tcPr>
+            <w:tcW w:w="2088" w:type="dxa"/>
+            <w:vAlign w:val="center"/>
+          </w:tcPr>
+          <w:p>
+            <w:pPr>
+              <w:spacing w:after="40"/>
+              <w:rPr>
+                <w:lang w:val="pt-BR"/>
+              </w:rPr>
+            </w:pPr>
+          </w:p>
+        </w:tc>
+      </w:tr>
+      <w:tr>
+        <w:trPr>
+          <w:jc w:val="center"/>
+        </w:trPr>
+        <w:tc>
+          <w:tcPr>
+            <w:tcW w:w="1080" w:type="dxa"/>
+            <w:vAlign w:val="center"/>
+          </w:tcPr>
+          <w:p>
+            <w:pPr>
+              <w:spacing w:after="40"/>
+            </w:pPr>
+            <w:r>
+              <w:rPr>
+                <w:sz w:val="18"/>
+              </w:rPr>
+              <w:t>FE-21</w:t>
+            </w:r>
+          </w:p>
+        </w:tc>
+        <w:tc>
+          <w:tcPr>
+            <w:tcW w:w="3600" w:type="dxa"/>
+            <w:vAlign w:val="center"/>
+          </w:tcPr>
+          <w:p>
+            <w:pPr>
+              <w:spacing w:after="40"/>
+              <w:rPr>
+                <w:lang w:val="pt-BR"/>
+              </w:rPr>
+            </w:pPr>
+            <w:r>
+              <w:rPr>
+                <w:sz w:val="18"/>
+                <w:lang w:val="pt-BR"/>
+              </w:rPr>
+              <w:t>Verificar encerramento ou expiração da sessão</w:t>
+            </w:r>
+          </w:p>
+        </w:tc>
+        <w:tc>
+          <w:tcPr>
+            <w:tcW w:w="2232" w:type="dxa"/>
+            <w:vAlign w:val="center"/>
+          </w:tcPr>
+          <w:p>
+            <w:pPr>
+              <w:spacing w:after="40"/>
+              <w:rPr>
+                <w:lang w:val="pt-BR"/>
+              </w:rPr>
+            </w:pPr>
+          </w:p>
+        </w:tc>
+        <w:tc>
+          <w:tcPr>
+            <w:tcW w:w="1944" w:type="dxa"/>
+            <w:vAlign w:val="center"/>
+          </w:tcPr>
+          <w:p>
+            <w:pPr>
+              <w:spacing w:after="40"/>
+              <w:rPr>
+                <w:lang w:val="pt-BR"/>
+              </w:rPr>
+            </w:pPr>
+          </w:p>
+        </w:tc>
+        <w:tc>
+          <w:tcPr>
+            <w:tcW w:w="2088" w:type="dxa"/>
+            <w:vAlign w:val="center"/>
+          </w:tcPr>
+          <w:p>
+            <w:pPr>
+              <w:spacing w:after="40"/>
+              <w:rPr>
+                <w:lang w:val="pt-BR"/>
+              </w:rPr>
+            </w:pPr>
+          </w:p>
+        </w:tc>
+      </w:tr>
+      <w:tr>
+        <w:trPr>
+          <w:jc w:val="center"/>
+        </w:trPr>
+        <w:tc>
+          <w:tcPr>
+            <w:tcW w:w="1080" w:type="dxa"/>
+            <w:vAlign w:val="center"/>
+          </w:tcPr>
+          <w:p>
+            <w:pPr>
+              <w:spacing w:after="40"/>
+            </w:pPr>
+            <w:r>
+              <w:rPr>
+                <w:sz w:val="18"/>
+              </w:rPr>
+              <w:t>FE-22</w:t>
+            </w:r>
+          </w:p>
+        </w:tc>
+        <w:tc>
+          <w:tcPr>
+            <w:tcW w:w="3600" w:type="dxa"/>
+            <w:vAlign w:val="center"/>
+          </w:tcPr>
+          <w:p>
+            <w:pPr>
+              <w:spacing w:after="40"/>
+              <w:rPr>
+                <w:lang w:val="pt-BR"/>
+              </w:rPr>
+            </w:pPr>
+            <w:r>
+              <w:rPr>
+                <w:sz w:val="18"/>
+                <w:lang w:val="pt-BR"/>
+              </w:rPr>
+              <w:t>Verificar mensagens de erro e validação exibidas ao usuário</w:t>
+            </w:r>
+          </w:p>
+        </w:tc>
+        <w:tc>
+          <w:tcPr>
+            <w:tcW w:w="2232" w:type="dxa"/>
+            <w:vAlign w:val="center"/>
+          </w:tcPr>
+          <w:p>
+            <w:pPr>
+              <w:spacing w:after="40"/>
+              <w:rPr>
+                <w:lang w:val="pt-BR"/>
+              </w:rPr>
+            </w:pPr>
+          </w:p>
+        </w:tc>
+        <w:tc>
+          <w:tcPr>
+            <w:tcW w:w="1944" w:type="dxa"/>
+            <w:vAlign w:val="center"/>
+          </w:tcPr>
+          <w:p>
+            <w:pPr>
+              <w:spacing w:after="40"/>
+              <w:rPr>
+                <w:lang w:val="pt-BR"/>
+              </w:rPr>
+            </w:pPr>
+          </w:p>
+        </w:tc>
+        <w:tc>
+          <w:tcPr>
+            <w:tcW w:w="2088" w:type="dxa"/>
+            <w:vAlign w:val="center"/>
+          </w:tcPr>
+          <w:p>
+            <w:pPr>
+              <w:spacing w:after="40"/>
+              <w:rPr>
+                <w:lang w:val="pt-BR"/>
+              </w:rPr>
+            </w:pPr>
+          </w:p>
+        </w:tc>
+      </w:tr>
+    </w:tbl>
     <w:p>
       <w:pPr>
         <w:pStyle w:val="Ttulo1"/>
       </w:pPr>
       <w:proofErr w:type="spellStart"/>
       <w:r>
+        <w:lastRenderedPageBreak/>
         <w:t>Referências</w:t>
       </w:r>
       <w:proofErr w:type="spellEnd"/>
@@ -4998,6 +6790,12 @@
   </w:num>
   <w:num w:numId="9" w16cid:durableId="643317952">
     <w:abstractNumId w:val="0"/>
+  </w:num>
+  <w:num w:numId="10" w16cid:durableId="842940751">
+    <w:abstractNumId w:val="7"/>
+    <w:lvlOverride w:ilvl="0">
+      <w:startOverride w:val="3"/>
+    </w:lvlOverride>
   </w:num>
 </w:numbering>
 </file>
@@ -16710,7 +18508,12 @@
 </file>
 
 <file path=customXml/item1.xml><?xml version="1.0" encoding="utf-8"?>
-<b:Sources xmlns:b="http://schemas.openxmlformats.org/officeDocument/2006/bibliography" xmlns="http://schemas.openxmlformats.org/officeDocument/2006/bibliography" SelectedStyle="/APA.XSL" StyleName="APA"/>
+<?mso-contentType ?>
+<FormTemplates xmlns="http://schemas.microsoft.com/sharepoint/v3/contenttype/forms">
+  <Display>DocumentLibraryForm</Display>
+  <Edit>DocumentLibraryForm</Edit>
+  <New>DocumentLibraryForm</New>
+</FormTemplates>
 </file>
 
 <file path=customXml/item2.xml><?xml version="1.0" encoding="utf-8"?>
@@ -16896,12 +18699,7 @@
 </file>
 
 <file path=customXml/item3.xml><?xml version="1.0" encoding="utf-8"?>
-<?mso-contentType ?>
-<FormTemplates xmlns="http://schemas.microsoft.com/sharepoint/v3/contenttype/forms">
-  <Display>DocumentLibraryForm</Display>
-  <Edit>DocumentLibraryForm</Edit>
-  <New>DocumentLibraryForm</New>
-</FormTemplates>
+<b:Sources xmlns:b="http://schemas.openxmlformats.org/officeDocument/2006/bibliography" xmlns="http://schemas.openxmlformats.org/officeDocument/2006/bibliography" SelectedStyle="/APA.XSL" StyleName="APA"/>
 </file>
 
 <file path=customXml/item4.xml><?xml version="1.0" encoding="utf-8"?>
@@ -16913,9 +18711,9 @@
 </file>
 
 <file path=customXml/itemProps1.xml><?xml version="1.0" encoding="utf-8"?>
-<ds:datastoreItem xmlns:ds="http://schemas.openxmlformats.org/officeDocument/2006/customXml" ds:itemID="{EF278816-EC6F-A645-907D-7F25AECB1D4A}">
+<ds:datastoreItem xmlns:ds="http://schemas.openxmlformats.org/officeDocument/2006/customXml" ds:itemID="{3B3A98C9-8988-414E-91CD-0436DF0D92FA}">
   <ds:schemaRefs>
-    <ds:schemaRef ds:uri="http://schemas.openxmlformats.org/officeDocument/2006/bibliography"/>
+    <ds:schemaRef ds:uri="http://schemas.microsoft.com/sharepoint/v3/contenttype/forms"/>
   </ds:schemaRefs>
 </ds:datastoreItem>
 </file>
@@ -16939,9 +18737,9 @@
 </file>
 
 <file path=customXml/itemProps3.xml><?xml version="1.0" encoding="utf-8"?>
-<ds:datastoreItem xmlns:ds="http://schemas.openxmlformats.org/officeDocument/2006/customXml" ds:itemID="{3B3A98C9-8988-414E-91CD-0436DF0D92FA}">
+<ds:datastoreItem xmlns:ds="http://schemas.openxmlformats.org/officeDocument/2006/customXml" ds:itemID="{EF278816-EC6F-A645-907D-7F25AECB1D4A}">
   <ds:schemaRefs>
-    <ds:schemaRef ds:uri="http://schemas.microsoft.com/sharepoint/v3/contenttype/forms"/>
+    <ds:schemaRef ds:uri="http://schemas.openxmlformats.org/officeDocument/2006/bibliography"/>
   </ds:schemaRefs>
 </ds:datastoreItem>
 </file>

</xml_diff>

<commit_message>
🚀 rocket: V1.1 com redefinicao de senha
</commit_message>
<xml_diff>
--- a/PlanoDeTestes/Plano_De_Testes.docx
+++ b/PlanoDeTestes/Plano_De_Testes.docx
@@ -282,7 +282,13 @@
               <w:rPr>
                 <w:sz w:val="22"/>
               </w:rPr>
-              <w:t>1.0</w:t>
+              <w:t>1.</w:t>
+            </w:r>
+            <w:r>
+              <w:rPr>
+                <w:sz w:val="22"/>
+              </w:rPr>
+              <w:t>1</w:t>
             </w:r>
           </w:p>
         </w:tc>
@@ -321,7 +327,25 @@
               <w:rPr>
                 <w:sz w:val="22"/>
               </w:rPr>
-              <w:t>28/08/2026</w:t>
+              <w:t>09</w:t>
+            </w:r>
+            <w:r>
+              <w:rPr>
+                <w:sz w:val="22"/>
+              </w:rPr>
+              <w:t>/0</w:t>
+            </w:r>
+            <w:r>
+              <w:rPr>
+                <w:sz w:val="22"/>
+              </w:rPr>
+              <w:t>9</w:t>
+            </w:r>
+            <w:r>
+              <w:rPr>
+                <w:sz w:val="22"/>
+              </w:rPr>
+              <w:t>/2026</w:t>
             </w:r>
           </w:p>
         </w:tc>
@@ -4718,12 +4742,15 @@
             <w:pPr>
               <w:spacing w:after="40"/>
               <w:rPr>
-                <w:lang w:val="pt-BR"/>
-              </w:rPr>
-            </w:pPr>
-            <w:r>
-              <w:rPr>
-                <w:sz w:val="18"/>
+                <w:sz w:val="20"/>
+                <w:szCs w:val="20"/>
+                <w:lang w:val="pt-BR"/>
+              </w:rPr>
+            </w:pPr>
+            <w:r>
+              <w:rPr>
+                <w:sz w:val="20"/>
+                <w:szCs w:val="20"/>
                 <w:lang w:val="pt-BR"/>
               </w:rPr>
               <w:t>Acessar a tela de login</w:t>
@@ -4739,9 +4766,19 @@
             <w:pPr>
               <w:spacing w:after="40"/>
               <w:rPr>
-                <w:lang w:val="pt-BR"/>
-              </w:rPr>
-            </w:pPr>
+                <w:sz w:val="20"/>
+                <w:szCs w:val="20"/>
+                <w:lang w:val="pt-BR"/>
+              </w:rPr>
+            </w:pPr>
+            <w:r>
+              <w:rPr>
+                <w:sz w:val="20"/>
+                <w:szCs w:val="20"/>
+                <w:lang w:val="pt-BR"/>
+              </w:rPr>
+              <w:t>Acesso sucedido</w:t>
+            </w:r>
           </w:p>
         </w:tc>
         <w:tc>
@@ -4753,9 +4790,19 @@
             <w:pPr>
               <w:spacing w:after="40"/>
               <w:rPr>
-                <w:lang w:val="pt-BR"/>
-              </w:rPr>
-            </w:pPr>
+                <w:sz w:val="20"/>
+                <w:szCs w:val="20"/>
+                <w:lang w:val="pt-BR"/>
+              </w:rPr>
+            </w:pPr>
+            <w:r>
+              <w:rPr>
+                <w:sz w:val="20"/>
+                <w:szCs w:val="20"/>
+                <w:lang w:val="pt-BR"/>
+              </w:rPr>
+              <w:t>Aprovado</w:t>
+            </w:r>
           </w:p>
         </w:tc>
         <w:tc>
@@ -4767,9 +4814,19 @@
             <w:pPr>
               <w:spacing w:after="40"/>
               <w:rPr>
-                <w:lang w:val="pt-BR"/>
-              </w:rPr>
-            </w:pPr>
+                <w:sz w:val="20"/>
+                <w:szCs w:val="20"/>
+                <w:lang w:val="pt-BR"/>
+              </w:rPr>
+            </w:pPr>
+            <w:r>
+              <w:rPr>
+                <w:sz w:val="20"/>
+                <w:szCs w:val="20"/>
+                <w:lang w:val="pt-BR"/>
+              </w:rPr>
+              <w:t>Em conformidade</w:t>
+            </w:r>
           </w:p>
         </w:tc>
       </w:tr>
@@ -4803,12 +4860,15 @@
             <w:pPr>
               <w:spacing w:after="40"/>
               <w:rPr>
-                <w:lang w:val="pt-BR"/>
-              </w:rPr>
-            </w:pPr>
-            <w:r>
-              <w:rPr>
-                <w:sz w:val="18"/>
+                <w:sz w:val="20"/>
+                <w:szCs w:val="20"/>
+                <w:lang w:val="pt-BR"/>
+              </w:rPr>
+            </w:pPr>
+            <w:r>
+              <w:rPr>
+                <w:sz w:val="20"/>
+                <w:szCs w:val="20"/>
                 <w:lang w:val="pt-BR"/>
               </w:rPr>
               <w:t>Realizar login com e-mail e senha válidos</w:t>
@@ -4824,9 +4884,29 @@
             <w:pPr>
               <w:spacing w:after="40"/>
               <w:rPr>
-                <w:lang w:val="pt-BR"/>
-              </w:rPr>
-            </w:pPr>
+                <w:sz w:val="20"/>
+                <w:szCs w:val="20"/>
+                <w:lang w:val="pt-BR"/>
+              </w:rPr>
+            </w:pPr>
+            <w:r>
+              <w:rPr>
+                <w:sz w:val="20"/>
+                <w:szCs w:val="20"/>
+                <w:lang w:val="pt-BR"/>
+              </w:rPr>
+              <w:t xml:space="preserve">Login </w:t>
+            </w:r>
+            <w:proofErr w:type="gramStart"/>
+            <w:r>
+              <w:rPr>
+                <w:sz w:val="20"/>
+                <w:szCs w:val="20"/>
+                <w:lang w:val="pt-BR"/>
+              </w:rPr>
+              <w:t>bem sucedido</w:t>
+            </w:r>
+            <w:proofErr w:type="gramEnd"/>
           </w:p>
         </w:tc>
         <w:tc>
@@ -4838,9 +4918,19 @@
             <w:pPr>
               <w:spacing w:after="40"/>
               <w:rPr>
-                <w:lang w:val="pt-BR"/>
-              </w:rPr>
-            </w:pPr>
+                <w:sz w:val="20"/>
+                <w:szCs w:val="20"/>
+                <w:lang w:val="pt-BR"/>
+              </w:rPr>
+            </w:pPr>
+            <w:r>
+              <w:rPr>
+                <w:sz w:val="20"/>
+                <w:szCs w:val="20"/>
+                <w:lang w:val="pt-BR"/>
+              </w:rPr>
+              <w:t>Aprovado</w:t>
+            </w:r>
           </w:p>
         </w:tc>
         <w:tc>
@@ -4852,9 +4942,19 @@
             <w:pPr>
               <w:spacing w:after="40"/>
               <w:rPr>
-                <w:lang w:val="pt-BR"/>
-              </w:rPr>
-            </w:pPr>
+                <w:sz w:val="20"/>
+                <w:szCs w:val="20"/>
+                <w:lang w:val="pt-BR"/>
+              </w:rPr>
+            </w:pPr>
+            <w:r>
+              <w:rPr>
+                <w:sz w:val="20"/>
+                <w:szCs w:val="20"/>
+                <w:lang w:val="pt-BR"/>
+              </w:rPr>
+              <w:t>Em conformidade</w:t>
+            </w:r>
           </w:p>
         </w:tc>
       </w:tr>
@@ -4888,12 +4988,15 @@
             <w:pPr>
               <w:spacing w:after="40"/>
               <w:rPr>
-                <w:lang w:val="pt-BR"/>
-              </w:rPr>
-            </w:pPr>
-            <w:r>
-              <w:rPr>
-                <w:sz w:val="18"/>
+                <w:sz w:val="20"/>
+                <w:szCs w:val="20"/>
+                <w:lang w:val="pt-BR"/>
+              </w:rPr>
+            </w:pPr>
+            <w:r>
+              <w:rPr>
+                <w:sz w:val="20"/>
+                <w:szCs w:val="20"/>
                 <w:lang w:val="pt-BR"/>
               </w:rPr>
               <w:t>Tentar login com e-mail ou senha inválidos</w:t>
@@ -4909,9 +5012,19 @@
             <w:pPr>
               <w:spacing w:after="40"/>
               <w:rPr>
-                <w:lang w:val="pt-BR"/>
-              </w:rPr>
-            </w:pPr>
+                <w:sz w:val="20"/>
+                <w:szCs w:val="20"/>
+                <w:lang w:val="pt-BR"/>
+              </w:rPr>
+            </w:pPr>
+            <w:r>
+              <w:rPr>
+                <w:sz w:val="20"/>
+                <w:szCs w:val="20"/>
+                <w:lang w:val="pt-BR"/>
+              </w:rPr>
+              <w:t>Pop-up notificando e-mail ou senha inválidos</w:t>
+            </w:r>
           </w:p>
         </w:tc>
         <w:tc>
@@ -4923,9 +5036,27 @@
             <w:pPr>
               <w:spacing w:after="40"/>
               <w:rPr>
-                <w:lang w:val="pt-BR"/>
-              </w:rPr>
-            </w:pPr>
+                <w:sz w:val="20"/>
+                <w:szCs w:val="20"/>
+                <w:lang w:val="pt-BR"/>
+              </w:rPr>
+            </w:pPr>
+            <w:r>
+              <w:rPr>
+                <w:sz w:val="20"/>
+                <w:szCs w:val="20"/>
+                <w:lang w:val="pt-BR"/>
+              </w:rPr>
+              <w:t>A</w:t>
+            </w:r>
+            <w:r>
+              <w:rPr>
+                <w:sz w:val="20"/>
+                <w:szCs w:val="20"/>
+                <w:lang w:val="pt-BR"/>
+              </w:rPr>
+              <w:t>provado</w:t>
+            </w:r>
           </w:p>
         </w:tc>
         <w:tc>
@@ -4937,9 +5068,19 @@
             <w:pPr>
               <w:spacing w:after="40"/>
               <w:rPr>
-                <w:lang w:val="pt-BR"/>
-              </w:rPr>
-            </w:pPr>
+                <w:sz w:val="20"/>
+                <w:szCs w:val="20"/>
+                <w:lang w:val="pt-BR"/>
+              </w:rPr>
+            </w:pPr>
+            <w:r>
+              <w:rPr>
+                <w:sz w:val="20"/>
+                <w:szCs w:val="20"/>
+                <w:lang w:val="pt-BR"/>
+              </w:rPr>
+              <w:t>Em conformidade</w:t>
+            </w:r>
           </w:p>
         </w:tc>
       </w:tr>
@@ -4973,12 +5114,15 @@
             <w:pPr>
               <w:spacing w:after="40"/>
               <w:rPr>
-                <w:lang w:val="pt-BR"/>
-              </w:rPr>
-            </w:pPr>
-            <w:r>
-              <w:rPr>
-                <w:sz w:val="18"/>
+                <w:sz w:val="20"/>
+                <w:szCs w:val="20"/>
+                <w:lang w:val="pt-BR"/>
+              </w:rPr>
+            </w:pPr>
+            <w:r>
+              <w:rPr>
+                <w:sz w:val="20"/>
+                <w:szCs w:val="20"/>
                 <w:lang w:val="pt-BR"/>
               </w:rPr>
               <w:t>Tentar login com campos obrigatórios vazios</w:t>
@@ -4994,9 +5138,19 @@
             <w:pPr>
               <w:spacing w:after="40"/>
               <w:rPr>
-                <w:lang w:val="pt-BR"/>
-              </w:rPr>
-            </w:pPr>
+                <w:sz w:val="20"/>
+                <w:szCs w:val="20"/>
+                <w:lang w:val="pt-BR"/>
+              </w:rPr>
+            </w:pPr>
+            <w:r>
+              <w:rPr>
+                <w:sz w:val="20"/>
+                <w:szCs w:val="20"/>
+                <w:lang w:val="pt-BR"/>
+              </w:rPr>
+              <w:t>Pop-up notificando campos obrigatórios ausentes</w:t>
+            </w:r>
           </w:p>
         </w:tc>
         <w:tc>
@@ -5008,9 +5162,19 @@
             <w:pPr>
               <w:spacing w:after="40"/>
               <w:rPr>
-                <w:lang w:val="pt-BR"/>
-              </w:rPr>
-            </w:pPr>
+                <w:sz w:val="20"/>
+                <w:szCs w:val="20"/>
+                <w:lang w:val="pt-BR"/>
+              </w:rPr>
+            </w:pPr>
+            <w:r>
+              <w:rPr>
+                <w:sz w:val="20"/>
+                <w:szCs w:val="20"/>
+                <w:lang w:val="pt-BR"/>
+              </w:rPr>
+              <w:t>Aprovado</w:t>
+            </w:r>
           </w:p>
         </w:tc>
         <w:tc>
@@ -5022,9 +5186,19 @@
             <w:pPr>
               <w:spacing w:after="40"/>
               <w:rPr>
-                <w:lang w:val="pt-BR"/>
-              </w:rPr>
-            </w:pPr>
+                <w:sz w:val="20"/>
+                <w:szCs w:val="20"/>
+                <w:lang w:val="pt-BR"/>
+              </w:rPr>
+            </w:pPr>
+            <w:r>
+              <w:rPr>
+                <w:sz w:val="20"/>
+                <w:szCs w:val="20"/>
+                <w:lang w:val="pt-BR"/>
+              </w:rPr>
+              <w:t>Em conformidade</w:t>
+            </w:r>
           </w:p>
         </w:tc>
       </w:tr>
@@ -5058,12 +5232,15 @@
             <w:pPr>
               <w:spacing w:after="40"/>
               <w:rPr>
-                <w:lang w:val="pt-BR"/>
-              </w:rPr>
-            </w:pPr>
-            <w:r>
-              <w:rPr>
-                <w:sz w:val="18"/>
+                <w:sz w:val="20"/>
+                <w:szCs w:val="20"/>
+                <w:lang w:val="pt-BR"/>
+              </w:rPr>
+            </w:pPr>
+            <w:r>
+              <w:rPr>
+                <w:sz w:val="20"/>
+                <w:szCs w:val="20"/>
                 <w:lang w:val="pt-BR"/>
               </w:rPr>
               <w:t>Verificar bloqueio de acesso sem login válido</w:t>
@@ -5079,9 +5256,29 @@
             <w:pPr>
               <w:spacing w:after="40"/>
               <w:rPr>
-                <w:lang w:val="pt-BR"/>
-              </w:rPr>
-            </w:pPr>
+                <w:sz w:val="20"/>
+                <w:szCs w:val="20"/>
+                <w:lang w:val="pt-BR"/>
+              </w:rPr>
+            </w:pPr>
+            <w:r>
+              <w:rPr>
+                <w:sz w:val="20"/>
+                <w:szCs w:val="20"/>
+                <w:lang w:val="pt-BR"/>
+              </w:rPr>
+              <w:t xml:space="preserve">Sistema </w:t>
+            </w:r>
+            <w:proofErr w:type="spellStart"/>
+            <w:r>
+              <w:rPr>
+                <w:sz w:val="20"/>
+                <w:szCs w:val="20"/>
+                <w:lang w:val="pt-BR"/>
+              </w:rPr>
+              <w:t>inacessivel</w:t>
+            </w:r>
+            <w:proofErr w:type="spellEnd"/>
           </w:p>
         </w:tc>
         <w:tc>
@@ -5093,9 +5290,19 @@
             <w:pPr>
               <w:spacing w:after="40"/>
               <w:rPr>
-                <w:lang w:val="pt-BR"/>
-              </w:rPr>
-            </w:pPr>
+                <w:sz w:val="20"/>
+                <w:szCs w:val="20"/>
+                <w:lang w:val="pt-BR"/>
+              </w:rPr>
+            </w:pPr>
+            <w:r>
+              <w:rPr>
+                <w:sz w:val="20"/>
+                <w:szCs w:val="20"/>
+                <w:lang w:val="pt-BR"/>
+              </w:rPr>
+              <w:t>Aprovado</w:t>
+            </w:r>
           </w:p>
         </w:tc>
         <w:tc>
@@ -5107,9 +5314,19 @@
             <w:pPr>
               <w:spacing w:after="40"/>
               <w:rPr>
-                <w:lang w:val="pt-BR"/>
-              </w:rPr>
-            </w:pPr>
+                <w:sz w:val="20"/>
+                <w:szCs w:val="20"/>
+                <w:lang w:val="pt-BR"/>
+              </w:rPr>
+            </w:pPr>
+            <w:r>
+              <w:rPr>
+                <w:sz w:val="20"/>
+                <w:szCs w:val="20"/>
+                <w:lang w:val="pt-BR"/>
+              </w:rPr>
+              <w:t>Em conformidade</w:t>
+            </w:r>
           </w:p>
         </w:tc>
       </w:tr>
@@ -5143,12 +5360,15 @@
             <w:pPr>
               <w:spacing w:after="40"/>
               <w:rPr>
-                <w:lang w:val="pt-BR"/>
-              </w:rPr>
-            </w:pPr>
-            <w:r>
-              <w:rPr>
-                <w:sz w:val="18"/>
+                <w:sz w:val="20"/>
+                <w:szCs w:val="20"/>
+                <w:lang w:val="pt-BR"/>
+              </w:rPr>
+            </w:pPr>
+            <w:r>
+              <w:rPr>
+                <w:sz w:val="20"/>
+                <w:szCs w:val="20"/>
                 <w:lang w:val="pt-BR"/>
               </w:rPr>
               <w:t>Cadastrar usuário com dados válidos</w:t>
@@ -5164,9 +5384,19 @@
             <w:pPr>
               <w:spacing w:after="40"/>
               <w:rPr>
-                <w:lang w:val="pt-BR"/>
-              </w:rPr>
-            </w:pPr>
+                <w:sz w:val="20"/>
+                <w:szCs w:val="20"/>
+                <w:lang w:val="pt-BR"/>
+              </w:rPr>
+            </w:pPr>
+            <w:r>
+              <w:rPr>
+                <w:sz w:val="20"/>
+                <w:szCs w:val="20"/>
+                <w:lang w:val="pt-BR"/>
+              </w:rPr>
+              <w:t>Pop-up notificando dados inválidos</w:t>
+            </w:r>
           </w:p>
         </w:tc>
         <w:tc>
@@ -5178,9 +5408,19 @@
             <w:pPr>
               <w:spacing w:after="40"/>
               <w:rPr>
-                <w:lang w:val="pt-BR"/>
-              </w:rPr>
-            </w:pPr>
+                <w:sz w:val="20"/>
+                <w:szCs w:val="20"/>
+                <w:lang w:val="pt-BR"/>
+              </w:rPr>
+            </w:pPr>
+            <w:r>
+              <w:rPr>
+                <w:sz w:val="20"/>
+                <w:szCs w:val="20"/>
+                <w:lang w:val="pt-BR"/>
+              </w:rPr>
+              <w:t>Aprovado</w:t>
+            </w:r>
           </w:p>
         </w:tc>
         <w:tc>
@@ -5192,9 +5432,19 @@
             <w:pPr>
               <w:spacing w:after="40"/>
               <w:rPr>
-                <w:lang w:val="pt-BR"/>
-              </w:rPr>
-            </w:pPr>
+                <w:sz w:val="20"/>
+                <w:szCs w:val="20"/>
+                <w:lang w:val="pt-BR"/>
+              </w:rPr>
+            </w:pPr>
+            <w:r>
+              <w:rPr>
+                <w:sz w:val="20"/>
+                <w:szCs w:val="20"/>
+                <w:lang w:val="pt-BR"/>
+              </w:rPr>
+              <w:t>Em conformidade</w:t>
+            </w:r>
           </w:p>
         </w:tc>
       </w:tr>
@@ -5228,12 +5478,15 @@
             <w:pPr>
               <w:spacing w:after="40"/>
               <w:rPr>
-                <w:lang w:val="pt-BR"/>
-              </w:rPr>
-            </w:pPr>
-            <w:r>
-              <w:rPr>
-                <w:sz w:val="18"/>
+                <w:sz w:val="20"/>
+                <w:szCs w:val="20"/>
+                <w:lang w:val="pt-BR"/>
+              </w:rPr>
+            </w:pPr>
+            <w:r>
+              <w:rPr>
+                <w:sz w:val="20"/>
+                <w:szCs w:val="20"/>
                 <w:lang w:val="pt-BR"/>
               </w:rPr>
               <w:t>Cadastrar usuário com nome vazio</w:t>
@@ -5249,9 +5502,37 @@
             <w:pPr>
               <w:spacing w:after="40"/>
               <w:rPr>
-                <w:lang w:val="pt-BR"/>
-              </w:rPr>
-            </w:pPr>
+                <w:sz w:val="20"/>
+                <w:szCs w:val="20"/>
+                <w:lang w:val="pt-BR"/>
+              </w:rPr>
+            </w:pPr>
+            <w:r>
+              <w:rPr>
+                <w:sz w:val="20"/>
+                <w:szCs w:val="20"/>
+                <w:lang w:val="pt-BR"/>
+              </w:rPr>
+              <w:t xml:space="preserve">Pop-up </w:t>
+            </w:r>
+            <w:proofErr w:type="spellStart"/>
+            <w:r>
+              <w:rPr>
+                <w:sz w:val="20"/>
+                <w:szCs w:val="20"/>
+                <w:lang w:val="pt-BR"/>
+              </w:rPr>
+              <w:t>requerindo</w:t>
+            </w:r>
+            <w:proofErr w:type="spellEnd"/>
+            <w:r>
+              <w:rPr>
+                <w:sz w:val="20"/>
+                <w:szCs w:val="20"/>
+                <w:lang w:val="pt-BR"/>
+              </w:rPr>
+              <w:t xml:space="preserve"> o preenchimento do campo</w:t>
+            </w:r>
           </w:p>
         </w:tc>
         <w:tc>
@@ -5263,9 +5544,19 @@
             <w:pPr>
               <w:spacing w:after="40"/>
               <w:rPr>
-                <w:lang w:val="pt-BR"/>
-              </w:rPr>
-            </w:pPr>
+                <w:sz w:val="20"/>
+                <w:szCs w:val="20"/>
+                <w:lang w:val="pt-BR"/>
+              </w:rPr>
+            </w:pPr>
+            <w:r>
+              <w:rPr>
+                <w:sz w:val="20"/>
+                <w:szCs w:val="20"/>
+                <w:lang w:val="pt-BR"/>
+              </w:rPr>
+              <w:t>Aprovado</w:t>
+            </w:r>
           </w:p>
         </w:tc>
         <w:tc>
@@ -5277,9 +5568,19 @@
             <w:pPr>
               <w:spacing w:after="40"/>
               <w:rPr>
-                <w:lang w:val="pt-BR"/>
-              </w:rPr>
-            </w:pPr>
+                <w:sz w:val="20"/>
+                <w:szCs w:val="20"/>
+                <w:lang w:val="pt-BR"/>
+              </w:rPr>
+            </w:pPr>
+            <w:r>
+              <w:rPr>
+                <w:sz w:val="20"/>
+                <w:szCs w:val="20"/>
+                <w:lang w:val="pt-BR"/>
+              </w:rPr>
+              <w:t>Em conformidade</w:t>
+            </w:r>
           </w:p>
         </w:tc>
       </w:tr>
@@ -5313,12 +5614,15 @@
             <w:pPr>
               <w:spacing w:after="40"/>
               <w:rPr>
-                <w:lang w:val="pt-BR"/>
-              </w:rPr>
-            </w:pPr>
-            <w:r>
-              <w:rPr>
-                <w:sz w:val="18"/>
+                <w:sz w:val="20"/>
+                <w:szCs w:val="20"/>
+                <w:lang w:val="pt-BR"/>
+              </w:rPr>
+            </w:pPr>
+            <w:r>
+              <w:rPr>
+                <w:sz w:val="20"/>
+                <w:szCs w:val="20"/>
                 <w:lang w:val="pt-BR"/>
               </w:rPr>
               <w:t>Cadastrar usuário com e-mail vazio ou inválido</w:t>
@@ -5334,9 +5638,19 @@
             <w:pPr>
               <w:spacing w:after="40"/>
               <w:rPr>
-                <w:lang w:val="pt-BR"/>
-              </w:rPr>
-            </w:pPr>
+                <w:sz w:val="20"/>
+                <w:szCs w:val="20"/>
+                <w:lang w:val="pt-BR"/>
+              </w:rPr>
+            </w:pPr>
+            <w:r>
+              <w:rPr>
+                <w:sz w:val="20"/>
+                <w:szCs w:val="20"/>
+                <w:lang w:val="pt-BR"/>
+              </w:rPr>
+              <w:t>Pop-up notificando a causa do erro</w:t>
+            </w:r>
           </w:p>
         </w:tc>
         <w:tc>
@@ -5348,9 +5662,19 @@
             <w:pPr>
               <w:spacing w:after="40"/>
               <w:rPr>
-                <w:lang w:val="pt-BR"/>
-              </w:rPr>
-            </w:pPr>
+                <w:sz w:val="20"/>
+                <w:szCs w:val="20"/>
+                <w:lang w:val="pt-BR"/>
+              </w:rPr>
+            </w:pPr>
+            <w:r>
+              <w:rPr>
+                <w:sz w:val="20"/>
+                <w:szCs w:val="20"/>
+                <w:lang w:val="pt-BR"/>
+              </w:rPr>
+              <w:t>Aprovado</w:t>
+            </w:r>
           </w:p>
         </w:tc>
         <w:tc>
@@ -5362,9 +5686,19 @@
             <w:pPr>
               <w:spacing w:after="40"/>
               <w:rPr>
-                <w:lang w:val="pt-BR"/>
-              </w:rPr>
-            </w:pPr>
+                <w:sz w:val="20"/>
+                <w:szCs w:val="20"/>
+                <w:lang w:val="pt-BR"/>
+              </w:rPr>
+            </w:pPr>
+            <w:r>
+              <w:rPr>
+                <w:sz w:val="20"/>
+                <w:szCs w:val="20"/>
+                <w:lang w:val="pt-BR"/>
+              </w:rPr>
+              <w:t>Em conformidade</w:t>
+            </w:r>
           </w:p>
         </w:tc>
       </w:tr>
@@ -5398,12 +5732,15 @@
             <w:pPr>
               <w:spacing w:after="40"/>
               <w:rPr>
-                <w:lang w:val="pt-BR"/>
-              </w:rPr>
-            </w:pPr>
-            <w:r>
-              <w:rPr>
-                <w:sz w:val="18"/>
+                <w:sz w:val="20"/>
+                <w:szCs w:val="20"/>
+                <w:lang w:val="pt-BR"/>
+              </w:rPr>
+            </w:pPr>
+            <w:r>
+              <w:rPr>
+                <w:sz w:val="20"/>
+                <w:szCs w:val="20"/>
                 <w:lang w:val="pt-BR"/>
               </w:rPr>
               <w:t>Cadastrar usuário com e-mail duplicado</w:t>
@@ -5419,9 +5756,19 @@
             <w:pPr>
               <w:spacing w:after="40"/>
               <w:rPr>
-                <w:lang w:val="pt-BR"/>
-              </w:rPr>
-            </w:pPr>
+                <w:sz w:val="20"/>
+                <w:szCs w:val="20"/>
+                <w:lang w:val="pt-BR"/>
+              </w:rPr>
+            </w:pPr>
+            <w:r>
+              <w:rPr>
+                <w:sz w:val="20"/>
+                <w:szCs w:val="20"/>
+                <w:lang w:val="pt-BR"/>
+              </w:rPr>
+              <w:t>Pop-up notificando e-mail duplicado</w:t>
+            </w:r>
           </w:p>
         </w:tc>
         <w:tc>
@@ -5433,9 +5780,19 @@
             <w:pPr>
               <w:spacing w:after="40"/>
               <w:rPr>
-                <w:lang w:val="pt-BR"/>
-              </w:rPr>
-            </w:pPr>
+                <w:sz w:val="20"/>
+                <w:szCs w:val="20"/>
+                <w:lang w:val="pt-BR"/>
+              </w:rPr>
+            </w:pPr>
+            <w:r>
+              <w:rPr>
+                <w:sz w:val="20"/>
+                <w:szCs w:val="20"/>
+                <w:lang w:val="pt-BR"/>
+              </w:rPr>
+              <w:t>Aprovado</w:t>
+            </w:r>
           </w:p>
         </w:tc>
         <w:tc>
@@ -5447,9 +5804,19 @@
             <w:pPr>
               <w:spacing w:after="40"/>
               <w:rPr>
-                <w:lang w:val="pt-BR"/>
-              </w:rPr>
-            </w:pPr>
+                <w:sz w:val="20"/>
+                <w:szCs w:val="20"/>
+                <w:lang w:val="pt-BR"/>
+              </w:rPr>
+            </w:pPr>
+            <w:r>
+              <w:rPr>
+                <w:sz w:val="20"/>
+                <w:szCs w:val="20"/>
+                <w:lang w:val="pt-BR"/>
+              </w:rPr>
+              <w:t>Em conformidade</w:t>
+            </w:r>
           </w:p>
         </w:tc>
       </w:tr>
@@ -5483,12 +5850,15 @@
             <w:pPr>
               <w:spacing w:after="40"/>
               <w:rPr>
-                <w:lang w:val="pt-BR"/>
-              </w:rPr>
-            </w:pPr>
-            <w:r>
-              <w:rPr>
-                <w:sz w:val="18"/>
+                <w:sz w:val="20"/>
+                <w:szCs w:val="20"/>
+                <w:lang w:val="pt-BR"/>
+              </w:rPr>
+            </w:pPr>
+            <w:r>
+              <w:rPr>
+                <w:sz w:val="20"/>
+                <w:szCs w:val="20"/>
                 <w:lang w:val="pt-BR"/>
               </w:rPr>
               <w:t>Cadastrar usuário com senha vazia ou fraca</w:t>
@@ -5504,9 +5874,19 @@
             <w:pPr>
               <w:spacing w:after="40"/>
               <w:rPr>
-                <w:lang w:val="pt-BR"/>
-              </w:rPr>
-            </w:pPr>
+                <w:sz w:val="20"/>
+                <w:szCs w:val="20"/>
+                <w:lang w:val="pt-BR"/>
+              </w:rPr>
+            </w:pPr>
+            <w:r>
+              <w:rPr>
+                <w:sz w:val="20"/>
+                <w:szCs w:val="20"/>
+                <w:lang w:val="pt-BR"/>
+              </w:rPr>
+              <w:t>Pop-up notificando senha fraca</w:t>
+            </w:r>
           </w:p>
         </w:tc>
         <w:tc>
@@ -5518,9 +5898,19 @@
             <w:pPr>
               <w:spacing w:after="40"/>
               <w:rPr>
-                <w:lang w:val="pt-BR"/>
-              </w:rPr>
-            </w:pPr>
+                <w:sz w:val="20"/>
+                <w:szCs w:val="20"/>
+                <w:lang w:val="pt-BR"/>
+              </w:rPr>
+            </w:pPr>
+            <w:r>
+              <w:rPr>
+                <w:sz w:val="20"/>
+                <w:szCs w:val="20"/>
+                <w:lang w:val="pt-BR"/>
+              </w:rPr>
+              <w:t>Aprovado</w:t>
+            </w:r>
           </w:p>
         </w:tc>
         <w:tc>
@@ -5532,9 +5922,19 @@
             <w:pPr>
               <w:spacing w:after="40"/>
               <w:rPr>
-                <w:lang w:val="pt-BR"/>
-              </w:rPr>
-            </w:pPr>
+                <w:sz w:val="20"/>
+                <w:szCs w:val="20"/>
+                <w:lang w:val="pt-BR"/>
+              </w:rPr>
+            </w:pPr>
+            <w:r>
+              <w:rPr>
+                <w:sz w:val="20"/>
+                <w:szCs w:val="20"/>
+                <w:lang w:val="pt-BR"/>
+              </w:rPr>
+              <w:t>Em conformidade</w:t>
+            </w:r>
           </w:p>
         </w:tc>
       </w:tr>
@@ -5568,12 +5968,15 @@
             <w:pPr>
               <w:spacing w:after="40"/>
               <w:rPr>
-                <w:lang w:val="pt-BR"/>
-              </w:rPr>
-            </w:pPr>
-            <w:r>
-              <w:rPr>
-                <w:sz w:val="18"/>
+                <w:sz w:val="20"/>
+                <w:szCs w:val="20"/>
+                <w:lang w:val="pt-BR"/>
+              </w:rPr>
+            </w:pPr>
+            <w:r>
+              <w:rPr>
+                <w:sz w:val="20"/>
+                <w:szCs w:val="20"/>
                 <w:lang w:val="pt-BR"/>
               </w:rPr>
               <w:t>Visualizar identificação do usuário logado</w:t>
@@ -5589,9 +5992,19 @@
             <w:pPr>
               <w:spacing w:after="40"/>
               <w:rPr>
-                <w:lang w:val="pt-BR"/>
-              </w:rPr>
-            </w:pPr>
+                <w:sz w:val="20"/>
+                <w:szCs w:val="20"/>
+                <w:lang w:val="pt-BR"/>
+              </w:rPr>
+            </w:pPr>
+            <w:r>
+              <w:rPr>
+                <w:sz w:val="20"/>
+                <w:szCs w:val="20"/>
+                <w:lang w:val="pt-BR"/>
+              </w:rPr>
+              <w:t>Visualizar o próprio nome e perfil</w:t>
+            </w:r>
           </w:p>
         </w:tc>
         <w:tc>
@@ -5603,9 +6016,19 @@
             <w:pPr>
               <w:spacing w:after="40"/>
               <w:rPr>
-                <w:lang w:val="pt-BR"/>
-              </w:rPr>
-            </w:pPr>
+                <w:sz w:val="20"/>
+                <w:szCs w:val="20"/>
+                <w:lang w:val="pt-BR"/>
+              </w:rPr>
+            </w:pPr>
+            <w:r>
+              <w:rPr>
+                <w:sz w:val="20"/>
+                <w:szCs w:val="20"/>
+                <w:lang w:val="pt-BR"/>
+              </w:rPr>
+              <w:t>Aprovado</w:t>
+            </w:r>
           </w:p>
         </w:tc>
         <w:tc>
@@ -5617,9 +6040,19 @@
             <w:pPr>
               <w:spacing w:after="40"/>
               <w:rPr>
-                <w:lang w:val="pt-BR"/>
-              </w:rPr>
-            </w:pPr>
+                <w:sz w:val="20"/>
+                <w:szCs w:val="20"/>
+                <w:lang w:val="pt-BR"/>
+              </w:rPr>
+            </w:pPr>
+            <w:r>
+              <w:rPr>
+                <w:sz w:val="20"/>
+                <w:szCs w:val="20"/>
+                <w:lang w:val="pt-BR"/>
+              </w:rPr>
+              <w:t>Em conformidade</w:t>
+            </w:r>
           </w:p>
         </w:tc>
       </w:tr>
@@ -5653,12 +6086,15 @@
             <w:pPr>
               <w:spacing w:after="40"/>
               <w:rPr>
-                <w:lang w:val="pt-BR"/>
-              </w:rPr>
-            </w:pPr>
-            <w:r>
-              <w:rPr>
-                <w:sz w:val="18"/>
+                <w:sz w:val="20"/>
+                <w:szCs w:val="20"/>
+                <w:lang w:val="pt-BR"/>
+              </w:rPr>
+            </w:pPr>
+            <w:r>
+              <w:rPr>
+                <w:sz w:val="20"/>
+                <w:szCs w:val="20"/>
                 <w:lang w:val="pt-BR"/>
               </w:rPr>
               <w:t>Visualizar todas as transações enviadas e recebidas</w:t>
@@ -5674,9 +6110,19 @@
             <w:pPr>
               <w:spacing w:after="40"/>
               <w:rPr>
-                <w:lang w:val="pt-BR"/>
-              </w:rPr>
-            </w:pPr>
+                <w:sz w:val="20"/>
+                <w:szCs w:val="20"/>
+                <w:lang w:val="pt-BR"/>
+              </w:rPr>
+            </w:pPr>
+            <w:r>
+              <w:rPr>
+                <w:sz w:val="20"/>
+                <w:szCs w:val="20"/>
+                <w:lang w:val="pt-BR"/>
+              </w:rPr>
+              <w:t>Visualizar todas as transações</w:t>
+            </w:r>
           </w:p>
         </w:tc>
         <w:tc>
@@ -5688,9 +6134,19 @@
             <w:pPr>
               <w:spacing w:after="40"/>
               <w:rPr>
-                <w:lang w:val="pt-BR"/>
-              </w:rPr>
-            </w:pPr>
+                <w:sz w:val="20"/>
+                <w:szCs w:val="20"/>
+                <w:lang w:val="pt-BR"/>
+              </w:rPr>
+            </w:pPr>
+            <w:r>
+              <w:rPr>
+                <w:sz w:val="20"/>
+                <w:szCs w:val="20"/>
+                <w:lang w:val="pt-BR"/>
+              </w:rPr>
+              <w:t>Aprovado</w:t>
+            </w:r>
           </w:p>
         </w:tc>
         <w:tc>
@@ -5702,9 +6158,19 @@
             <w:pPr>
               <w:spacing w:after="40"/>
               <w:rPr>
-                <w:lang w:val="pt-BR"/>
-              </w:rPr>
-            </w:pPr>
+                <w:sz w:val="20"/>
+                <w:szCs w:val="20"/>
+                <w:lang w:val="pt-BR"/>
+              </w:rPr>
+            </w:pPr>
+            <w:r>
+              <w:rPr>
+                <w:sz w:val="20"/>
+                <w:szCs w:val="20"/>
+                <w:lang w:val="pt-BR"/>
+              </w:rPr>
+              <w:t>Em conformidade</w:t>
+            </w:r>
           </w:p>
         </w:tc>
       </w:tr>
@@ -5738,12 +6204,15 @@
             <w:pPr>
               <w:spacing w:after="40"/>
               <w:rPr>
-                <w:lang w:val="pt-BR"/>
-              </w:rPr>
-            </w:pPr>
-            <w:r>
-              <w:rPr>
-                <w:sz w:val="18"/>
+                <w:sz w:val="20"/>
+                <w:szCs w:val="20"/>
+                <w:lang w:val="pt-BR"/>
+              </w:rPr>
+            </w:pPr>
+            <w:r>
+              <w:rPr>
+                <w:sz w:val="20"/>
+                <w:szCs w:val="20"/>
                 <w:lang w:val="pt-BR"/>
               </w:rPr>
               <w:t>Filtrar transações do dia atual</w:t>
@@ -5759,9 +6228,19 @@
             <w:pPr>
               <w:spacing w:after="40"/>
               <w:rPr>
-                <w:lang w:val="pt-BR"/>
-              </w:rPr>
-            </w:pPr>
+                <w:sz w:val="20"/>
+                <w:szCs w:val="20"/>
+                <w:lang w:val="pt-BR"/>
+              </w:rPr>
+            </w:pPr>
+            <w:r>
+              <w:rPr>
+                <w:sz w:val="20"/>
+                <w:szCs w:val="20"/>
+                <w:lang w:val="pt-BR"/>
+              </w:rPr>
+              <w:t>Visualizar transações do dia atual</w:t>
+            </w:r>
           </w:p>
         </w:tc>
         <w:tc>
@@ -5773,9 +6252,19 @@
             <w:pPr>
               <w:spacing w:after="40"/>
               <w:rPr>
-                <w:lang w:val="pt-BR"/>
-              </w:rPr>
-            </w:pPr>
+                <w:sz w:val="20"/>
+                <w:szCs w:val="20"/>
+                <w:lang w:val="pt-BR"/>
+              </w:rPr>
+            </w:pPr>
+            <w:r>
+              <w:rPr>
+                <w:sz w:val="20"/>
+                <w:szCs w:val="20"/>
+                <w:lang w:val="pt-BR"/>
+              </w:rPr>
+              <w:t>Aprovado</w:t>
+            </w:r>
           </w:p>
         </w:tc>
         <w:tc>
@@ -5787,9 +6276,19 @@
             <w:pPr>
               <w:spacing w:after="40"/>
               <w:rPr>
-                <w:lang w:val="pt-BR"/>
-              </w:rPr>
-            </w:pPr>
+                <w:sz w:val="20"/>
+                <w:szCs w:val="20"/>
+                <w:lang w:val="pt-BR"/>
+              </w:rPr>
+            </w:pPr>
+            <w:r>
+              <w:rPr>
+                <w:sz w:val="20"/>
+                <w:szCs w:val="20"/>
+                <w:lang w:val="pt-BR"/>
+              </w:rPr>
+              <w:t>Em conformidade</w:t>
+            </w:r>
           </w:p>
         </w:tc>
       </w:tr>
@@ -5823,12 +6322,15 @@
             <w:pPr>
               <w:spacing w:after="40"/>
               <w:rPr>
-                <w:lang w:val="pt-BR"/>
-              </w:rPr>
-            </w:pPr>
-            <w:r>
-              <w:rPr>
-                <w:sz w:val="18"/>
+                <w:sz w:val="20"/>
+                <w:szCs w:val="20"/>
+                <w:lang w:val="pt-BR"/>
+              </w:rPr>
+            </w:pPr>
+            <w:r>
+              <w:rPr>
+                <w:sz w:val="20"/>
+                <w:szCs w:val="20"/>
                 <w:lang w:val="pt-BR"/>
               </w:rPr>
               <w:t>Filtrar transações do dia anterior</w:t>
@@ -5844,9 +6346,19 @@
             <w:pPr>
               <w:spacing w:after="40"/>
               <w:rPr>
-                <w:lang w:val="pt-BR"/>
-              </w:rPr>
-            </w:pPr>
+                <w:sz w:val="20"/>
+                <w:szCs w:val="20"/>
+                <w:lang w:val="pt-BR"/>
+              </w:rPr>
+            </w:pPr>
+            <w:r>
+              <w:rPr>
+                <w:sz w:val="20"/>
+                <w:szCs w:val="20"/>
+                <w:lang w:val="pt-BR"/>
+              </w:rPr>
+              <w:t>Visualizar transações do dia anterior</w:t>
+            </w:r>
           </w:p>
         </w:tc>
         <w:tc>
@@ -5858,9 +6370,19 @@
             <w:pPr>
               <w:spacing w:after="40"/>
               <w:rPr>
-                <w:lang w:val="pt-BR"/>
-              </w:rPr>
-            </w:pPr>
+                <w:sz w:val="20"/>
+                <w:szCs w:val="20"/>
+                <w:lang w:val="pt-BR"/>
+              </w:rPr>
+            </w:pPr>
+            <w:r>
+              <w:rPr>
+                <w:sz w:val="20"/>
+                <w:szCs w:val="20"/>
+                <w:lang w:val="pt-BR"/>
+              </w:rPr>
+              <w:t>Aprovado</w:t>
+            </w:r>
           </w:p>
         </w:tc>
         <w:tc>
@@ -5872,9 +6394,19 @@
             <w:pPr>
               <w:spacing w:after="40"/>
               <w:rPr>
-                <w:lang w:val="pt-BR"/>
-              </w:rPr>
-            </w:pPr>
+                <w:sz w:val="20"/>
+                <w:szCs w:val="20"/>
+                <w:lang w:val="pt-BR"/>
+              </w:rPr>
+            </w:pPr>
+            <w:r>
+              <w:rPr>
+                <w:sz w:val="20"/>
+                <w:szCs w:val="20"/>
+                <w:lang w:val="pt-BR"/>
+              </w:rPr>
+              <w:t>Em conformidade</w:t>
+            </w:r>
           </w:p>
         </w:tc>
       </w:tr>
@@ -5908,12 +6440,15 @@
             <w:pPr>
               <w:spacing w:after="40"/>
               <w:rPr>
-                <w:lang w:val="pt-BR"/>
-              </w:rPr>
-            </w:pPr>
-            <w:r>
-              <w:rPr>
-                <w:sz w:val="18"/>
+                <w:sz w:val="20"/>
+                <w:szCs w:val="20"/>
+                <w:lang w:val="pt-BR"/>
+              </w:rPr>
+            </w:pPr>
+            <w:r>
+              <w:rPr>
+                <w:sz w:val="20"/>
+                <w:szCs w:val="20"/>
                 <w:lang w:val="pt-BR"/>
               </w:rPr>
               <w:t>Filtrar transações dos últimos 14 dias</w:t>
@@ -5929,9 +6464,19 @@
             <w:pPr>
               <w:spacing w:after="40"/>
               <w:rPr>
-                <w:lang w:val="pt-BR"/>
-              </w:rPr>
-            </w:pPr>
+                <w:sz w:val="20"/>
+                <w:szCs w:val="20"/>
+                <w:lang w:val="pt-BR"/>
+              </w:rPr>
+            </w:pPr>
+            <w:r>
+              <w:rPr>
+                <w:sz w:val="20"/>
+                <w:szCs w:val="20"/>
+                <w:lang w:val="pt-BR"/>
+              </w:rPr>
+              <w:t>Visualizar transações dos últimos 14 dias</w:t>
+            </w:r>
           </w:p>
         </w:tc>
         <w:tc>
@@ -5943,9 +6488,19 @@
             <w:pPr>
               <w:spacing w:after="40"/>
               <w:rPr>
-                <w:lang w:val="pt-BR"/>
-              </w:rPr>
-            </w:pPr>
+                <w:sz w:val="20"/>
+                <w:szCs w:val="20"/>
+                <w:lang w:val="pt-BR"/>
+              </w:rPr>
+            </w:pPr>
+            <w:r>
+              <w:rPr>
+                <w:sz w:val="20"/>
+                <w:szCs w:val="20"/>
+                <w:lang w:val="pt-BR"/>
+              </w:rPr>
+              <w:t>Aprovado</w:t>
+            </w:r>
           </w:p>
         </w:tc>
         <w:tc>
@@ -5957,9 +6512,19 @@
             <w:pPr>
               <w:spacing w:after="40"/>
               <w:rPr>
-                <w:lang w:val="pt-BR"/>
-              </w:rPr>
-            </w:pPr>
+                <w:sz w:val="20"/>
+                <w:szCs w:val="20"/>
+                <w:lang w:val="pt-BR"/>
+              </w:rPr>
+            </w:pPr>
+            <w:r>
+              <w:rPr>
+                <w:sz w:val="20"/>
+                <w:szCs w:val="20"/>
+                <w:lang w:val="pt-BR"/>
+              </w:rPr>
+              <w:t>Em conformidade</w:t>
+            </w:r>
           </w:p>
         </w:tc>
       </w:tr>
@@ -5980,6 +6545,7 @@
               <w:rPr>
                 <w:sz w:val="18"/>
               </w:rPr>
+              <w:lastRenderedPageBreak/>
               <w:t>FE-17</w:t>
             </w:r>
           </w:p>
@@ -5993,12 +6559,15 @@
             <w:pPr>
               <w:spacing w:after="40"/>
               <w:rPr>
-                <w:lang w:val="pt-BR"/>
-              </w:rPr>
-            </w:pPr>
-            <w:r>
-              <w:rPr>
-                <w:sz w:val="18"/>
+                <w:sz w:val="20"/>
+                <w:szCs w:val="20"/>
+                <w:lang w:val="pt-BR"/>
+              </w:rPr>
+            </w:pPr>
+            <w:r>
+              <w:rPr>
+                <w:sz w:val="20"/>
+                <w:szCs w:val="20"/>
                 <w:lang w:val="pt-BR"/>
               </w:rPr>
               <w:t>Filtrar transações por forma de pagamento</w:t>
@@ -6014,9 +6583,19 @@
             <w:pPr>
               <w:spacing w:after="40"/>
               <w:rPr>
-                <w:lang w:val="pt-BR"/>
-              </w:rPr>
-            </w:pPr>
+                <w:sz w:val="20"/>
+                <w:szCs w:val="20"/>
+                <w:lang w:val="pt-BR"/>
+              </w:rPr>
+            </w:pPr>
+            <w:r>
+              <w:rPr>
+                <w:sz w:val="20"/>
+                <w:szCs w:val="20"/>
+                <w:lang w:val="pt-BR"/>
+              </w:rPr>
+              <w:t>Visualizar transações por forma de pagamento filtrada</w:t>
+            </w:r>
           </w:p>
         </w:tc>
         <w:tc>
@@ -6028,9 +6607,19 @@
             <w:pPr>
               <w:spacing w:after="40"/>
               <w:rPr>
-                <w:lang w:val="pt-BR"/>
-              </w:rPr>
-            </w:pPr>
+                <w:sz w:val="20"/>
+                <w:szCs w:val="20"/>
+                <w:lang w:val="pt-BR"/>
+              </w:rPr>
+            </w:pPr>
+            <w:r>
+              <w:rPr>
+                <w:sz w:val="20"/>
+                <w:szCs w:val="20"/>
+                <w:lang w:val="pt-BR"/>
+              </w:rPr>
+              <w:t>Aprovado</w:t>
+            </w:r>
           </w:p>
         </w:tc>
         <w:tc>
@@ -6042,9 +6631,19 @@
             <w:pPr>
               <w:spacing w:after="40"/>
               <w:rPr>
-                <w:lang w:val="pt-BR"/>
-              </w:rPr>
-            </w:pPr>
+                <w:sz w:val="20"/>
+                <w:szCs w:val="20"/>
+                <w:lang w:val="pt-BR"/>
+              </w:rPr>
+            </w:pPr>
+            <w:r>
+              <w:rPr>
+                <w:sz w:val="20"/>
+                <w:szCs w:val="20"/>
+                <w:lang w:val="pt-BR"/>
+              </w:rPr>
+              <w:t>Em conformidade</w:t>
+            </w:r>
           </w:p>
         </w:tc>
       </w:tr>
@@ -6065,7 +6664,13 @@
               <w:rPr>
                 <w:sz w:val="18"/>
               </w:rPr>
-              <w:t>FE-18</w:t>
+              <w:t>FE-1</w:t>
+            </w:r>
+            <w:r>
+              <w:rPr>
+                <w:sz w:val="18"/>
+              </w:rPr>
+              <w:t>8</w:t>
             </w:r>
           </w:p>
         </w:tc>
@@ -6078,15 +6683,18 @@
             <w:pPr>
               <w:spacing w:after="40"/>
               <w:rPr>
-                <w:lang w:val="pt-BR"/>
-              </w:rPr>
-            </w:pPr>
-            <w:r>
-              <w:rPr>
-                <w:sz w:val="18"/>
-                <w:lang w:val="pt-BR"/>
-              </w:rPr>
-              <w:t>Consultar uma transação por ID</w:t>
+                <w:sz w:val="20"/>
+                <w:szCs w:val="20"/>
+                <w:lang w:val="pt-BR"/>
+              </w:rPr>
+            </w:pPr>
+            <w:r>
+              <w:rPr>
+                <w:sz w:val="20"/>
+                <w:szCs w:val="20"/>
+                <w:lang w:val="pt-BR"/>
+              </w:rPr>
+              <w:t>Verificar estado da tela sem transações para o filtro selecionado</w:t>
             </w:r>
           </w:p>
         </w:tc>
@@ -6099,9 +6707,19 @@
             <w:pPr>
               <w:spacing w:after="40"/>
               <w:rPr>
-                <w:lang w:val="pt-BR"/>
-              </w:rPr>
-            </w:pPr>
+                <w:sz w:val="20"/>
+                <w:szCs w:val="20"/>
+                <w:lang w:val="pt-BR"/>
+              </w:rPr>
+            </w:pPr>
+            <w:r>
+              <w:rPr>
+                <w:sz w:val="20"/>
+                <w:szCs w:val="20"/>
+                <w:lang w:val="pt-BR"/>
+              </w:rPr>
+              <w:t>Tela normal sem transações</w:t>
+            </w:r>
           </w:p>
         </w:tc>
         <w:tc>
@@ -6113,9 +6731,19 @@
             <w:pPr>
               <w:spacing w:after="40"/>
               <w:rPr>
-                <w:lang w:val="pt-BR"/>
-              </w:rPr>
-            </w:pPr>
+                <w:sz w:val="20"/>
+                <w:szCs w:val="20"/>
+                <w:lang w:val="pt-BR"/>
+              </w:rPr>
+            </w:pPr>
+            <w:r>
+              <w:rPr>
+                <w:sz w:val="20"/>
+                <w:szCs w:val="20"/>
+                <w:lang w:val="pt-BR"/>
+              </w:rPr>
+              <w:t>Aprovado</w:t>
+            </w:r>
           </w:p>
         </w:tc>
         <w:tc>
@@ -6127,9 +6755,19 @@
             <w:pPr>
               <w:spacing w:after="40"/>
               <w:rPr>
-                <w:lang w:val="pt-BR"/>
-              </w:rPr>
-            </w:pPr>
+                <w:sz w:val="20"/>
+                <w:szCs w:val="20"/>
+                <w:lang w:val="pt-BR"/>
+              </w:rPr>
+            </w:pPr>
+            <w:r>
+              <w:rPr>
+                <w:sz w:val="20"/>
+                <w:szCs w:val="20"/>
+                <w:lang w:val="pt-BR"/>
+              </w:rPr>
+              <w:t>Em conformidade</w:t>
+            </w:r>
           </w:p>
         </w:tc>
       </w:tr>
@@ -6150,7 +6788,13 @@
               <w:rPr>
                 <w:sz w:val="18"/>
               </w:rPr>
-              <w:t>FE-19</w:t>
+              <w:t>FE-</w:t>
+            </w:r>
+            <w:r>
+              <w:rPr>
+                <w:sz w:val="18"/>
+              </w:rPr>
+              <w:t>19</w:t>
             </w:r>
           </w:p>
         </w:tc>
@@ -6163,15 +6807,18 @@
             <w:pPr>
               <w:spacing w:after="40"/>
               <w:rPr>
-                <w:lang w:val="pt-BR"/>
-              </w:rPr>
-            </w:pPr>
-            <w:r>
-              <w:rPr>
-                <w:sz w:val="18"/>
-                <w:lang w:val="pt-BR"/>
-              </w:rPr>
-              <w:t>Verificar estado da tela sem transações para o filtro selecionado</w:t>
+                <w:sz w:val="20"/>
+                <w:szCs w:val="20"/>
+                <w:lang w:val="pt-BR"/>
+              </w:rPr>
+            </w:pPr>
+            <w:r>
+              <w:rPr>
+                <w:sz w:val="20"/>
+                <w:szCs w:val="20"/>
+                <w:lang w:val="pt-BR"/>
+              </w:rPr>
+              <w:t>Verificar carregamento e exibição dos dados após atualização da consulta</w:t>
             </w:r>
           </w:p>
         </w:tc>
@@ -6184,9 +6831,19 @@
             <w:pPr>
               <w:spacing w:after="40"/>
               <w:rPr>
-                <w:lang w:val="pt-BR"/>
-              </w:rPr>
-            </w:pPr>
+                <w:sz w:val="20"/>
+                <w:szCs w:val="20"/>
+                <w:lang w:val="pt-BR"/>
+              </w:rPr>
+            </w:pPr>
+            <w:r>
+              <w:rPr>
+                <w:sz w:val="20"/>
+                <w:szCs w:val="20"/>
+                <w:lang w:val="pt-BR"/>
+              </w:rPr>
+              <w:t>Os dados são atualizados em tempo real</w:t>
+            </w:r>
           </w:p>
         </w:tc>
         <w:tc>
@@ -6198,9 +6855,19 @@
             <w:pPr>
               <w:spacing w:after="40"/>
               <w:rPr>
-                <w:lang w:val="pt-BR"/>
-              </w:rPr>
-            </w:pPr>
+                <w:sz w:val="20"/>
+                <w:szCs w:val="20"/>
+                <w:lang w:val="pt-BR"/>
+              </w:rPr>
+            </w:pPr>
+            <w:r>
+              <w:rPr>
+                <w:sz w:val="20"/>
+                <w:szCs w:val="20"/>
+                <w:lang w:val="pt-BR"/>
+              </w:rPr>
+              <w:t>Aprovado</w:t>
+            </w:r>
           </w:p>
         </w:tc>
         <w:tc>
@@ -6212,9 +6879,19 @@
             <w:pPr>
               <w:spacing w:after="40"/>
               <w:rPr>
-                <w:lang w:val="pt-BR"/>
-              </w:rPr>
-            </w:pPr>
+                <w:sz w:val="20"/>
+                <w:szCs w:val="20"/>
+                <w:lang w:val="pt-BR"/>
+              </w:rPr>
+            </w:pPr>
+            <w:r>
+              <w:rPr>
+                <w:sz w:val="20"/>
+                <w:szCs w:val="20"/>
+                <w:lang w:val="pt-BR"/>
+              </w:rPr>
+              <w:t>Em conformidade</w:t>
+            </w:r>
           </w:p>
         </w:tc>
       </w:tr>
@@ -6235,7 +6912,13 @@
               <w:rPr>
                 <w:sz w:val="18"/>
               </w:rPr>
-              <w:t>FE-20</w:t>
+              <w:t>FE-2</w:t>
+            </w:r>
+            <w:r>
+              <w:rPr>
+                <w:sz w:val="18"/>
+              </w:rPr>
+              <w:t>0</w:t>
             </w:r>
           </w:p>
         </w:tc>
@@ -6248,15 +6931,18 @@
             <w:pPr>
               <w:spacing w:after="40"/>
               <w:rPr>
-                <w:lang w:val="pt-BR"/>
-              </w:rPr>
-            </w:pPr>
-            <w:r>
-              <w:rPr>
-                <w:sz w:val="18"/>
-                <w:lang w:val="pt-BR"/>
-              </w:rPr>
-              <w:t>Verificar carregamento e exibição dos dados após atualização da consulta</w:t>
+                <w:sz w:val="20"/>
+                <w:szCs w:val="20"/>
+                <w:lang w:val="pt-BR"/>
+              </w:rPr>
+            </w:pPr>
+            <w:r>
+              <w:rPr>
+                <w:sz w:val="20"/>
+                <w:szCs w:val="20"/>
+                <w:lang w:val="pt-BR"/>
+              </w:rPr>
+              <w:t>Verificar encerramento ou expiração da sessão</w:t>
             </w:r>
           </w:p>
         </w:tc>
@@ -6269,9 +6955,19 @@
             <w:pPr>
               <w:spacing w:after="40"/>
               <w:rPr>
-                <w:lang w:val="pt-BR"/>
-              </w:rPr>
-            </w:pPr>
+                <w:sz w:val="20"/>
+                <w:szCs w:val="20"/>
+                <w:lang w:val="pt-BR"/>
+              </w:rPr>
+            </w:pPr>
+            <w:r>
+              <w:rPr>
+                <w:sz w:val="20"/>
+                <w:szCs w:val="20"/>
+                <w:lang w:val="pt-BR"/>
+              </w:rPr>
+              <w:t>Logout automático após 2h</w:t>
+            </w:r>
           </w:p>
         </w:tc>
         <w:tc>
@@ -6283,9 +6979,19 @@
             <w:pPr>
               <w:spacing w:after="40"/>
               <w:rPr>
-                <w:lang w:val="pt-BR"/>
-              </w:rPr>
-            </w:pPr>
+                <w:sz w:val="20"/>
+                <w:szCs w:val="20"/>
+                <w:lang w:val="pt-BR"/>
+              </w:rPr>
+            </w:pPr>
+            <w:r>
+              <w:rPr>
+                <w:sz w:val="20"/>
+                <w:szCs w:val="20"/>
+                <w:lang w:val="pt-BR"/>
+              </w:rPr>
+              <w:t>Aprovado</w:t>
+            </w:r>
           </w:p>
         </w:tc>
         <w:tc>
@@ -6297,9 +7003,19 @@
             <w:pPr>
               <w:spacing w:after="40"/>
               <w:rPr>
-                <w:lang w:val="pt-BR"/>
-              </w:rPr>
-            </w:pPr>
+                <w:sz w:val="20"/>
+                <w:szCs w:val="20"/>
+                <w:lang w:val="pt-BR"/>
+              </w:rPr>
+            </w:pPr>
+            <w:r>
+              <w:rPr>
+                <w:sz w:val="20"/>
+                <w:szCs w:val="20"/>
+                <w:lang w:val="pt-BR"/>
+              </w:rPr>
+              <w:t>Em conformidade</w:t>
+            </w:r>
           </w:p>
         </w:tc>
       </w:tr>
@@ -6320,7 +7036,13 @@
               <w:rPr>
                 <w:sz w:val="18"/>
               </w:rPr>
-              <w:t>FE-21</w:t>
+              <w:t>FE-2</w:t>
+            </w:r>
+            <w:r>
+              <w:rPr>
+                <w:sz w:val="18"/>
+              </w:rPr>
+              <w:t>1</w:t>
             </w:r>
           </w:p>
         </w:tc>
@@ -6333,15 +7055,18 @@
             <w:pPr>
               <w:spacing w:after="40"/>
               <w:rPr>
-                <w:lang w:val="pt-BR"/>
-              </w:rPr>
-            </w:pPr>
-            <w:r>
-              <w:rPr>
-                <w:sz w:val="18"/>
-                <w:lang w:val="pt-BR"/>
-              </w:rPr>
-              <w:t>Verificar encerramento ou expiração da sessão</w:t>
+                <w:sz w:val="20"/>
+                <w:szCs w:val="20"/>
+                <w:lang w:val="pt-BR"/>
+              </w:rPr>
+            </w:pPr>
+            <w:r>
+              <w:rPr>
+                <w:sz w:val="20"/>
+                <w:szCs w:val="20"/>
+                <w:lang w:val="pt-BR"/>
+              </w:rPr>
+              <w:t>Verificar mensagens de erro e validação exibidas ao usuário</w:t>
             </w:r>
           </w:p>
         </w:tc>
@@ -6354,9 +7079,43 @@
             <w:pPr>
               <w:spacing w:after="40"/>
               <w:rPr>
-                <w:lang w:val="pt-BR"/>
-              </w:rPr>
-            </w:pPr>
+                <w:sz w:val="20"/>
+                <w:szCs w:val="20"/>
+                <w:lang w:val="pt-BR"/>
+              </w:rPr>
+            </w:pPr>
+            <w:r>
+              <w:rPr>
+                <w:sz w:val="20"/>
+                <w:szCs w:val="20"/>
+                <w:lang w:val="pt-BR"/>
+              </w:rPr>
+              <w:t>Todos os pop-ups denotam o erro</w:t>
+            </w:r>
+            <w:r>
+              <w:rPr>
+                <w:sz w:val="20"/>
+                <w:szCs w:val="20"/>
+                <w:lang w:val="pt-BR"/>
+              </w:rPr>
+              <w:t xml:space="preserve"> em questão</w:t>
+            </w:r>
+            <w:r>
+              <w:rPr>
+                <w:sz w:val="20"/>
+                <w:szCs w:val="20"/>
+                <w:lang w:val="pt-BR"/>
+              </w:rPr>
+              <w:t xml:space="preserve"> de </w:t>
+            </w:r>
+            <w:r>
+              <w:rPr>
+                <w:sz w:val="20"/>
+                <w:szCs w:val="20"/>
+                <w:lang w:val="pt-BR"/>
+              </w:rPr>
+              <w:t>forma clara</w:t>
+            </w:r>
           </w:p>
         </w:tc>
         <w:tc>
@@ -6368,9 +7127,19 @@
             <w:pPr>
               <w:spacing w:after="40"/>
               <w:rPr>
-                <w:lang w:val="pt-BR"/>
-              </w:rPr>
-            </w:pPr>
+                <w:sz w:val="20"/>
+                <w:szCs w:val="20"/>
+                <w:lang w:val="pt-BR"/>
+              </w:rPr>
+            </w:pPr>
+            <w:r>
+              <w:rPr>
+                <w:sz w:val="20"/>
+                <w:szCs w:val="20"/>
+                <w:lang w:val="pt-BR"/>
+              </w:rPr>
+              <w:t>Aprovado</w:t>
+            </w:r>
           </w:p>
         </w:tc>
         <w:tc>
@@ -6382,94 +7151,19 @@
             <w:pPr>
               <w:spacing w:after="40"/>
               <w:rPr>
-                <w:lang w:val="pt-BR"/>
-              </w:rPr>
-            </w:pPr>
-          </w:p>
-        </w:tc>
-      </w:tr>
-      <w:tr>
-        <w:trPr>
-          <w:jc w:val="center"/>
-        </w:trPr>
-        <w:tc>
-          <w:tcPr>
-            <w:tcW w:w="1080" w:type="dxa"/>
-            <w:vAlign w:val="center"/>
-          </w:tcPr>
-          <w:p>
-            <w:pPr>
-              <w:spacing w:after="40"/>
-            </w:pPr>
-            <w:r>
-              <w:rPr>
-                <w:sz w:val="18"/>
-              </w:rPr>
-              <w:t>FE-22</w:t>
-            </w:r>
-          </w:p>
-        </w:tc>
-        <w:tc>
-          <w:tcPr>
-            <w:tcW w:w="3600" w:type="dxa"/>
-            <w:vAlign w:val="center"/>
-          </w:tcPr>
-          <w:p>
-            <w:pPr>
-              <w:spacing w:after="40"/>
-              <w:rPr>
-                <w:lang w:val="pt-BR"/>
-              </w:rPr>
-            </w:pPr>
-            <w:r>
-              <w:rPr>
-                <w:sz w:val="18"/>
-                <w:lang w:val="pt-BR"/>
-              </w:rPr>
-              <w:t>Verificar mensagens de erro e validação exibidas ao usuário</w:t>
-            </w:r>
-          </w:p>
-        </w:tc>
-        <w:tc>
-          <w:tcPr>
-            <w:tcW w:w="2232" w:type="dxa"/>
-            <w:vAlign w:val="center"/>
-          </w:tcPr>
-          <w:p>
-            <w:pPr>
-              <w:spacing w:after="40"/>
-              <w:rPr>
-                <w:lang w:val="pt-BR"/>
-              </w:rPr>
-            </w:pPr>
-          </w:p>
-        </w:tc>
-        <w:tc>
-          <w:tcPr>
-            <w:tcW w:w="1944" w:type="dxa"/>
-            <w:vAlign w:val="center"/>
-          </w:tcPr>
-          <w:p>
-            <w:pPr>
-              <w:spacing w:after="40"/>
-              <w:rPr>
-                <w:lang w:val="pt-BR"/>
-              </w:rPr>
-            </w:pPr>
-          </w:p>
-        </w:tc>
-        <w:tc>
-          <w:tcPr>
-            <w:tcW w:w="2088" w:type="dxa"/>
-            <w:vAlign w:val="center"/>
-          </w:tcPr>
-          <w:p>
-            <w:pPr>
-              <w:spacing w:after="40"/>
-              <w:rPr>
-                <w:lang w:val="pt-BR"/>
-              </w:rPr>
-            </w:pPr>
+                <w:sz w:val="20"/>
+                <w:szCs w:val="20"/>
+                <w:lang w:val="pt-BR"/>
+              </w:rPr>
+            </w:pPr>
+            <w:r>
+              <w:rPr>
+                <w:sz w:val="20"/>
+                <w:szCs w:val="20"/>
+                <w:lang w:val="pt-BR"/>
+              </w:rPr>
+              <w:t>Em conformidade</w:t>
+            </w:r>
           </w:p>
         </w:tc>
       </w:tr>
@@ -6480,7 +7174,6 @@
       </w:pPr>
       <w:proofErr w:type="spellStart"/>
       <w:r>
-        <w:lastRenderedPageBreak/>
         <w:t>Referências</w:t>
       </w:r>
       <w:proofErr w:type="spellEnd"/>
@@ -18508,15 +19201,18 @@
 </file>
 
 <file path=customXml/item1.xml><?xml version="1.0" encoding="utf-8"?>
-<?mso-contentType ?>
-<FormTemplates xmlns="http://schemas.microsoft.com/sharepoint/v3/contenttype/forms">
-  <Display>DocumentLibraryForm</Display>
-  <Edit>DocumentLibraryForm</Edit>
-  <New>DocumentLibraryForm</New>
-</FormTemplates>
+<p:properties xmlns:p="http://schemas.microsoft.com/office/2006/metadata/properties" xmlns:xsi="http://www.w3.org/2001/XMLSchema-instance" xmlns:pc="http://schemas.microsoft.com/office/infopath/2007/PartnerControls">
+  <documentManagement>
+    <_activity xmlns="852cab6c-cabc-4063-85d8-14b206cae825" xsi:nil="true"/>
+  </documentManagement>
+</p:properties>
 </file>
 
 <file path=customXml/item2.xml><?xml version="1.0" encoding="utf-8"?>
+<b:Sources xmlns:b="http://schemas.openxmlformats.org/officeDocument/2006/bibliography" xmlns="http://schemas.openxmlformats.org/officeDocument/2006/bibliography" SelectedStyle="/APA.XSL" StyleName="APA"/>
+</file>
+
+<file path=customXml/item3.xml><?xml version="1.0" encoding="utf-8"?>
 <ct:contentTypeSchema xmlns:ct="http://schemas.microsoft.com/office/2006/metadata/contentType" xmlns:ma="http://schemas.microsoft.com/office/2006/metadata/properties/metaAttributes" ct:_="" ma:_="" ma:contentTypeName="Documento" ma:contentTypeID="0x0101004BE4E9274C3A984197EB4955D9631087" ma:contentTypeVersion="10" ma:contentTypeDescription="Crie um novo documento." ma:contentTypeScope="" ma:versionID="4b3059495c914d927a1ced81f80f5239">
   <xsd:schema xmlns:xsd="http://www.w3.org/2001/XMLSchema" xmlns:xs="http://www.w3.org/2001/XMLSchema" xmlns:p="http://schemas.microsoft.com/office/2006/metadata/properties" xmlns:ns3="852cab6c-cabc-4063-85d8-14b206cae825" targetNamespace="http://schemas.microsoft.com/office/2006/metadata/properties" ma:root="true" ma:fieldsID="eaeac60e0ff8c9034da602f9bfa0b690" ns3:_="">
     <xsd:import namespace="852cab6c-cabc-4063-85d8-14b206cae825"/>
@@ -18698,27 +19394,34 @@
 </ct:contentTypeSchema>
 </file>
 
-<file path=customXml/item3.xml><?xml version="1.0" encoding="utf-8"?>
-<b:Sources xmlns:b="http://schemas.openxmlformats.org/officeDocument/2006/bibliography" xmlns="http://schemas.openxmlformats.org/officeDocument/2006/bibliography" SelectedStyle="/APA.XSL" StyleName="APA"/>
-</file>
-
 <file path=customXml/item4.xml><?xml version="1.0" encoding="utf-8"?>
-<p:properties xmlns:p="http://schemas.microsoft.com/office/2006/metadata/properties" xmlns:xsi="http://www.w3.org/2001/XMLSchema-instance" xmlns:pc="http://schemas.microsoft.com/office/infopath/2007/PartnerControls">
-  <documentManagement>
-    <_activity xmlns="852cab6c-cabc-4063-85d8-14b206cae825" xsi:nil="true"/>
-  </documentManagement>
-</p:properties>
+<?mso-contentType ?>
+<FormTemplates xmlns="http://schemas.microsoft.com/sharepoint/v3/contenttype/forms">
+  <Display>DocumentLibraryForm</Display>
+  <Edit>DocumentLibraryForm</Edit>
+  <New>DocumentLibraryForm</New>
+</FormTemplates>
 </file>
 
 <file path=customXml/itemProps1.xml><?xml version="1.0" encoding="utf-8"?>
-<ds:datastoreItem xmlns:ds="http://schemas.openxmlformats.org/officeDocument/2006/customXml" ds:itemID="{3B3A98C9-8988-414E-91CD-0436DF0D92FA}">
+<ds:datastoreItem xmlns:ds="http://schemas.openxmlformats.org/officeDocument/2006/customXml" ds:itemID="{000B89B6-CEFE-4C2F-A5BE-08FDC56CF48B}">
   <ds:schemaRefs>
-    <ds:schemaRef ds:uri="http://schemas.microsoft.com/sharepoint/v3/contenttype/forms"/>
+    <ds:schemaRef ds:uri="http://schemas.microsoft.com/office/2006/metadata/properties"/>
+    <ds:schemaRef ds:uri="http://schemas.microsoft.com/office/infopath/2007/PartnerControls"/>
+    <ds:schemaRef ds:uri="852cab6c-cabc-4063-85d8-14b206cae825"/>
   </ds:schemaRefs>
 </ds:datastoreItem>
 </file>
 
 <file path=customXml/itemProps2.xml><?xml version="1.0" encoding="utf-8"?>
+<ds:datastoreItem xmlns:ds="http://schemas.openxmlformats.org/officeDocument/2006/customXml" ds:itemID="{EF278816-EC6F-A645-907D-7F25AECB1D4A}">
+  <ds:schemaRefs>
+    <ds:schemaRef ds:uri="http://schemas.openxmlformats.org/officeDocument/2006/bibliography"/>
+  </ds:schemaRefs>
+</ds:datastoreItem>
+</file>
+
+<file path=customXml/itemProps3.xml><?xml version="1.0" encoding="utf-8"?>
 <ds:datastoreItem xmlns:ds="http://schemas.openxmlformats.org/officeDocument/2006/customXml" ds:itemID="{EFD9553D-6921-4101-BF9C-E9A529865D99}">
   <ds:schemaRefs>
     <ds:schemaRef ds:uri="http://schemas.microsoft.com/office/2006/metadata/contentType"/>
@@ -18736,20 +19439,10 @@
 </ds:datastoreItem>
 </file>
 
-<file path=customXml/itemProps3.xml><?xml version="1.0" encoding="utf-8"?>
-<ds:datastoreItem xmlns:ds="http://schemas.openxmlformats.org/officeDocument/2006/customXml" ds:itemID="{EF278816-EC6F-A645-907D-7F25AECB1D4A}">
+<file path=customXml/itemProps4.xml><?xml version="1.0" encoding="utf-8"?>
+<ds:datastoreItem xmlns:ds="http://schemas.openxmlformats.org/officeDocument/2006/customXml" ds:itemID="{3B3A98C9-8988-414E-91CD-0436DF0D92FA}">
   <ds:schemaRefs>
-    <ds:schemaRef ds:uri="http://schemas.openxmlformats.org/officeDocument/2006/bibliography"/>
-  </ds:schemaRefs>
-</ds:datastoreItem>
-</file>
-
-<file path=customXml/itemProps4.xml><?xml version="1.0" encoding="utf-8"?>
-<ds:datastoreItem xmlns:ds="http://schemas.openxmlformats.org/officeDocument/2006/customXml" ds:itemID="{000B89B6-CEFE-4C2F-A5BE-08FDC56CF48B}">
-  <ds:schemaRefs>
-    <ds:schemaRef ds:uri="http://schemas.microsoft.com/office/2006/metadata/properties"/>
-    <ds:schemaRef ds:uri="http://schemas.microsoft.com/office/infopath/2007/PartnerControls"/>
-    <ds:schemaRef ds:uri="852cab6c-cabc-4063-85d8-14b206cae825"/>
+    <ds:schemaRef ds:uri="http://schemas.microsoft.com/sharepoint/v3/contenttype/forms"/>
   </ds:schemaRefs>
 </ds:datastoreItem>
 </file>
</xml_diff>